<commit_message>
Show complete annual list of Philippine holidays in DOLE standards tab
</commit_message>
<xml_diff>
--- a/JTYeo_CPA_Accounting_Office_Leave_Proposal.docx
+++ b/JTYeo_CPA_Accounting_Office_Leave_Proposal.docx
@@ -67,109 +67,265 @@
     </w:p>
     <w:p>
       <w:pPr>
-        <w:pStyle w:val="ListParagraph"/>
-        <w:spacing w:before="20" w:after="50"/>
+        <w:pStyle w:val="NoSpacing"/>
+        <w:numPr>
+          <w:ilvl w:val="0"/>
+          <w:numId w:val="10"/>
+        </w:numPr>
+        <w:rPr>
+          <w:rFonts w:asciiTheme="majorHAnsi" w:hAnsiTheme="majorHAnsi" w:cstheme="majorHAnsi"/>
+          <w:sz w:val="21"/>
+          <w:szCs w:val="21"/>
+        </w:rPr>
       </w:pPr>
       <w:r>
+        <w:rPr>
+          <w:rFonts w:asciiTheme="majorHAnsi" w:hAnsiTheme="majorHAnsi" w:cstheme="majorHAnsi"/>
+          <w:sz w:val="21"/>
+          <w:szCs w:val="21"/>
+        </w:rPr>
         <w:t>Executive workforce dashboard with live headcount, on-duty percentage, and active leaves overview</w:t>
       </w:r>
     </w:p>
     <w:p>
       <w:pPr>
-        <w:pStyle w:val="ListParagraph"/>
-        <w:spacing w:before="20" w:after="50"/>
+        <w:pStyle w:val="NoSpacing"/>
+        <w:numPr>
+          <w:ilvl w:val="0"/>
+          <w:numId w:val="10"/>
+        </w:numPr>
+        <w:rPr>
+          <w:rFonts w:asciiTheme="majorHAnsi" w:hAnsiTheme="majorHAnsi" w:cstheme="majorHAnsi"/>
+          <w:sz w:val="21"/>
+          <w:szCs w:val="21"/>
+        </w:rPr>
       </w:pPr>
       <w:r>
+        <w:rPr>
+          <w:rFonts w:asciiTheme="majorHAnsi" w:hAnsiTheme="majorHAnsi" w:cstheme="majorHAnsi"/>
+          <w:sz w:val="21"/>
+          <w:szCs w:val="21"/>
+        </w:rPr>
         <w:t>Firm-wide leave ledger tracking all filed, approved, rejected, and active staff absences</w:t>
       </w:r>
     </w:p>
     <w:p>
       <w:pPr>
-        <w:pStyle w:val="ListParagraph"/>
-        <w:spacing w:before="20" w:after="50"/>
+        <w:pStyle w:val="NoSpacing"/>
+        <w:numPr>
+          <w:ilvl w:val="0"/>
+          <w:numId w:val="10"/>
+        </w:numPr>
+        <w:rPr>
+          <w:rFonts w:asciiTheme="majorHAnsi" w:hAnsiTheme="majorHAnsi" w:cstheme="majorHAnsi"/>
+          <w:sz w:val="21"/>
+          <w:szCs w:val="21"/>
+        </w:rPr>
       </w:pPr>
       <w:r>
+        <w:rPr>
+          <w:rFonts w:asciiTheme="majorHAnsi" w:hAnsiTheme="majorHAnsi" w:cstheme="majorHAnsi"/>
+          <w:sz w:val="21"/>
+          <w:szCs w:val="21"/>
+        </w:rPr>
         <w:t>Statutory DOLE compliance tracker (Article 95 Service Incentive Leave 5-day monetization reserve)</w:t>
       </w:r>
     </w:p>
     <w:p>
       <w:pPr>
-        <w:pStyle w:val="ListParagraph"/>
-        <w:spacing w:before="20" w:after="50"/>
+        <w:pStyle w:val="NoSpacing"/>
+        <w:numPr>
+          <w:ilvl w:val="0"/>
+          <w:numId w:val="10"/>
+        </w:numPr>
+        <w:rPr>
+          <w:rFonts w:asciiTheme="majorHAnsi" w:hAnsiTheme="majorHAnsi" w:cstheme="majorHAnsi"/>
+          <w:sz w:val="21"/>
+          <w:szCs w:val="21"/>
+        </w:rPr>
       </w:pPr>
       <w:r>
+        <w:rPr>
+          <w:rFonts w:asciiTheme="majorHAnsi" w:hAnsiTheme="majorHAnsi" w:cstheme="majorHAnsi"/>
+          <w:sz w:val="21"/>
+          <w:szCs w:val="21"/>
+        </w:rPr>
         <w:t>Review and decision engine for all pending leave applications across departments</w:t>
       </w:r>
     </w:p>
     <w:p>
       <w:pPr>
-        <w:pStyle w:val="ListParagraph"/>
-        <w:spacing w:before="20" w:after="50"/>
+        <w:pStyle w:val="NoSpacing"/>
+        <w:numPr>
+          <w:ilvl w:val="0"/>
+          <w:numId w:val="10"/>
+        </w:numPr>
+        <w:rPr>
+          <w:rFonts w:asciiTheme="majorHAnsi" w:hAnsiTheme="majorHAnsi" w:cstheme="majorHAnsi"/>
+          <w:sz w:val="21"/>
+          <w:szCs w:val="21"/>
+        </w:rPr>
       </w:pPr>
       <w:r>
+        <w:rPr>
+          <w:rFonts w:asciiTheme="majorHAnsi" w:hAnsiTheme="majorHAnsi" w:cstheme="majorHAnsi"/>
+          <w:sz w:val="21"/>
+          <w:szCs w:val="21"/>
+        </w:rPr>
         <w:t>Approver feedback dialog allowing personalized notes or explanations on decisions</w:t>
       </w:r>
     </w:p>
     <w:p>
       <w:pPr>
-        <w:pStyle w:val="ListParagraph"/>
-        <w:spacing w:before="20" w:after="50"/>
+        <w:pStyle w:val="NoSpacing"/>
+        <w:numPr>
+          <w:ilvl w:val="0"/>
+          <w:numId w:val="10"/>
+        </w:numPr>
+        <w:rPr>
+          <w:rFonts w:asciiTheme="majorHAnsi" w:hAnsiTheme="majorHAnsi" w:cstheme="majorHAnsi"/>
+          <w:sz w:val="21"/>
+          <w:szCs w:val="21"/>
+        </w:rPr>
       </w:pPr>
       <w:r>
+        <w:rPr>
+          <w:rFonts w:asciiTheme="majorHAnsi" w:hAnsiTheme="majorHAnsi" w:cstheme="majorHAnsi"/>
+          <w:sz w:val="21"/>
+          <w:szCs w:val="21"/>
+        </w:rPr>
         <w:t>Manual balance adjustment tool to increment (+) or decrement (-) credits with mandatory audit reasoning</w:t>
       </w:r>
     </w:p>
     <w:p>
       <w:pPr>
-        <w:pStyle w:val="ListParagraph"/>
-        <w:spacing w:before="20" w:after="50"/>
+        <w:pStyle w:val="NoSpacing"/>
+        <w:numPr>
+          <w:ilvl w:val="0"/>
+          <w:numId w:val="10"/>
+        </w:numPr>
+        <w:rPr>
+          <w:rFonts w:asciiTheme="majorHAnsi" w:hAnsiTheme="majorHAnsi" w:cstheme="majorHAnsi"/>
+          <w:sz w:val="21"/>
+          <w:szCs w:val="21"/>
+        </w:rPr>
       </w:pPr>
       <w:r>
+        <w:rPr>
+          <w:rFonts w:asciiTheme="majorHAnsi" w:hAnsiTheme="majorHAnsi" w:cstheme="majorHAnsi"/>
+          <w:sz w:val="21"/>
+          <w:szCs w:val="21"/>
+        </w:rPr>
         <w:t>Global Monthly Accrual engine (+1.25 Vacation Leave days per month for active staff)</w:t>
       </w:r>
     </w:p>
     <w:p>
       <w:pPr>
-        <w:pStyle w:val="ListParagraph"/>
-        <w:spacing w:before="20" w:after="50"/>
+        <w:pStyle w:val="NoSpacing"/>
+        <w:numPr>
+          <w:ilvl w:val="0"/>
+          <w:numId w:val="10"/>
+        </w:numPr>
+        <w:rPr>
+          <w:rFonts w:asciiTheme="majorHAnsi" w:hAnsiTheme="majorHAnsi" w:cstheme="majorHAnsi"/>
+          <w:sz w:val="21"/>
+          <w:szCs w:val="21"/>
+        </w:rPr>
       </w:pPr>
       <w:r>
+        <w:rPr>
+          <w:rFonts w:asciiTheme="majorHAnsi" w:hAnsiTheme="majorHAnsi" w:cstheme="majorHAnsi"/>
+          <w:sz w:val="21"/>
+          <w:szCs w:val="21"/>
+        </w:rPr>
         <w:t>Annual DOLE SIL Rollover &amp; Reset engine refreshing staff to 5.0 statutory days at fiscal year-end</w:t>
       </w:r>
     </w:p>
     <w:p>
       <w:pPr>
-        <w:pStyle w:val="ListParagraph"/>
-        <w:spacing w:before="20" w:after="50"/>
+        <w:pStyle w:val="NoSpacing"/>
+        <w:numPr>
+          <w:ilvl w:val="0"/>
+          <w:numId w:val="10"/>
+        </w:numPr>
+        <w:rPr>
+          <w:rFonts w:asciiTheme="majorHAnsi" w:hAnsiTheme="majorHAnsi" w:cstheme="majorHAnsi"/>
+          <w:sz w:val="21"/>
+          <w:szCs w:val="21"/>
+        </w:rPr>
       </w:pPr>
       <w:r>
+        <w:rPr>
+          <w:rFonts w:asciiTheme="majorHAnsi" w:hAnsiTheme="majorHAnsi" w:cstheme="majorHAnsi"/>
+          <w:sz w:val="21"/>
+          <w:szCs w:val="21"/>
+        </w:rPr>
         <w:t>One-click DOLE/BIR-ready Payroll CSV export with employee IDs, deduction codes, and paid/unpaid status</w:t>
       </w:r>
     </w:p>
     <w:p>
       <w:pPr>
-        <w:pStyle w:val="ListParagraph"/>
-        <w:spacing w:before="20" w:after="50"/>
+        <w:pStyle w:val="NoSpacing"/>
+        <w:numPr>
+          <w:ilvl w:val="0"/>
+          <w:numId w:val="10"/>
+        </w:numPr>
+        <w:rPr>
+          <w:rFonts w:asciiTheme="majorHAnsi" w:hAnsiTheme="majorHAnsi" w:cstheme="majorHAnsi"/>
+          <w:sz w:val="21"/>
+          <w:szCs w:val="21"/>
+        </w:rPr>
       </w:pPr>
       <w:r>
+        <w:rPr>
+          <w:rFonts w:asciiTheme="majorHAnsi" w:hAnsiTheme="majorHAnsi" w:cstheme="majorHAnsi"/>
+          <w:sz w:val="21"/>
+          <w:szCs w:val="21"/>
+        </w:rPr>
         <w:t>Interactive monthly team leave calendar with color-coded statutory categories and Philippine public holidays</w:t>
       </w:r>
     </w:p>
     <w:p>
       <w:pPr>
-        <w:pStyle w:val="ListParagraph"/>
-        <w:spacing w:before="20" w:after="50"/>
+        <w:pStyle w:val="NoSpacing"/>
+        <w:numPr>
+          <w:ilvl w:val="0"/>
+          <w:numId w:val="10"/>
+        </w:numPr>
+        <w:rPr>
+          <w:rFonts w:asciiTheme="majorHAnsi" w:hAnsiTheme="majorHAnsi" w:cstheme="majorHAnsi"/>
+          <w:sz w:val="21"/>
+          <w:szCs w:val="21"/>
+        </w:rPr>
       </w:pPr>
       <w:r>
+        <w:rPr>
+          <w:rFonts w:asciiTheme="majorHAnsi" w:hAnsiTheme="majorHAnsi" w:cstheme="majorHAnsi"/>
+          <w:sz w:val="21"/>
+          <w:szCs w:val="21"/>
+        </w:rPr>
         <w:t>Immutable system audit trail logging leave submissions, approvals/rejections, and balance adjustments with IP timestamps</w:t>
       </w:r>
     </w:p>
     <w:p>
       <w:pPr>
-        <w:pStyle w:val="ListParagraph"/>
-        <w:spacing w:before="20" w:after="50"/>
+        <w:pStyle w:val="NoSpacing"/>
+        <w:numPr>
+          <w:ilvl w:val="0"/>
+          <w:numId w:val="10"/>
+        </w:numPr>
+        <w:rPr>
+          <w:rFonts w:asciiTheme="majorHAnsi" w:hAnsiTheme="majorHAnsi" w:cstheme="majorHAnsi"/>
+          <w:sz w:val="21"/>
+          <w:szCs w:val="21"/>
+        </w:rPr>
       </w:pPr>
       <w:r>
+        <w:rPr>
+          <w:rFonts w:asciiTheme="majorHAnsi" w:hAnsiTheme="majorHAnsi" w:cstheme="majorHAnsi"/>
+          <w:sz w:val="21"/>
+          <w:szCs w:val="21"/>
+        </w:rPr>
         <w:t>Engagement team coverage matrix across Audit &amp; Assurance, Taxation &amp; Compliance, and Bookkeeping</w:t>
       </w:r>
     </w:p>
@@ -188,64 +344,173 @@
     </w:p>
     <w:p>
       <w:pPr>
-        <w:pStyle w:val="ListParagraph"/>
-        <w:spacing w:before="20" w:after="50"/>
+        <w:pStyle w:val="NoSpacing"/>
+        <w:numPr>
+          <w:ilvl w:val="0"/>
+          <w:numId w:val="11"/>
+        </w:numPr>
+        <w:rPr>
+          <w:rFonts w:asciiTheme="majorHAnsi" w:hAnsiTheme="majorHAnsi" w:cstheme="majorHAnsi"/>
+          <w:sz w:val="21"/>
+          <w:szCs w:val="21"/>
+        </w:rPr>
       </w:pPr>
       <w:r>
+        <w:rPr>
+          <w:rFonts w:asciiTheme="majorHAnsi" w:hAnsiTheme="majorHAnsi" w:cstheme="majorHAnsi"/>
+          <w:sz w:val="21"/>
+          <w:szCs w:val="21"/>
+        </w:rPr>
         <w:t>Dedicated lead reviewer approvals queue displaying pending staff requests front-and-center</w:t>
       </w:r>
     </w:p>
     <w:p>
       <w:pPr>
-        <w:pStyle w:val="ListParagraph"/>
-        <w:spacing w:before="20" w:after="50"/>
+        <w:pStyle w:val="NoSpacing"/>
+        <w:numPr>
+          <w:ilvl w:val="0"/>
+          <w:numId w:val="11"/>
+        </w:numPr>
+        <w:rPr>
+          <w:rFonts w:asciiTheme="majorHAnsi" w:hAnsiTheme="majorHAnsi" w:cstheme="majorHAnsi"/>
+          <w:sz w:val="21"/>
+          <w:szCs w:val="21"/>
+        </w:rPr>
       </w:pPr>
       <w:r>
+        <w:rPr>
+          <w:rFonts w:asciiTheme="majorHAnsi" w:hAnsiTheme="majorHAnsi" w:cstheme="majorHAnsi"/>
+          <w:sz w:val="21"/>
+          <w:szCs w:val="21"/>
+        </w:rPr>
         <w:t>Live conflict and overlap detection to prevent understaffing during critical client audit engagements</w:t>
       </w:r>
     </w:p>
     <w:p>
       <w:pPr>
-        <w:pStyle w:val="ListParagraph"/>
-        <w:spacing w:before="20" w:after="50"/>
+        <w:pStyle w:val="NoSpacing"/>
+        <w:numPr>
+          <w:ilvl w:val="0"/>
+          <w:numId w:val="11"/>
+        </w:numPr>
+        <w:rPr>
+          <w:rFonts w:asciiTheme="majorHAnsi" w:hAnsiTheme="majorHAnsi" w:cstheme="majorHAnsi"/>
+          <w:sz w:val="21"/>
+          <w:szCs w:val="21"/>
+        </w:rPr>
       </w:pPr>
       <w:r>
-        <w:t>One-click Approval / Rejection modal with reviewer note support (e.g., coverage handover instructions)</w:t>
+        <w:rPr>
+          <w:rFonts w:asciiTheme="majorHAnsi" w:hAnsiTheme="majorHAnsi" w:cstheme="majorHAnsi"/>
+          <w:sz w:val="21"/>
+          <w:szCs w:val="21"/>
+        </w:rPr>
+        <w:t xml:space="preserve">One-click Approval / Rejection modal with reviewer </w:t>
+      </w:r>
+      <w:proofErr w:type="gramStart"/>
+      <w:r>
+        <w:rPr>
+          <w:rFonts w:asciiTheme="majorHAnsi" w:hAnsiTheme="majorHAnsi" w:cstheme="majorHAnsi"/>
+          <w:sz w:val="21"/>
+          <w:szCs w:val="21"/>
+        </w:rPr>
+        <w:t>note</w:t>
+      </w:r>
+      <w:proofErr w:type="gramEnd"/>
+      <w:r>
+        <w:rPr>
+          <w:rFonts w:asciiTheme="majorHAnsi" w:hAnsiTheme="majorHAnsi" w:cstheme="majorHAnsi"/>
+          <w:sz w:val="21"/>
+          <w:szCs w:val="21"/>
+        </w:rPr>
+        <w:t xml:space="preserve"> support (e.g., coverage handover instructions)</w:t>
       </w:r>
     </w:p>
     <w:p>
       <w:pPr>
-        <w:pStyle w:val="ListParagraph"/>
-        <w:spacing w:before="20" w:after="50"/>
+        <w:pStyle w:val="NoSpacing"/>
+        <w:numPr>
+          <w:ilvl w:val="0"/>
+          <w:numId w:val="11"/>
+        </w:numPr>
+        <w:rPr>
+          <w:rFonts w:asciiTheme="majorHAnsi" w:hAnsiTheme="majorHAnsi" w:cstheme="majorHAnsi"/>
+          <w:sz w:val="21"/>
+          <w:szCs w:val="21"/>
+        </w:rPr>
       </w:pPr>
       <w:r>
+        <w:rPr>
+          <w:rFonts w:asciiTheme="majorHAnsi" w:hAnsiTheme="majorHAnsi" w:cstheme="majorHAnsi"/>
+          <w:sz w:val="21"/>
+          <w:szCs w:val="21"/>
+        </w:rPr>
         <w:t>Personal leave balance monitor (DOLE SIL, Vacation Leave, Sick Leave, Solo Parent)</w:t>
       </w:r>
     </w:p>
     <w:p>
       <w:pPr>
-        <w:pStyle w:val="ListParagraph"/>
-        <w:spacing w:before="20" w:after="50"/>
+        <w:pStyle w:val="NoSpacing"/>
+        <w:numPr>
+          <w:ilvl w:val="0"/>
+          <w:numId w:val="11"/>
+        </w:numPr>
+        <w:rPr>
+          <w:rFonts w:asciiTheme="majorHAnsi" w:hAnsiTheme="majorHAnsi" w:cstheme="majorHAnsi"/>
+          <w:sz w:val="21"/>
+          <w:szCs w:val="21"/>
+        </w:rPr>
       </w:pPr>
       <w:r>
+        <w:rPr>
+          <w:rFonts w:asciiTheme="majorHAnsi" w:hAnsiTheme="majorHAnsi" w:cstheme="majorHAnsi"/>
+          <w:sz w:val="21"/>
+          <w:szCs w:val="21"/>
+        </w:rPr>
         <w:t>Submission of personal leave requests with automated working day calculation</w:t>
       </w:r>
     </w:p>
     <w:p>
       <w:pPr>
-        <w:pStyle w:val="ListParagraph"/>
-        <w:spacing w:before="20" w:after="50"/>
+        <w:pStyle w:val="NoSpacing"/>
+        <w:numPr>
+          <w:ilvl w:val="0"/>
+          <w:numId w:val="11"/>
+        </w:numPr>
+        <w:rPr>
+          <w:rFonts w:asciiTheme="majorHAnsi" w:hAnsiTheme="majorHAnsi" w:cstheme="majorHAnsi"/>
+          <w:sz w:val="21"/>
+          <w:szCs w:val="21"/>
+        </w:rPr>
       </w:pPr>
       <w:r>
+        <w:rPr>
+          <w:rFonts w:asciiTheme="majorHAnsi" w:hAnsiTheme="majorHAnsi" w:cstheme="majorHAnsi"/>
+          <w:sz w:val="21"/>
+          <w:szCs w:val="21"/>
+        </w:rPr>
         <w:t>Department-level team roster and leave schedule view</w:t>
       </w:r>
     </w:p>
     <w:p>
       <w:pPr>
-        <w:pStyle w:val="ListParagraph"/>
-        <w:spacing w:before="20" w:after="50"/>
+        <w:pStyle w:val="NoSpacing"/>
+        <w:numPr>
+          <w:ilvl w:val="0"/>
+          <w:numId w:val="11"/>
+        </w:numPr>
+        <w:rPr>
+          <w:rFonts w:asciiTheme="majorHAnsi" w:hAnsiTheme="majorHAnsi" w:cstheme="majorHAnsi"/>
+          <w:sz w:val="21"/>
+          <w:szCs w:val="21"/>
+        </w:rPr>
       </w:pPr>
       <w:r>
+        <w:rPr>
+          <w:rFonts w:asciiTheme="majorHAnsi" w:hAnsiTheme="majorHAnsi" w:cstheme="majorHAnsi"/>
+          <w:sz w:val="21"/>
+          <w:szCs w:val="21"/>
+        </w:rPr>
         <w:t>Interactive full calendar visibility into firm-wide schedule and DOLE holidays</w:t>
       </w:r>
     </w:p>
@@ -264,65 +529,151 @@
     </w:p>
     <w:p>
       <w:pPr>
-        <w:pStyle w:val="ListParagraph"/>
-        <w:spacing w:before="20" w:after="50"/>
+        <w:pStyle w:val="NoSpacing"/>
+        <w:numPr>
+          <w:ilvl w:val="0"/>
+          <w:numId w:val="12"/>
+        </w:numPr>
+        <w:rPr>
+          <w:rFonts w:asciiTheme="majorHAnsi" w:hAnsiTheme="majorHAnsi" w:cstheme="majorHAnsi"/>
+          <w:sz w:val="21"/>
+          <w:szCs w:val="21"/>
+        </w:rPr>
       </w:pPr>
       <w:r>
+        <w:rPr>
+          <w:rFonts w:asciiTheme="majorHAnsi" w:hAnsiTheme="majorHAnsi" w:cstheme="majorHAnsi"/>
+          <w:sz w:val="21"/>
+          <w:szCs w:val="21"/>
+        </w:rPr>
         <w:t>Self-service dashboard displaying real-time personal allowances (SIL, Vacation, Sick, Solo Parent, Magna Carta)</w:t>
       </w:r>
     </w:p>
     <w:p>
       <w:pPr>
-        <w:pStyle w:val="ListParagraph"/>
-        <w:spacing w:before="20" w:after="50"/>
+        <w:pStyle w:val="NoSpacing"/>
+        <w:numPr>
+          <w:ilvl w:val="0"/>
+          <w:numId w:val="12"/>
+        </w:numPr>
+        <w:rPr>
+          <w:rFonts w:asciiTheme="majorHAnsi" w:hAnsiTheme="majorHAnsi" w:cstheme="majorHAnsi"/>
+          <w:sz w:val="21"/>
+          <w:szCs w:val="21"/>
+        </w:rPr>
       </w:pPr>
       <w:r>
+        <w:rPr>
+          <w:rFonts w:asciiTheme="majorHAnsi" w:hAnsiTheme="majorHAnsi" w:cstheme="majorHAnsi"/>
+          <w:sz w:val="21"/>
+          <w:szCs w:val="21"/>
+        </w:rPr>
         <w:t>Leave application form with smart working-day calculator excluding weekends and Philippine public holidays</w:t>
       </w:r>
     </w:p>
     <w:p>
       <w:pPr>
-        <w:pStyle w:val="ListParagraph"/>
-        <w:spacing w:before="20" w:after="50"/>
+        <w:pStyle w:val="NoSpacing"/>
+        <w:numPr>
+          <w:ilvl w:val="0"/>
+          <w:numId w:val="12"/>
+        </w:numPr>
+        <w:rPr>
+          <w:rFonts w:asciiTheme="majorHAnsi" w:hAnsiTheme="majorHAnsi" w:cstheme="majorHAnsi"/>
+          <w:sz w:val="21"/>
+          <w:szCs w:val="21"/>
+        </w:rPr>
       </w:pPr>
       <w:r>
+        <w:rPr>
+          <w:rFonts w:asciiTheme="majorHAnsi" w:hAnsiTheme="majorHAnsi" w:cstheme="majorHAnsi"/>
+          <w:sz w:val="21"/>
+          <w:szCs w:val="21"/>
+        </w:rPr>
         <w:t>Flexible duration modes: Full Day (1.0d), Half-Day Morning (0.5d), Half-Day Afternoon (0.5d)</w:t>
       </w:r>
     </w:p>
     <w:p>
       <w:pPr>
-        <w:pStyle w:val="ListParagraph"/>
-        <w:spacing w:before="20" w:after="50"/>
+        <w:pStyle w:val="NoSpacing"/>
+        <w:numPr>
+          <w:ilvl w:val="0"/>
+          <w:numId w:val="12"/>
+        </w:numPr>
+        <w:rPr>
+          <w:rFonts w:asciiTheme="majorHAnsi" w:hAnsiTheme="majorHAnsi" w:cstheme="majorHAnsi"/>
+          <w:sz w:val="21"/>
+          <w:szCs w:val="21"/>
+        </w:rPr>
       </w:pPr>
       <w:r>
-        <w:lastRenderedPageBreak/>
+        <w:rPr>
+          <w:rFonts w:asciiTheme="majorHAnsi" w:hAnsiTheme="majorHAnsi" w:cstheme="majorHAnsi"/>
+          <w:sz w:val="21"/>
+          <w:szCs w:val="21"/>
+        </w:rPr>
         <w:t>Medical certificate &amp; supporting slip file uploader (required for sick leaves &gt; 2 consecutive working days)</w:t>
       </w:r>
     </w:p>
     <w:p>
       <w:pPr>
-        <w:pStyle w:val="ListParagraph"/>
-        <w:spacing w:before="20" w:after="50"/>
+        <w:pStyle w:val="NoSpacing"/>
+        <w:numPr>
+          <w:ilvl w:val="0"/>
+          <w:numId w:val="12"/>
+        </w:numPr>
+        <w:rPr>
+          <w:rFonts w:asciiTheme="majorHAnsi" w:hAnsiTheme="majorHAnsi" w:cstheme="majorHAnsi"/>
+          <w:sz w:val="21"/>
+          <w:szCs w:val="21"/>
+        </w:rPr>
       </w:pPr>
       <w:r>
+        <w:rPr>
+          <w:rFonts w:asciiTheme="majorHAnsi" w:hAnsiTheme="majorHAnsi" w:cstheme="majorHAnsi"/>
+          <w:sz w:val="21"/>
+          <w:szCs w:val="21"/>
+        </w:rPr>
         <w:t>Personal leave application history with live status tracking (Pending, Approved, Rejected) and signoff notes</w:t>
       </w:r>
     </w:p>
     <w:p>
       <w:pPr>
-        <w:pStyle w:val="ListParagraph"/>
-        <w:spacing w:before="20" w:after="50"/>
+        <w:pStyle w:val="NoSpacing"/>
+        <w:numPr>
+          <w:ilvl w:val="0"/>
+          <w:numId w:val="12"/>
+        </w:numPr>
+        <w:rPr>
+          <w:rFonts w:asciiTheme="majorHAnsi" w:hAnsiTheme="majorHAnsi" w:cstheme="majorHAnsi"/>
+          <w:sz w:val="21"/>
+          <w:szCs w:val="21"/>
+        </w:rPr>
       </w:pPr>
       <w:r>
+        <w:rPr>
+          <w:rFonts w:asciiTheme="majorHAnsi" w:hAnsiTheme="majorHAnsi" w:cstheme="majorHAnsi"/>
+          <w:sz w:val="21"/>
+          <w:szCs w:val="21"/>
+        </w:rPr>
         <w:t>Firm leave &amp; holiday calendar access to check team availability before filing</w:t>
       </w:r>
     </w:p>
     <w:p>
       <w:pPr>
-        <w:pStyle w:val="ListParagraph"/>
-        <w:spacing w:before="20" w:after="50"/>
+        <w:pStyle w:val="NoSpacing"/>
+        <w:numPr>
+          <w:ilvl w:val="0"/>
+          <w:numId w:val="12"/>
+        </w:numPr>
       </w:pPr>
       <w:r>
+        <w:rPr>
+          <w:rFonts w:asciiTheme="majorHAnsi" w:hAnsiTheme="majorHAnsi" w:cstheme="majorHAnsi"/>
+          <w:sz w:val="21"/>
+          <w:szCs w:val="21"/>
+        </w:rPr>
+        <w:lastRenderedPageBreak/>
         <w:t>Comprehensive DOLE statutory leave rules and legal entitlement reference guide</w:t>
       </w:r>
     </w:p>
@@ -514,7 +865,7 @@
             <w:r>
               <w:rPr>
                 <w:b/>
-                <w:color w:val="0284C7"/>
+                <w:color w:val="auto"/>
                 <w:sz w:val="22"/>
               </w:rPr>
               <w:t>₱70,000</w:t>
@@ -819,29 +1170,67 @@
     </w:p>
     <w:p>
       <w:pPr>
-        <w:pStyle w:val="ListParagraph"/>
-        <w:spacing w:before="20" w:after="50"/>
+        <w:pStyle w:val="NoSpacing"/>
+        <w:numPr>
+          <w:ilvl w:val="0"/>
+          <w:numId w:val="13"/>
+        </w:numPr>
+        <w:rPr>
+          <w:rFonts w:asciiTheme="majorHAnsi" w:hAnsiTheme="majorHAnsi" w:cstheme="majorHAnsi"/>
+          <w:sz w:val="21"/>
+          <w:szCs w:val="21"/>
+        </w:rPr>
       </w:pPr>
       <w:r>
+        <w:rPr>
+          <w:rFonts w:asciiTheme="majorHAnsi" w:hAnsiTheme="majorHAnsi" w:cstheme="majorHAnsi"/>
+          <w:sz w:val="21"/>
+          <w:szCs w:val="21"/>
+        </w:rPr>
         <w:t>A 50% down payment is required to commence project development, with the remaining 50% due upon final system deployment and client acceptance.</w:t>
       </w:r>
     </w:p>
     <w:p>
       <w:pPr>
-        <w:pStyle w:val="ListParagraph"/>
-        <w:spacing w:before="20" w:after="50"/>
+        <w:pStyle w:val="NoSpacing"/>
+        <w:numPr>
+          <w:ilvl w:val="0"/>
+          <w:numId w:val="13"/>
+        </w:numPr>
+        <w:rPr>
+          <w:rFonts w:asciiTheme="majorHAnsi" w:hAnsiTheme="majorHAnsi" w:cstheme="majorHAnsi"/>
+          <w:sz w:val="21"/>
+          <w:szCs w:val="21"/>
+        </w:rPr>
       </w:pPr>
       <w:r>
-        <w:lastRenderedPageBreak/>
+        <w:rPr>
+          <w:rFonts w:asciiTheme="majorHAnsi" w:hAnsiTheme="majorHAnsi" w:cstheme="majorHAnsi"/>
+          <w:sz w:val="21"/>
+          <w:szCs w:val="21"/>
+        </w:rPr>
         <w:t>Tier upgrades or additional custom add-on modules requested after project kickoff will be quoted and invoiced separately upon agreement.</w:t>
       </w:r>
     </w:p>
     <w:p>
       <w:pPr>
-        <w:pStyle w:val="ListParagraph"/>
-        <w:spacing w:before="20" w:after="50"/>
+        <w:pStyle w:val="NoSpacing"/>
+        <w:numPr>
+          <w:ilvl w:val="0"/>
+          <w:numId w:val="13"/>
+        </w:numPr>
+        <w:rPr>
+          <w:rFonts w:asciiTheme="majorHAnsi" w:hAnsiTheme="majorHAnsi" w:cstheme="majorHAnsi"/>
+          <w:sz w:val="21"/>
+          <w:szCs w:val="21"/>
+        </w:rPr>
       </w:pPr>
       <w:r>
+        <w:rPr>
+          <w:rFonts w:asciiTheme="majorHAnsi" w:hAnsiTheme="majorHAnsi" w:cstheme="majorHAnsi"/>
+          <w:sz w:val="21"/>
+          <w:szCs w:val="21"/>
+        </w:rPr>
         <w:t>All prices are quoted in Philippine Pesos (₱) and are net of applicable withholding taxes unless otherwise stated.</w:t>
       </w:r>
     </w:p>
@@ -860,37 +1249,90 @@
     </w:p>
     <w:p>
       <w:pPr>
-        <w:pStyle w:val="ListParagraph"/>
-        <w:spacing w:before="20" w:after="50"/>
+        <w:pStyle w:val="NoSpacing"/>
+        <w:numPr>
+          <w:ilvl w:val="0"/>
+          <w:numId w:val="14"/>
+        </w:numPr>
+        <w:rPr>
+          <w:rFonts w:asciiTheme="majorHAnsi" w:hAnsiTheme="majorHAnsi" w:cstheme="majorHAnsi"/>
+          <w:sz w:val="21"/>
+          <w:szCs w:val="21"/>
+        </w:rPr>
       </w:pPr>
       <w:r>
+        <w:rPr>
+          <w:rFonts w:asciiTheme="majorHAnsi" w:hAnsiTheme="majorHAnsi" w:cstheme="majorHAnsi"/>
+          <w:sz w:val="21"/>
+          <w:szCs w:val="21"/>
+        </w:rPr>
         <w:t>Tier 1 (Core Portal): Estimated delivery within two to three (2–3) weeks from kickoff.</w:t>
       </w:r>
     </w:p>
     <w:p>
       <w:pPr>
-        <w:pStyle w:val="ListParagraph"/>
-        <w:spacing w:before="20" w:after="50"/>
+        <w:pStyle w:val="NoSpacing"/>
+        <w:numPr>
+          <w:ilvl w:val="0"/>
+          <w:numId w:val="14"/>
+        </w:numPr>
+        <w:rPr>
+          <w:rFonts w:asciiTheme="majorHAnsi" w:hAnsiTheme="majorHAnsi" w:cstheme="majorHAnsi"/>
+          <w:sz w:val="21"/>
+          <w:szCs w:val="21"/>
+        </w:rPr>
       </w:pPr>
       <w:r>
+        <w:rPr>
+          <w:rFonts w:asciiTheme="majorHAnsi" w:hAnsiTheme="majorHAnsi" w:cstheme="majorHAnsi"/>
+          <w:sz w:val="21"/>
+          <w:szCs w:val="21"/>
+        </w:rPr>
+        <w:lastRenderedPageBreak/>
         <w:t>Tier 2 (Pro Practice Suite): Estimated delivery within three to four (3–4) weeks from kickoff.</w:t>
       </w:r>
     </w:p>
     <w:p>
       <w:pPr>
-        <w:pStyle w:val="ListParagraph"/>
-        <w:spacing w:before="20" w:after="50"/>
+        <w:pStyle w:val="NoSpacing"/>
+        <w:numPr>
+          <w:ilvl w:val="0"/>
+          <w:numId w:val="14"/>
+        </w:numPr>
+        <w:rPr>
+          <w:rFonts w:asciiTheme="majorHAnsi" w:hAnsiTheme="majorHAnsi" w:cstheme="majorHAnsi"/>
+          <w:sz w:val="21"/>
+          <w:szCs w:val="21"/>
+        </w:rPr>
       </w:pPr>
       <w:r>
+        <w:rPr>
+          <w:rFonts w:asciiTheme="majorHAnsi" w:hAnsiTheme="majorHAnsi" w:cstheme="majorHAnsi"/>
+          <w:sz w:val="21"/>
+          <w:szCs w:val="21"/>
+        </w:rPr>
         <w:t>Tier 3 (Enterprise Suite): Estimated delivery within four to five (4–5) weeks from kickoff.</w:t>
       </w:r>
     </w:p>
     <w:p>
       <w:pPr>
-        <w:pStyle w:val="ListParagraph"/>
-        <w:spacing w:before="20" w:after="50"/>
+        <w:pStyle w:val="NoSpacing"/>
+        <w:numPr>
+          <w:ilvl w:val="0"/>
+          <w:numId w:val="14"/>
+        </w:numPr>
+        <w:rPr>
+          <w:rFonts w:asciiTheme="majorHAnsi" w:hAnsiTheme="majorHAnsi" w:cstheme="majorHAnsi"/>
+          <w:sz w:val="21"/>
+          <w:szCs w:val="21"/>
+        </w:rPr>
       </w:pPr>
       <w:r>
+        <w:rPr>
+          <w:rFonts w:asciiTheme="majorHAnsi" w:hAnsiTheme="majorHAnsi" w:cstheme="majorHAnsi"/>
+          <w:sz w:val="21"/>
+          <w:szCs w:val="21"/>
+        </w:rPr>
         <w:t>Timelines assume timely provision of firm roster details, engagement policies, and milestone signoffs.</w:t>
       </w:r>
     </w:p>
@@ -909,19 +1351,45 @@
     </w:p>
     <w:p>
       <w:pPr>
-        <w:pStyle w:val="ListParagraph"/>
-        <w:spacing w:before="20" w:after="50"/>
+        <w:pStyle w:val="NoSpacing"/>
+        <w:numPr>
+          <w:ilvl w:val="0"/>
+          <w:numId w:val="15"/>
+        </w:numPr>
+        <w:rPr>
+          <w:rFonts w:asciiTheme="majorHAnsi" w:hAnsiTheme="majorHAnsi" w:cstheme="majorHAnsi"/>
+          <w:sz w:val="21"/>
+          <w:szCs w:val="21"/>
+        </w:rPr>
       </w:pPr>
       <w:r>
+        <w:rPr>
+          <w:rFonts w:asciiTheme="majorHAnsi" w:hAnsiTheme="majorHAnsi" w:cstheme="majorHAnsi"/>
+          <w:sz w:val="21"/>
+          <w:szCs w:val="21"/>
+        </w:rPr>
         <w:t>Two (2) formal rounds of design and workflow revisions are included per development milestone.</w:t>
       </w:r>
     </w:p>
     <w:p>
       <w:pPr>
-        <w:pStyle w:val="ListParagraph"/>
-        <w:spacing w:before="20" w:after="50"/>
+        <w:pStyle w:val="NoSpacing"/>
+        <w:numPr>
+          <w:ilvl w:val="0"/>
+          <w:numId w:val="15"/>
+        </w:numPr>
+        <w:rPr>
+          <w:rFonts w:asciiTheme="majorHAnsi" w:hAnsiTheme="majorHAnsi" w:cstheme="majorHAnsi"/>
+          <w:sz w:val="21"/>
+          <w:szCs w:val="21"/>
+        </w:rPr>
       </w:pPr>
       <w:r>
+        <w:rPr>
+          <w:rFonts w:asciiTheme="majorHAnsi" w:hAnsiTheme="majorHAnsi" w:cstheme="majorHAnsi"/>
+          <w:sz w:val="21"/>
+          <w:szCs w:val="21"/>
+        </w:rPr>
         <w:t>Additional revisions or scope changes outside the approved functional specifications will be quoted separately.</w:t>
       </w:r>
     </w:p>
@@ -940,19 +1408,45 @@
     </w:p>
     <w:p>
       <w:pPr>
-        <w:pStyle w:val="ListParagraph"/>
-        <w:spacing w:before="20" w:after="50"/>
+        <w:pStyle w:val="NoSpacing"/>
+        <w:numPr>
+          <w:ilvl w:val="0"/>
+          <w:numId w:val="16"/>
+        </w:numPr>
+        <w:rPr>
+          <w:rFonts w:asciiTheme="majorHAnsi" w:hAnsiTheme="majorHAnsi" w:cstheme="majorHAnsi"/>
+          <w:sz w:val="21"/>
+          <w:szCs w:val="21"/>
+        </w:rPr>
       </w:pPr>
       <w:r>
+        <w:rPr>
+          <w:rFonts w:asciiTheme="majorHAnsi" w:hAnsiTheme="majorHAnsi" w:cstheme="majorHAnsi"/>
+          <w:sz w:val="21"/>
+          <w:szCs w:val="21"/>
+        </w:rPr>
         <w:t>Full ownership of the completed application, including custom source code and database schemas, is transferred to JTYeo CPA Accounting Office upon receipt of final payment.</w:t>
       </w:r>
     </w:p>
     <w:p>
       <w:pPr>
-        <w:pStyle w:val="ListParagraph"/>
-        <w:spacing w:before="20" w:after="50"/>
+        <w:pStyle w:val="NoSpacing"/>
+        <w:numPr>
+          <w:ilvl w:val="0"/>
+          <w:numId w:val="16"/>
+        </w:numPr>
+        <w:rPr>
+          <w:rFonts w:asciiTheme="majorHAnsi" w:hAnsiTheme="majorHAnsi" w:cstheme="majorHAnsi"/>
+          <w:sz w:val="21"/>
+          <w:szCs w:val="21"/>
+        </w:rPr>
       </w:pPr>
       <w:r>
+        <w:rPr>
+          <w:rFonts w:asciiTheme="majorHAnsi" w:hAnsiTheme="majorHAnsi" w:cstheme="majorHAnsi"/>
+          <w:sz w:val="21"/>
+          <w:szCs w:val="21"/>
+        </w:rPr>
         <w:t>All staff records, client engagement lists, partner communications, and firm financial data are treated under strict non-disclosure.</w:t>
       </w:r>
     </w:p>
@@ -971,28 +1465,67 @@
     </w:p>
     <w:p>
       <w:pPr>
-        <w:pStyle w:val="ListParagraph"/>
-        <w:spacing w:before="20" w:after="50"/>
+        <w:pStyle w:val="NoSpacing"/>
+        <w:numPr>
+          <w:ilvl w:val="0"/>
+          <w:numId w:val="17"/>
+        </w:numPr>
+        <w:rPr>
+          <w:rFonts w:asciiTheme="majorHAnsi" w:hAnsiTheme="majorHAnsi" w:cstheme="majorHAnsi"/>
+          <w:sz w:val="21"/>
+          <w:szCs w:val="21"/>
+        </w:rPr>
       </w:pPr>
       <w:r>
+        <w:rPr>
+          <w:rFonts w:asciiTheme="majorHAnsi" w:hAnsiTheme="majorHAnsi" w:cstheme="majorHAnsi"/>
+          <w:sz w:val="21"/>
+          <w:szCs w:val="21"/>
+        </w:rPr>
         <w:t>A complimentary 30-day post-launch warranty is included for Tier 1 and Tier 2 for bug fixes and stability assurance.</w:t>
       </w:r>
     </w:p>
     <w:p>
       <w:pPr>
-        <w:pStyle w:val="ListParagraph"/>
-        <w:spacing w:before="20" w:after="50"/>
+        <w:pStyle w:val="NoSpacing"/>
+        <w:numPr>
+          <w:ilvl w:val="0"/>
+          <w:numId w:val="17"/>
+        </w:numPr>
+        <w:rPr>
+          <w:rFonts w:asciiTheme="majorHAnsi" w:hAnsiTheme="majorHAnsi" w:cstheme="majorHAnsi"/>
+          <w:sz w:val="21"/>
+          <w:szCs w:val="21"/>
+        </w:rPr>
       </w:pPr>
       <w:r>
+        <w:rPr>
+          <w:rFonts w:asciiTheme="majorHAnsi" w:hAnsiTheme="majorHAnsi" w:cstheme="majorHAnsi"/>
+          <w:sz w:val="21"/>
+          <w:szCs w:val="21"/>
+        </w:rPr>
         <w:t>Tier 3 includes an extended three (3) months of Priority SLA Support covering feature fine-tuning, partner support, and staff onboarding.</w:t>
       </w:r>
     </w:p>
     <w:p>
       <w:pPr>
-        <w:pStyle w:val="ListParagraph"/>
-        <w:spacing w:before="20" w:after="50"/>
+        <w:pStyle w:val="NoSpacing"/>
+        <w:numPr>
+          <w:ilvl w:val="0"/>
+          <w:numId w:val="17"/>
+        </w:numPr>
+        <w:rPr>
+          <w:rFonts w:asciiTheme="majorHAnsi" w:hAnsiTheme="majorHAnsi" w:cstheme="majorHAnsi"/>
+          <w:sz w:val="21"/>
+          <w:szCs w:val="21"/>
+        </w:rPr>
       </w:pPr>
       <w:r>
+        <w:rPr>
+          <w:rFonts w:asciiTheme="majorHAnsi" w:hAnsiTheme="majorHAnsi" w:cstheme="majorHAnsi"/>
+          <w:sz w:val="21"/>
+          <w:szCs w:val="21"/>
+        </w:rPr>
         <w:t>Annual maintenance, server hosting management, and continuous feature updates beyond warranty are available under an optional retainer agreement.</w:t>
       </w:r>
     </w:p>
@@ -1011,10 +1544,23 @@
     </w:p>
     <w:p>
       <w:pPr>
-        <w:pStyle w:val="ListParagraph"/>
-        <w:spacing w:before="20" w:after="50"/>
+        <w:pStyle w:val="NoSpacing"/>
+        <w:numPr>
+          <w:ilvl w:val="0"/>
+          <w:numId w:val="18"/>
+        </w:numPr>
+        <w:rPr>
+          <w:rFonts w:asciiTheme="majorHAnsi" w:hAnsiTheme="majorHAnsi" w:cstheme="majorHAnsi"/>
+          <w:sz w:val="21"/>
+          <w:szCs w:val="21"/>
+        </w:rPr>
       </w:pPr>
       <w:r>
+        <w:rPr>
+          <w:rFonts w:asciiTheme="majorHAnsi" w:hAnsiTheme="majorHAnsi" w:cstheme="majorHAnsi"/>
+          <w:sz w:val="21"/>
+          <w:szCs w:val="21"/>
+        </w:rPr>
         <w:t>This proposal, including all presented tier pricing, is valid for thirty (30) days from the date of presentation.</w:t>
       </w:r>
     </w:p>
@@ -1198,6 +1744,1023 @@
       </w:pPr>
       <w:rPr>
         <w:rFonts w:ascii="Symbol" w:hAnsi="Symbol" w:hint="default"/>
+      </w:rPr>
+    </w:lvl>
+  </w:abstractNum>
+  <w:abstractNum w:abstractNumId="9" w15:restartNumberingAfterBreak="0">
+    <w:nsid w:val="0BC24BC5"/>
+    <w:multiLevelType w:val="hybridMultilevel"/>
+    <w:tmpl w:val="132E08A2"/>
+    <w:lvl w:ilvl="0" w:tplc="34090001">
+      <w:start w:val="1"/>
+      <w:numFmt w:val="bullet"/>
+      <w:lvlText w:val=""/>
+      <w:lvlJc w:val="left"/>
+      <w:pPr>
+        <w:ind w:left="720" w:hanging="360"/>
+      </w:pPr>
+      <w:rPr>
+        <w:rFonts w:ascii="Symbol" w:hAnsi="Symbol" w:hint="default"/>
+      </w:rPr>
+    </w:lvl>
+    <w:lvl w:ilvl="1" w:tplc="34090003" w:tentative="1">
+      <w:start w:val="1"/>
+      <w:numFmt w:val="bullet"/>
+      <w:lvlText w:val="o"/>
+      <w:lvlJc w:val="left"/>
+      <w:pPr>
+        <w:ind w:left="1440" w:hanging="360"/>
+      </w:pPr>
+      <w:rPr>
+        <w:rFonts w:ascii="Courier New" w:hAnsi="Courier New" w:cs="Courier New" w:hint="default"/>
+      </w:rPr>
+    </w:lvl>
+    <w:lvl w:ilvl="2" w:tplc="34090005" w:tentative="1">
+      <w:start w:val="1"/>
+      <w:numFmt w:val="bullet"/>
+      <w:lvlText w:val=""/>
+      <w:lvlJc w:val="left"/>
+      <w:pPr>
+        <w:ind w:left="2160" w:hanging="360"/>
+      </w:pPr>
+      <w:rPr>
+        <w:rFonts w:ascii="Wingdings" w:hAnsi="Wingdings" w:hint="default"/>
+      </w:rPr>
+    </w:lvl>
+    <w:lvl w:ilvl="3" w:tplc="34090001" w:tentative="1">
+      <w:start w:val="1"/>
+      <w:numFmt w:val="bullet"/>
+      <w:lvlText w:val=""/>
+      <w:lvlJc w:val="left"/>
+      <w:pPr>
+        <w:ind w:left="2880" w:hanging="360"/>
+      </w:pPr>
+      <w:rPr>
+        <w:rFonts w:ascii="Symbol" w:hAnsi="Symbol" w:hint="default"/>
+      </w:rPr>
+    </w:lvl>
+    <w:lvl w:ilvl="4" w:tplc="34090003" w:tentative="1">
+      <w:start w:val="1"/>
+      <w:numFmt w:val="bullet"/>
+      <w:lvlText w:val="o"/>
+      <w:lvlJc w:val="left"/>
+      <w:pPr>
+        <w:ind w:left="3600" w:hanging="360"/>
+      </w:pPr>
+      <w:rPr>
+        <w:rFonts w:ascii="Courier New" w:hAnsi="Courier New" w:cs="Courier New" w:hint="default"/>
+      </w:rPr>
+    </w:lvl>
+    <w:lvl w:ilvl="5" w:tplc="34090005" w:tentative="1">
+      <w:start w:val="1"/>
+      <w:numFmt w:val="bullet"/>
+      <w:lvlText w:val=""/>
+      <w:lvlJc w:val="left"/>
+      <w:pPr>
+        <w:ind w:left="4320" w:hanging="360"/>
+      </w:pPr>
+      <w:rPr>
+        <w:rFonts w:ascii="Wingdings" w:hAnsi="Wingdings" w:hint="default"/>
+      </w:rPr>
+    </w:lvl>
+    <w:lvl w:ilvl="6" w:tplc="34090001" w:tentative="1">
+      <w:start w:val="1"/>
+      <w:numFmt w:val="bullet"/>
+      <w:lvlText w:val=""/>
+      <w:lvlJc w:val="left"/>
+      <w:pPr>
+        <w:ind w:left="5040" w:hanging="360"/>
+      </w:pPr>
+      <w:rPr>
+        <w:rFonts w:ascii="Symbol" w:hAnsi="Symbol" w:hint="default"/>
+      </w:rPr>
+    </w:lvl>
+    <w:lvl w:ilvl="7" w:tplc="34090003" w:tentative="1">
+      <w:start w:val="1"/>
+      <w:numFmt w:val="bullet"/>
+      <w:lvlText w:val="o"/>
+      <w:lvlJc w:val="left"/>
+      <w:pPr>
+        <w:ind w:left="5760" w:hanging="360"/>
+      </w:pPr>
+      <w:rPr>
+        <w:rFonts w:ascii="Courier New" w:hAnsi="Courier New" w:cs="Courier New" w:hint="default"/>
+      </w:rPr>
+    </w:lvl>
+    <w:lvl w:ilvl="8" w:tplc="34090005" w:tentative="1">
+      <w:start w:val="1"/>
+      <w:numFmt w:val="bullet"/>
+      <w:lvlText w:val=""/>
+      <w:lvlJc w:val="left"/>
+      <w:pPr>
+        <w:ind w:left="6480" w:hanging="360"/>
+      </w:pPr>
+      <w:rPr>
+        <w:rFonts w:ascii="Wingdings" w:hAnsi="Wingdings" w:hint="default"/>
+      </w:rPr>
+    </w:lvl>
+  </w:abstractNum>
+  <w:abstractNum w:abstractNumId="10" w15:restartNumberingAfterBreak="0">
+    <w:nsid w:val="12F56AAA"/>
+    <w:multiLevelType w:val="hybridMultilevel"/>
+    <w:tmpl w:val="A11C5B96"/>
+    <w:lvl w:ilvl="0" w:tplc="34090001">
+      <w:start w:val="1"/>
+      <w:numFmt w:val="bullet"/>
+      <w:lvlText w:val=""/>
+      <w:lvlJc w:val="left"/>
+      <w:pPr>
+        <w:ind w:left="720" w:hanging="360"/>
+      </w:pPr>
+      <w:rPr>
+        <w:rFonts w:ascii="Symbol" w:hAnsi="Symbol" w:hint="default"/>
+      </w:rPr>
+    </w:lvl>
+    <w:lvl w:ilvl="1" w:tplc="34090003" w:tentative="1">
+      <w:start w:val="1"/>
+      <w:numFmt w:val="bullet"/>
+      <w:lvlText w:val="o"/>
+      <w:lvlJc w:val="left"/>
+      <w:pPr>
+        <w:ind w:left="1440" w:hanging="360"/>
+      </w:pPr>
+      <w:rPr>
+        <w:rFonts w:ascii="Courier New" w:hAnsi="Courier New" w:cs="Courier New" w:hint="default"/>
+      </w:rPr>
+    </w:lvl>
+    <w:lvl w:ilvl="2" w:tplc="34090005" w:tentative="1">
+      <w:start w:val="1"/>
+      <w:numFmt w:val="bullet"/>
+      <w:lvlText w:val=""/>
+      <w:lvlJc w:val="left"/>
+      <w:pPr>
+        <w:ind w:left="2160" w:hanging="360"/>
+      </w:pPr>
+      <w:rPr>
+        <w:rFonts w:ascii="Wingdings" w:hAnsi="Wingdings" w:hint="default"/>
+      </w:rPr>
+    </w:lvl>
+    <w:lvl w:ilvl="3" w:tplc="34090001" w:tentative="1">
+      <w:start w:val="1"/>
+      <w:numFmt w:val="bullet"/>
+      <w:lvlText w:val=""/>
+      <w:lvlJc w:val="left"/>
+      <w:pPr>
+        <w:ind w:left="2880" w:hanging="360"/>
+      </w:pPr>
+      <w:rPr>
+        <w:rFonts w:ascii="Symbol" w:hAnsi="Symbol" w:hint="default"/>
+      </w:rPr>
+    </w:lvl>
+    <w:lvl w:ilvl="4" w:tplc="34090003" w:tentative="1">
+      <w:start w:val="1"/>
+      <w:numFmt w:val="bullet"/>
+      <w:lvlText w:val="o"/>
+      <w:lvlJc w:val="left"/>
+      <w:pPr>
+        <w:ind w:left="3600" w:hanging="360"/>
+      </w:pPr>
+      <w:rPr>
+        <w:rFonts w:ascii="Courier New" w:hAnsi="Courier New" w:cs="Courier New" w:hint="default"/>
+      </w:rPr>
+    </w:lvl>
+    <w:lvl w:ilvl="5" w:tplc="34090005" w:tentative="1">
+      <w:start w:val="1"/>
+      <w:numFmt w:val="bullet"/>
+      <w:lvlText w:val=""/>
+      <w:lvlJc w:val="left"/>
+      <w:pPr>
+        <w:ind w:left="4320" w:hanging="360"/>
+      </w:pPr>
+      <w:rPr>
+        <w:rFonts w:ascii="Wingdings" w:hAnsi="Wingdings" w:hint="default"/>
+      </w:rPr>
+    </w:lvl>
+    <w:lvl w:ilvl="6" w:tplc="34090001" w:tentative="1">
+      <w:start w:val="1"/>
+      <w:numFmt w:val="bullet"/>
+      <w:lvlText w:val=""/>
+      <w:lvlJc w:val="left"/>
+      <w:pPr>
+        <w:ind w:left="5040" w:hanging="360"/>
+      </w:pPr>
+      <w:rPr>
+        <w:rFonts w:ascii="Symbol" w:hAnsi="Symbol" w:hint="default"/>
+      </w:rPr>
+    </w:lvl>
+    <w:lvl w:ilvl="7" w:tplc="34090003" w:tentative="1">
+      <w:start w:val="1"/>
+      <w:numFmt w:val="bullet"/>
+      <w:lvlText w:val="o"/>
+      <w:lvlJc w:val="left"/>
+      <w:pPr>
+        <w:ind w:left="5760" w:hanging="360"/>
+      </w:pPr>
+      <w:rPr>
+        <w:rFonts w:ascii="Courier New" w:hAnsi="Courier New" w:cs="Courier New" w:hint="default"/>
+      </w:rPr>
+    </w:lvl>
+    <w:lvl w:ilvl="8" w:tplc="34090005" w:tentative="1">
+      <w:start w:val="1"/>
+      <w:numFmt w:val="bullet"/>
+      <w:lvlText w:val=""/>
+      <w:lvlJc w:val="left"/>
+      <w:pPr>
+        <w:ind w:left="6480" w:hanging="360"/>
+      </w:pPr>
+      <w:rPr>
+        <w:rFonts w:ascii="Wingdings" w:hAnsi="Wingdings" w:hint="default"/>
+      </w:rPr>
+    </w:lvl>
+  </w:abstractNum>
+  <w:abstractNum w:abstractNumId="11" w15:restartNumberingAfterBreak="0">
+    <w:nsid w:val="2010506C"/>
+    <w:multiLevelType w:val="hybridMultilevel"/>
+    <w:tmpl w:val="FD042148"/>
+    <w:lvl w:ilvl="0" w:tplc="34090001">
+      <w:start w:val="1"/>
+      <w:numFmt w:val="bullet"/>
+      <w:lvlText w:val=""/>
+      <w:lvlJc w:val="left"/>
+      <w:pPr>
+        <w:ind w:left="720" w:hanging="360"/>
+      </w:pPr>
+      <w:rPr>
+        <w:rFonts w:ascii="Symbol" w:hAnsi="Symbol" w:hint="default"/>
+      </w:rPr>
+    </w:lvl>
+    <w:lvl w:ilvl="1" w:tplc="34090003" w:tentative="1">
+      <w:start w:val="1"/>
+      <w:numFmt w:val="bullet"/>
+      <w:lvlText w:val="o"/>
+      <w:lvlJc w:val="left"/>
+      <w:pPr>
+        <w:ind w:left="1440" w:hanging="360"/>
+      </w:pPr>
+      <w:rPr>
+        <w:rFonts w:ascii="Courier New" w:hAnsi="Courier New" w:cs="Courier New" w:hint="default"/>
+      </w:rPr>
+    </w:lvl>
+    <w:lvl w:ilvl="2" w:tplc="34090005" w:tentative="1">
+      <w:start w:val="1"/>
+      <w:numFmt w:val="bullet"/>
+      <w:lvlText w:val=""/>
+      <w:lvlJc w:val="left"/>
+      <w:pPr>
+        <w:ind w:left="2160" w:hanging="360"/>
+      </w:pPr>
+      <w:rPr>
+        <w:rFonts w:ascii="Wingdings" w:hAnsi="Wingdings" w:hint="default"/>
+      </w:rPr>
+    </w:lvl>
+    <w:lvl w:ilvl="3" w:tplc="34090001" w:tentative="1">
+      <w:start w:val="1"/>
+      <w:numFmt w:val="bullet"/>
+      <w:lvlText w:val=""/>
+      <w:lvlJc w:val="left"/>
+      <w:pPr>
+        <w:ind w:left="2880" w:hanging="360"/>
+      </w:pPr>
+      <w:rPr>
+        <w:rFonts w:ascii="Symbol" w:hAnsi="Symbol" w:hint="default"/>
+      </w:rPr>
+    </w:lvl>
+    <w:lvl w:ilvl="4" w:tplc="34090003" w:tentative="1">
+      <w:start w:val="1"/>
+      <w:numFmt w:val="bullet"/>
+      <w:lvlText w:val="o"/>
+      <w:lvlJc w:val="left"/>
+      <w:pPr>
+        <w:ind w:left="3600" w:hanging="360"/>
+      </w:pPr>
+      <w:rPr>
+        <w:rFonts w:ascii="Courier New" w:hAnsi="Courier New" w:cs="Courier New" w:hint="default"/>
+      </w:rPr>
+    </w:lvl>
+    <w:lvl w:ilvl="5" w:tplc="34090005" w:tentative="1">
+      <w:start w:val="1"/>
+      <w:numFmt w:val="bullet"/>
+      <w:lvlText w:val=""/>
+      <w:lvlJc w:val="left"/>
+      <w:pPr>
+        <w:ind w:left="4320" w:hanging="360"/>
+      </w:pPr>
+      <w:rPr>
+        <w:rFonts w:ascii="Wingdings" w:hAnsi="Wingdings" w:hint="default"/>
+      </w:rPr>
+    </w:lvl>
+    <w:lvl w:ilvl="6" w:tplc="34090001" w:tentative="1">
+      <w:start w:val="1"/>
+      <w:numFmt w:val="bullet"/>
+      <w:lvlText w:val=""/>
+      <w:lvlJc w:val="left"/>
+      <w:pPr>
+        <w:ind w:left="5040" w:hanging="360"/>
+      </w:pPr>
+      <w:rPr>
+        <w:rFonts w:ascii="Symbol" w:hAnsi="Symbol" w:hint="default"/>
+      </w:rPr>
+    </w:lvl>
+    <w:lvl w:ilvl="7" w:tplc="34090003" w:tentative="1">
+      <w:start w:val="1"/>
+      <w:numFmt w:val="bullet"/>
+      <w:lvlText w:val="o"/>
+      <w:lvlJc w:val="left"/>
+      <w:pPr>
+        <w:ind w:left="5760" w:hanging="360"/>
+      </w:pPr>
+      <w:rPr>
+        <w:rFonts w:ascii="Courier New" w:hAnsi="Courier New" w:cs="Courier New" w:hint="default"/>
+      </w:rPr>
+    </w:lvl>
+    <w:lvl w:ilvl="8" w:tplc="34090005" w:tentative="1">
+      <w:start w:val="1"/>
+      <w:numFmt w:val="bullet"/>
+      <w:lvlText w:val=""/>
+      <w:lvlJc w:val="left"/>
+      <w:pPr>
+        <w:ind w:left="6480" w:hanging="360"/>
+      </w:pPr>
+      <w:rPr>
+        <w:rFonts w:ascii="Wingdings" w:hAnsi="Wingdings" w:hint="default"/>
+      </w:rPr>
+    </w:lvl>
+  </w:abstractNum>
+  <w:abstractNum w:abstractNumId="12" w15:restartNumberingAfterBreak="0">
+    <w:nsid w:val="21A436CD"/>
+    <w:multiLevelType w:val="hybridMultilevel"/>
+    <w:tmpl w:val="1C369E90"/>
+    <w:lvl w:ilvl="0" w:tplc="34090001">
+      <w:start w:val="1"/>
+      <w:numFmt w:val="bullet"/>
+      <w:lvlText w:val=""/>
+      <w:lvlJc w:val="left"/>
+      <w:pPr>
+        <w:ind w:left="720" w:hanging="360"/>
+      </w:pPr>
+      <w:rPr>
+        <w:rFonts w:ascii="Symbol" w:hAnsi="Symbol" w:hint="default"/>
+      </w:rPr>
+    </w:lvl>
+    <w:lvl w:ilvl="1" w:tplc="34090003" w:tentative="1">
+      <w:start w:val="1"/>
+      <w:numFmt w:val="bullet"/>
+      <w:lvlText w:val="o"/>
+      <w:lvlJc w:val="left"/>
+      <w:pPr>
+        <w:ind w:left="1440" w:hanging="360"/>
+      </w:pPr>
+      <w:rPr>
+        <w:rFonts w:ascii="Courier New" w:hAnsi="Courier New" w:cs="Courier New" w:hint="default"/>
+      </w:rPr>
+    </w:lvl>
+    <w:lvl w:ilvl="2" w:tplc="34090005" w:tentative="1">
+      <w:start w:val="1"/>
+      <w:numFmt w:val="bullet"/>
+      <w:lvlText w:val=""/>
+      <w:lvlJc w:val="left"/>
+      <w:pPr>
+        <w:ind w:left="2160" w:hanging="360"/>
+      </w:pPr>
+      <w:rPr>
+        <w:rFonts w:ascii="Wingdings" w:hAnsi="Wingdings" w:hint="default"/>
+      </w:rPr>
+    </w:lvl>
+    <w:lvl w:ilvl="3" w:tplc="34090001" w:tentative="1">
+      <w:start w:val="1"/>
+      <w:numFmt w:val="bullet"/>
+      <w:lvlText w:val=""/>
+      <w:lvlJc w:val="left"/>
+      <w:pPr>
+        <w:ind w:left="2880" w:hanging="360"/>
+      </w:pPr>
+      <w:rPr>
+        <w:rFonts w:ascii="Symbol" w:hAnsi="Symbol" w:hint="default"/>
+      </w:rPr>
+    </w:lvl>
+    <w:lvl w:ilvl="4" w:tplc="34090003" w:tentative="1">
+      <w:start w:val="1"/>
+      <w:numFmt w:val="bullet"/>
+      <w:lvlText w:val="o"/>
+      <w:lvlJc w:val="left"/>
+      <w:pPr>
+        <w:ind w:left="3600" w:hanging="360"/>
+      </w:pPr>
+      <w:rPr>
+        <w:rFonts w:ascii="Courier New" w:hAnsi="Courier New" w:cs="Courier New" w:hint="default"/>
+      </w:rPr>
+    </w:lvl>
+    <w:lvl w:ilvl="5" w:tplc="34090005" w:tentative="1">
+      <w:start w:val="1"/>
+      <w:numFmt w:val="bullet"/>
+      <w:lvlText w:val=""/>
+      <w:lvlJc w:val="left"/>
+      <w:pPr>
+        <w:ind w:left="4320" w:hanging="360"/>
+      </w:pPr>
+      <w:rPr>
+        <w:rFonts w:ascii="Wingdings" w:hAnsi="Wingdings" w:hint="default"/>
+      </w:rPr>
+    </w:lvl>
+    <w:lvl w:ilvl="6" w:tplc="34090001" w:tentative="1">
+      <w:start w:val="1"/>
+      <w:numFmt w:val="bullet"/>
+      <w:lvlText w:val=""/>
+      <w:lvlJc w:val="left"/>
+      <w:pPr>
+        <w:ind w:left="5040" w:hanging="360"/>
+      </w:pPr>
+      <w:rPr>
+        <w:rFonts w:ascii="Symbol" w:hAnsi="Symbol" w:hint="default"/>
+      </w:rPr>
+    </w:lvl>
+    <w:lvl w:ilvl="7" w:tplc="34090003" w:tentative="1">
+      <w:start w:val="1"/>
+      <w:numFmt w:val="bullet"/>
+      <w:lvlText w:val="o"/>
+      <w:lvlJc w:val="left"/>
+      <w:pPr>
+        <w:ind w:left="5760" w:hanging="360"/>
+      </w:pPr>
+      <w:rPr>
+        <w:rFonts w:ascii="Courier New" w:hAnsi="Courier New" w:cs="Courier New" w:hint="default"/>
+      </w:rPr>
+    </w:lvl>
+    <w:lvl w:ilvl="8" w:tplc="34090005" w:tentative="1">
+      <w:start w:val="1"/>
+      <w:numFmt w:val="bullet"/>
+      <w:lvlText w:val=""/>
+      <w:lvlJc w:val="left"/>
+      <w:pPr>
+        <w:ind w:left="6480" w:hanging="360"/>
+      </w:pPr>
+      <w:rPr>
+        <w:rFonts w:ascii="Wingdings" w:hAnsi="Wingdings" w:hint="default"/>
+      </w:rPr>
+    </w:lvl>
+  </w:abstractNum>
+  <w:abstractNum w:abstractNumId="13" w15:restartNumberingAfterBreak="0">
+    <w:nsid w:val="29486B7E"/>
+    <w:multiLevelType w:val="hybridMultilevel"/>
+    <w:tmpl w:val="FCE6978C"/>
+    <w:lvl w:ilvl="0" w:tplc="34090001">
+      <w:start w:val="1"/>
+      <w:numFmt w:val="bullet"/>
+      <w:lvlText w:val=""/>
+      <w:lvlJc w:val="left"/>
+      <w:pPr>
+        <w:ind w:left="720" w:hanging="360"/>
+      </w:pPr>
+      <w:rPr>
+        <w:rFonts w:ascii="Symbol" w:hAnsi="Symbol" w:hint="default"/>
+      </w:rPr>
+    </w:lvl>
+    <w:lvl w:ilvl="1" w:tplc="34090003" w:tentative="1">
+      <w:start w:val="1"/>
+      <w:numFmt w:val="bullet"/>
+      <w:lvlText w:val="o"/>
+      <w:lvlJc w:val="left"/>
+      <w:pPr>
+        <w:ind w:left="1440" w:hanging="360"/>
+      </w:pPr>
+      <w:rPr>
+        <w:rFonts w:ascii="Courier New" w:hAnsi="Courier New" w:cs="Courier New" w:hint="default"/>
+      </w:rPr>
+    </w:lvl>
+    <w:lvl w:ilvl="2" w:tplc="34090005" w:tentative="1">
+      <w:start w:val="1"/>
+      <w:numFmt w:val="bullet"/>
+      <w:lvlText w:val=""/>
+      <w:lvlJc w:val="left"/>
+      <w:pPr>
+        <w:ind w:left="2160" w:hanging="360"/>
+      </w:pPr>
+      <w:rPr>
+        <w:rFonts w:ascii="Wingdings" w:hAnsi="Wingdings" w:hint="default"/>
+      </w:rPr>
+    </w:lvl>
+    <w:lvl w:ilvl="3" w:tplc="34090001" w:tentative="1">
+      <w:start w:val="1"/>
+      <w:numFmt w:val="bullet"/>
+      <w:lvlText w:val=""/>
+      <w:lvlJc w:val="left"/>
+      <w:pPr>
+        <w:ind w:left="2880" w:hanging="360"/>
+      </w:pPr>
+      <w:rPr>
+        <w:rFonts w:ascii="Symbol" w:hAnsi="Symbol" w:hint="default"/>
+      </w:rPr>
+    </w:lvl>
+    <w:lvl w:ilvl="4" w:tplc="34090003" w:tentative="1">
+      <w:start w:val="1"/>
+      <w:numFmt w:val="bullet"/>
+      <w:lvlText w:val="o"/>
+      <w:lvlJc w:val="left"/>
+      <w:pPr>
+        <w:ind w:left="3600" w:hanging="360"/>
+      </w:pPr>
+      <w:rPr>
+        <w:rFonts w:ascii="Courier New" w:hAnsi="Courier New" w:cs="Courier New" w:hint="default"/>
+      </w:rPr>
+    </w:lvl>
+    <w:lvl w:ilvl="5" w:tplc="34090005" w:tentative="1">
+      <w:start w:val="1"/>
+      <w:numFmt w:val="bullet"/>
+      <w:lvlText w:val=""/>
+      <w:lvlJc w:val="left"/>
+      <w:pPr>
+        <w:ind w:left="4320" w:hanging="360"/>
+      </w:pPr>
+      <w:rPr>
+        <w:rFonts w:ascii="Wingdings" w:hAnsi="Wingdings" w:hint="default"/>
+      </w:rPr>
+    </w:lvl>
+    <w:lvl w:ilvl="6" w:tplc="34090001" w:tentative="1">
+      <w:start w:val="1"/>
+      <w:numFmt w:val="bullet"/>
+      <w:lvlText w:val=""/>
+      <w:lvlJc w:val="left"/>
+      <w:pPr>
+        <w:ind w:left="5040" w:hanging="360"/>
+      </w:pPr>
+      <w:rPr>
+        <w:rFonts w:ascii="Symbol" w:hAnsi="Symbol" w:hint="default"/>
+      </w:rPr>
+    </w:lvl>
+    <w:lvl w:ilvl="7" w:tplc="34090003" w:tentative="1">
+      <w:start w:val="1"/>
+      <w:numFmt w:val="bullet"/>
+      <w:lvlText w:val="o"/>
+      <w:lvlJc w:val="left"/>
+      <w:pPr>
+        <w:ind w:left="5760" w:hanging="360"/>
+      </w:pPr>
+      <w:rPr>
+        <w:rFonts w:ascii="Courier New" w:hAnsi="Courier New" w:cs="Courier New" w:hint="default"/>
+      </w:rPr>
+    </w:lvl>
+    <w:lvl w:ilvl="8" w:tplc="34090005" w:tentative="1">
+      <w:start w:val="1"/>
+      <w:numFmt w:val="bullet"/>
+      <w:lvlText w:val=""/>
+      <w:lvlJc w:val="left"/>
+      <w:pPr>
+        <w:ind w:left="6480" w:hanging="360"/>
+      </w:pPr>
+      <w:rPr>
+        <w:rFonts w:ascii="Wingdings" w:hAnsi="Wingdings" w:hint="default"/>
+      </w:rPr>
+    </w:lvl>
+  </w:abstractNum>
+  <w:abstractNum w:abstractNumId="14" w15:restartNumberingAfterBreak="0">
+    <w:nsid w:val="34071DEF"/>
+    <w:multiLevelType w:val="hybridMultilevel"/>
+    <w:tmpl w:val="21D8BBFC"/>
+    <w:lvl w:ilvl="0" w:tplc="34090001">
+      <w:start w:val="1"/>
+      <w:numFmt w:val="bullet"/>
+      <w:lvlText w:val=""/>
+      <w:lvlJc w:val="left"/>
+      <w:pPr>
+        <w:ind w:left="720" w:hanging="360"/>
+      </w:pPr>
+      <w:rPr>
+        <w:rFonts w:ascii="Symbol" w:hAnsi="Symbol" w:hint="default"/>
+      </w:rPr>
+    </w:lvl>
+    <w:lvl w:ilvl="1" w:tplc="34090003" w:tentative="1">
+      <w:start w:val="1"/>
+      <w:numFmt w:val="bullet"/>
+      <w:lvlText w:val="o"/>
+      <w:lvlJc w:val="left"/>
+      <w:pPr>
+        <w:ind w:left="1440" w:hanging="360"/>
+      </w:pPr>
+      <w:rPr>
+        <w:rFonts w:ascii="Courier New" w:hAnsi="Courier New" w:cs="Courier New" w:hint="default"/>
+      </w:rPr>
+    </w:lvl>
+    <w:lvl w:ilvl="2" w:tplc="34090005" w:tentative="1">
+      <w:start w:val="1"/>
+      <w:numFmt w:val="bullet"/>
+      <w:lvlText w:val=""/>
+      <w:lvlJc w:val="left"/>
+      <w:pPr>
+        <w:ind w:left="2160" w:hanging="360"/>
+      </w:pPr>
+      <w:rPr>
+        <w:rFonts w:ascii="Wingdings" w:hAnsi="Wingdings" w:hint="default"/>
+      </w:rPr>
+    </w:lvl>
+    <w:lvl w:ilvl="3" w:tplc="34090001" w:tentative="1">
+      <w:start w:val="1"/>
+      <w:numFmt w:val="bullet"/>
+      <w:lvlText w:val=""/>
+      <w:lvlJc w:val="left"/>
+      <w:pPr>
+        <w:ind w:left="2880" w:hanging="360"/>
+      </w:pPr>
+      <w:rPr>
+        <w:rFonts w:ascii="Symbol" w:hAnsi="Symbol" w:hint="default"/>
+      </w:rPr>
+    </w:lvl>
+    <w:lvl w:ilvl="4" w:tplc="34090003" w:tentative="1">
+      <w:start w:val="1"/>
+      <w:numFmt w:val="bullet"/>
+      <w:lvlText w:val="o"/>
+      <w:lvlJc w:val="left"/>
+      <w:pPr>
+        <w:ind w:left="3600" w:hanging="360"/>
+      </w:pPr>
+      <w:rPr>
+        <w:rFonts w:ascii="Courier New" w:hAnsi="Courier New" w:cs="Courier New" w:hint="default"/>
+      </w:rPr>
+    </w:lvl>
+    <w:lvl w:ilvl="5" w:tplc="34090005" w:tentative="1">
+      <w:start w:val="1"/>
+      <w:numFmt w:val="bullet"/>
+      <w:lvlText w:val=""/>
+      <w:lvlJc w:val="left"/>
+      <w:pPr>
+        <w:ind w:left="4320" w:hanging="360"/>
+      </w:pPr>
+      <w:rPr>
+        <w:rFonts w:ascii="Wingdings" w:hAnsi="Wingdings" w:hint="default"/>
+      </w:rPr>
+    </w:lvl>
+    <w:lvl w:ilvl="6" w:tplc="34090001" w:tentative="1">
+      <w:start w:val="1"/>
+      <w:numFmt w:val="bullet"/>
+      <w:lvlText w:val=""/>
+      <w:lvlJc w:val="left"/>
+      <w:pPr>
+        <w:ind w:left="5040" w:hanging="360"/>
+      </w:pPr>
+      <w:rPr>
+        <w:rFonts w:ascii="Symbol" w:hAnsi="Symbol" w:hint="default"/>
+      </w:rPr>
+    </w:lvl>
+    <w:lvl w:ilvl="7" w:tplc="34090003" w:tentative="1">
+      <w:start w:val="1"/>
+      <w:numFmt w:val="bullet"/>
+      <w:lvlText w:val="o"/>
+      <w:lvlJc w:val="left"/>
+      <w:pPr>
+        <w:ind w:left="5760" w:hanging="360"/>
+      </w:pPr>
+      <w:rPr>
+        <w:rFonts w:ascii="Courier New" w:hAnsi="Courier New" w:cs="Courier New" w:hint="default"/>
+      </w:rPr>
+    </w:lvl>
+    <w:lvl w:ilvl="8" w:tplc="34090005" w:tentative="1">
+      <w:start w:val="1"/>
+      <w:numFmt w:val="bullet"/>
+      <w:lvlText w:val=""/>
+      <w:lvlJc w:val="left"/>
+      <w:pPr>
+        <w:ind w:left="6480" w:hanging="360"/>
+      </w:pPr>
+      <w:rPr>
+        <w:rFonts w:ascii="Wingdings" w:hAnsi="Wingdings" w:hint="default"/>
+      </w:rPr>
+    </w:lvl>
+  </w:abstractNum>
+  <w:abstractNum w:abstractNumId="15" w15:restartNumberingAfterBreak="0">
+    <w:nsid w:val="58A334D5"/>
+    <w:multiLevelType w:val="hybridMultilevel"/>
+    <w:tmpl w:val="2E96A9C0"/>
+    <w:lvl w:ilvl="0" w:tplc="34090001">
+      <w:start w:val="1"/>
+      <w:numFmt w:val="bullet"/>
+      <w:lvlText w:val=""/>
+      <w:lvlJc w:val="left"/>
+      <w:pPr>
+        <w:ind w:left="720" w:hanging="360"/>
+      </w:pPr>
+      <w:rPr>
+        <w:rFonts w:ascii="Symbol" w:hAnsi="Symbol" w:hint="default"/>
+      </w:rPr>
+    </w:lvl>
+    <w:lvl w:ilvl="1" w:tplc="34090003" w:tentative="1">
+      <w:start w:val="1"/>
+      <w:numFmt w:val="bullet"/>
+      <w:lvlText w:val="o"/>
+      <w:lvlJc w:val="left"/>
+      <w:pPr>
+        <w:ind w:left="1440" w:hanging="360"/>
+      </w:pPr>
+      <w:rPr>
+        <w:rFonts w:ascii="Courier New" w:hAnsi="Courier New" w:cs="Courier New" w:hint="default"/>
+      </w:rPr>
+    </w:lvl>
+    <w:lvl w:ilvl="2" w:tplc="34090005" w:tentative="1">
+      <w:start w:val="1"/>
+      <w:numFmt w:val="bullet"/>
+      <w:lvlText w:val=""/>
+      <w:lvlJc w:val="left"/>
+      <w:pPr>
+        <w:ind w:left="2160" w:hanging="360"/>
+      </w:pPr>
+      <w:rPr>
+        <w:rFonts w:ascii="Wingdings" w:hAnsi="Wingdings" w:hint="default"/>
+      </w:rPr>
+    </w:lvl>
+    <w:lvl w:ilvl="3" w:tplc="34090001" w:tentative="1">
+      <w:start w:val="1"/>
+      <w:numFmt w:val="bullet"/>
+      <w:lvlText w:val=""/>
+      <w:lvlJc w:val="left"/>
+      <w:pPr>
+        <w:ind w:left="2880" w:hanging="360"/>
+      </w:pPr>
+      <w:rPr>
+        <w:rFonts w:ascii="Symbol" w:hAnsi="Symbol" w:hint="default"/>
+      </w:rPr>
+    </w:lvl>
+    <w:lvl w:ilvl="4" w:tplc="34090003" w:tentative="1">
+      <w:start w:val="1"/>
+      <w:numFmt w:val="bullet"/>
+      <w:lvlText w:val="o"/>
+      <w:lvlJc w:val="left"/>
+      <w:pPr>
+        <w:ind w:left="3600" w:hanging="360"/>
+      </w:pPr>
+      <w:rPr>
+        <w:rFonts w:ascii="Courier New" w:hAnsi="Courier New" w:cs="Courier New" w:hint="default"/>
+      </w:rPr>
+    </w:lvl>
+    <w:lvl w:ilvl="5" w:tplc="34090005" w:tentative="1">
+      <w:start w:val="1"/>
+      <w:numFmt w:val="bullet"/>
+      <w:lvlText w:val=""/>
+      <w:lvlJc w:val="left"/>
+      <w:pPr>
+        <w:ind w:left="4320" w:hanging="360"/>
+      </w:pPr>
+      <w:rPr>
+        <w:rFonts w:ascii="Wingdings" w:hAnsi="Wingdings" w:hint="default"/>
+      </w:rPr>
+    </w:lvl>
+    <w:lvl w:ilvl="6" w:tplc="34090001" w:tentative="1">
+      <w:start w:val="1"/>
+      <w:numFmt w:val="bullet"/>
+      <w:lvlText w:val=""/>
+      <w:lvlJc w:val="left"/>
+      <w:pPr>
+        <w:ind w:left="5040" w:hanging="360"/>
+      </w:pPr>
+      <w:rPr>
+        <w:rFonts w:ascii="Symbol" w:hAnsi="Symbol" w:hint="default"/>
+      </w:rPr>
+    </w:lvl>
+    <w:lvl w:ilvl="7" w:tplc="34090003" w:tentative="1">
+      <w:start w:val="1"/>
+      <w:numFmt w:val="bullet"/>
+      <w:lvlText w:val="o"/>
+      <w:lvlJc w:val="left"/>
+      <w:pPr>
+        <w:ind w:left="5760" w:hanging="360"/>
+      </w:pPr>
+      <w:rPr>
+        <w:rFonts w:ascii="Courier New" w:hAnsi="Courier New" w:cs="Courier New" w:hint="default"/>
+      </w:rPr>
+    </w:lvl>
+    <w:lvl w:ilvl="8" w:tplc="34090005" w:tentative="1">
+      <w:start w:val="1"/>
+      <w:numFmt w:val="bullet"/>
+      <w:lvlText w:val=""/>
+      <w:lvlJc w:val="left"/>
+      <w:pPr>
+        <w:ind w:left="6480" w:hanging="360"/>
+      </w:pPr>
+      <w:rPr>
+        <w:rFonts w:ascii="Wingdings" w:hAnsi="Wingdings" w:hint="default"/>
+      </w:rPr>
+    </w:lvl>
+  </w:abstractNum>
+  <w:abstractNum w:abstractNumId="16" w15:restartNumberingAfterBreak="0">
+    <w:nsid w:val="66551624"/>
+    <w:multiLevelType w:val="hybridMultilevel"/>
+    <w:tmpl w:val="37AE644C"/>
+    <w:lvl w:ilvl="0" w:tplc="34090001">
+      <w:start w:val="1"/>
+      <w:numFmt w:val="bullet"/>
+      <w:lvlText w:val=""/>
+      <w:lvlJc w:val="left"/>
+      <w:pPr>
+        <w:ind w:left="720" w:hanging="360"/>
+      </w:pPr>
+      <w:rPr>
+        <w:rFonts w:ascii="Symbol" w:hAnsi="Symbol" w:hint="default"/>
+      </w:rPr>
+    </w:lvl>
+    <w:lvl w:ilvl="1" w:tplc="34090003" w:tentative="1">
+      <w:start w:val="1"/>
+      <w:numFmt w:val="bullet"/>
+      <w:lvlText w:val="o"/>
+      <w:lvlJc w:val="left"/>
+      <w:pPr>
+        <w:ind w:left="1440" w:hanging="360"/>
+      </w:pPr>
+      <w:rPr>
+        <w:rFonts w:ascii="Courier New" w:hAnsi="Courier New" w:cs="Courier New" w:hint="default"/>
+      </w:rPr>
+    </w:lvl>
+    <w:lvl w:ilvl="2" w:tplc="34090005" w:tentative="1">
+      <w:start w:val="1"/>
+      <w:numFmt w:val="bullet"/>
+      <w:lvlText w:val=""/>
+      <w:lvlJc w:val="left"/>
+      <w:pPr>
+        <w:ind w:left="2160" w:hanging="360"/>
+      </w:pPr>
+      <w:rPr>
+        <w:rFonts w:ascii="Wingdings" w:hAnsi="Wingdings" w:hint="default"/>
+      </w:rPr>
+    </w:lvl>
+    <w:lvl w:ilvl="3" w:tplc="34090001" w:tentative="1">
+      <w:start w:val="1"/>
+      <w:numFmt w:val="bullet"/>
+      <w:lvlText w:val=""/>
+      <w:lvlJc w:val="left"/>
+      <w:pPr>
+        <w:ind w:left="2880" w:hanging="360"/>
+      </w:pPr>
+      <w:rPr>
+        <w:rFonts w:ascii="Symbol" w:hAnsi="Symbol" w:hint="default"/>
+      </w:rPr>
+    </w:lvl>
+    <w:lvl w:ilvl="4" w:tplc="34090003" w:tentative="1">
+      <w:start w:val="1"/>
+      <w:numFmt w:val="bullet"/>
+      <w:lvlText w:val="o"/>
+      <w:lvlJc w:val="left"/>
+      <w:pPr>
+        <w:ind w:left="3600" w:hanging="360"/>
+      </w:pPr>
+      <w:rPr>
+        <w:rFonts w:ascii="Courier New" w:hAnsi="Courier New" w:cs="Courier New" w:hint="default"/>
+      </w:rPr>
+    </w:lvl>
+    <w:lvl w:ilvl="5" w:tplc="34090005" w:tentative="1">
+      <w:start w:val="1"/>
+      <w:numFmt w:val="bullet"/>
+      <w:lvlText w:val=""/>
+      <w:lvlJc w:val="left"/>
+      <w:pPr>
+        <w:ind w:left="4320" w:hanging="360"/>
+      </w:pPr>
+      <w:rPr>
+        <w:rFonts w:ascii="Wingdings" w:hAnsi="Wingdings" w:hint="default"/>
+      </w:rPr>
+    </w:lvl>
+    <w:lvl w:ilvl="6" w:tplc="34090001" w:tentative="1">
+      <w:start w:val="1"/>
+      <w:numFmt w:val="bullet"/>
+      <w:lvlText w:val=""/>
+      <w:lvlJc w:val="left"/>
+      <w:pPr>
+        <w:ind w:left="5040" w:hanging="360"/>
+      </w:pPr>
+      <w:rPr>
+        <w:rFonts w:ascii="Symbol" w:hAnsi="Symbol" w:hint="default"/>
+      </w:rPr>
+    </w:lvl>
+    <w:lvl w:ilvl="7" w:tplc="34090003" w:tentative="1">
+      <w:start w:val="1"/>
+      <w:numFmt w:val="bullet"/>
+      <w:lvlText w:val="o"/>
+      <w:lvlJc w:val="left"/>
+      <w:pPr>
+        <w:ind w:left="5760" w:hanging="360"/>
+      </w:pPr>
+      <w:rPr>
+        <w:rFonts w:ascii="Courier New" w:hAnsi="Courier New" w:cs="Courier New" w:hint="default"/>
+      </w:rPr>
+    </w:lvl>
+    <w:lvl w:ilvl="8" w:tplc="34090005" w:tentative="1">
+      <w:start w:val="1"/>
+      <w:numFmt w:val="bullet"/>
+      <w:lvlText w:val=""/>
+      <w:lvlJc w:val="left"/>
+      <w:pPr>
+        <w:ind w:left="6480" w:hanging="360"/>
+      </w:pPr>
+      <w:rPr>
+        <w:rFonts w:ascii="Wingdings" w:hAnsi="Wingdings" w:hint="default"/>
+      </w:rPr>
+    </w:lvl>
+  </w:abstractNum>
+  <w:abstractNum w:abstractNumId="17" w15:restartNumberingAfterBreak="0">
+    <w:nsid w:val="75A87E46"/>
+    <w:multiLevelType w:val="hybridMultilevel"/>
+    <w:tmpl w:val="4FD28278"/>
+    <w:lvl w:ilvl="0" w:tplc="34090001">
+      <w:start w:val="1"/>
+      <w:numFmt w:val="bullet"/>
+      <w:lvlText w:val=""/>
+      <w:lvlJc w:val="left"/>
+      <w:pPr>
+        <w:ind w:left="720" w:hanging="360"/>
+      </w:pPr>
+      <w:rPr>
+        <w:rFonts w:ascii="Symbol" w:hAnsi="Symbol" w:hint="default"/>
+      </w:rPr>
+    </w:lvl>
+    <w:lvl w:ilvl="1" w:tplc="34090003" w:tentative="1">
+      <w:start w:val="1"/>
+      <w:numFmt w:val="bullet"/>
+      <w:lvlText w:val="o"/>
+      <w:lvlJc w:val="left"/>
+      <w:pPr>
+        <w:ind w:left="1440" w:hanging="360"/>
+      </w:pPr>
+      <w:rPr>
+        <w:rFonts w:ascii="Courier New" w:hAnsi="Courier New" w:cs="Courier New" w:hint="default"/>
+      </w:rPr>
+    </w:lvl>
+    <w:lvl w:ilvl="2" w:tplc="34090005" w:tentative="1">
+      <w:start w:val="1"/>
+      <w:numFmt w:val="bullet"/>
+      <w:lvlText w:val=""/>
+      <w:lvlJc w:val="left"/>
+      <w:pPr>
+        <w:ind w:left="2160" w:hanging="360"/>
+      </w:pPr>
+      <w:rPr>
+        <w:rFonts w:ascii="Wingdings" w:hAnsi="Wingdings" w:hint="default"/>
+      </w:rPr>
+    </w:lvl>
+    <w:lvl w:ilvl="3" w:tplc="34090001" w:tentative="1">
+      <w:start w:val="1"/>
+      <w:numFmt w:val="bullet"/>
+      <w:lvlText w:val=""/>
+      <w:lvlJc w:val="left"/>
+      <w:pPr>
+        <w:ind w:left="2880" w:hanging="360"/>
+      </w:pPr>
+      <w:rPr>
+        <w:rFonts w:ascii="Symbol" w:hAnsi="Symbol" w:hint="default"/>
+      </w:rPr>
+    </w:lvl>
+    <w:lvl w:ilvl="4" w:tplc="34090003" w:tentative="1">
+      <w:start w:val="1"/>
+      <w:numFmt w:val="bullet"/>
+      <w:lvlText w:val="o"/>
+      <w:lvlJc w:val="left"/>
+      <w:pPr>
+        <w:ind w:left="3600" w:hanging="360"/>
+      </w:pPr>
+      <w:rPr>
+        <w:rFonts w:ascii="Courier New" w:hAnsi="Courier New" w:cs="Courier New" w:hint="default"/>
+      </w:rPr>
+    </w:lvl>
+    <w:lvl w:ilvl="5" w:tplc="34090005" w:tentative="1">
+      <w:start w:val="1"/>
+      <w:numFmt w:val="bullet"/>
+      <w:lvlText w:val=""/>
+      <w:lvlJc w:val="left"/>
+      <w:pPr>
+        <w:ind w:left="4320" w:hanging="360"/>
+      </w:pPr>
+      <w:rPr>
+        <w:rFonts w:ascii="Wingdings" w:hAnsi="Wingdings" w:hint="default"/>
+      </w:rPr>
+    </w:lvl>
+    <w:lvl w:ilvl="6" w:tplc="34090001" w:tentative="1">
+      <w:start w:val="1"/>
+      <w:numFmt w:val="bullet"/>
+      <w:lvlText w:val=""/>
+      <w:lvlJc w:val="left"/>
+      <w:pPr>
+        <w:ind w:left="5040" w:hanging="360"/>
+      </w:pPr>
+      <w:rPr>
+        <w:rFonts w:ascii="Symbol" w:hAnsi="Symbol" w:hint="default"/>
+      </w:rPr>
+    </w:lvl>
+    <w:lvl w:ilvl="7" w:tplc="34090003" w:tentative="1">
+      <w:start w:val="1"/>
+      <w:numFmt w:val="bullet"/>
+      <w:lvlText w:val="o"/>
+      <w:lvlJc w:val="left"/>
+      <w:pPr>
+        <w:ind w:left="5760" w:hanging="360"/>
+      </w:pPr>
+      <w:rPr>
+        <w:rFonts w:ascii="Courier New" w:hAnsi="Courier New" w:cs="Courier New" w:hint="default"/>
+      </w:rPr>
+    </w:lvl>
+    <w:lvl w:ilvl="8" w:tplc="34090005" w:tentative="1">
+      <w:start w:val="1"/>
+      <w:numFmt w:val="bullet"/>
+      <w:lvlText w:val=""/>
+      <w:lvlJc w:val="left"/>
+      <w:pPr>
+        <w:ind w:left="6480" w:hanging="360"/>
+      </w:pPr>
+      <w:rPr>
+        <w:rFonts w:ascii="Wingdings" w:hAnsi="Wingdings" w:hint="default"/>
       </w:rPr>
     </w:lvl>
   </w:abstractNum>
@@ -1227,6 +2790,33 @@
   </w:num>
   <w:num w:numId="9" w16cid:durableId="761536408">
     <w:abstractNumId w:val="0"/>
+  </w:num>
+  <w:num w:numId="10" w16cid:durableId="657347111">
+    <w:abstractNumId w:val="17"/>
+  </w:num>
+  <w:num w:numId="11" w16cid:durableId="361051342">
+    <w:abstractNumId w:val="9"/>
+  </w:num>
+  <w:num w:numId="12" w16cid:durableId="1232809880">
+    <w:abstractNumId w:val="11"/>
+  </w:num>
+  <w:num w:numId="13" w16cid:durableId="1311788931">
+    <w:abstractNumId w:val="12"/>
+  </w:num>
+  <w:num w:numId="14" w16cid:durableId="1263299715">
+    <w:abstractNumId w:val="14"/>
+  </w:num>
+  <w:num w:numId="15" w16cid:durableId="1029070614">
+    <w:abstractNumId w:val="10"/>
+  </w:num>
+  <w:num w:numId="16" w16cid:durableId="275403393">
+    <w:abstractNumId w:val="15"/>
+  </w:num>
+  <w:num w:numId="17" w16cid:durableId="889806823">
+    <w:abstractNumId w:val="16"/>
+  </w:num>
+  <w:num w:numId="18" w16cid:durableId="1364861551">
+    <w:abstractNumId w:val="13"/>
   </w:num>
 </w:numbering>
 </file>

</xml_diff>

<commit_message>
Strip unnecessary static tabs and redundant cards across all portals for pitch-perfect mockup
</commit_message>
<xml_diff>
--- a/JTYeo_CPA_Accounting_Office_Leave_Proposal.docx
+++ b/JTYeo_CPA_Accounting_Office_Leave_Proposal.docx
@@ -405,25 +405,7 @@
           <w:sz w:val="21"/>
           <w:szCs w:val="21"/>
         </w:rPr>
-        <w:t xml:space="preserve">One-click Approval / Rejection modal with reviewer </w:t>
-      </w:r>
-      <w:proofErr w:type="gramStart"/>
-      <w:r>
-        <w:rPr>
-          <w:rFonts w:asciiTheme="majorHAnsi" w:hAnsiTheme="majorHAnsi" w:cstheme="majorHAnsi"/>
-          <w:sz w:val="21"/>
-          <w:szCs w:val="21"/>
-        </w:rPr>
-        <w:t>note</w:t>
-      </w:r>
-      <w:proofErr w:type="gramEnd"/>
-      <w:r>
-        <w:rPr>
-          <w:rFonts w:asciiTheme="majorHAnsi" w:hAnsiTheme="majorHAnsi" w:cstheme="majorHAnsi"/>
-          <w:sz w:val="21"/>
-          <w:szCs w:val="21"/>
-        </w:rPr>
-        <w:t xml:space="preserve"> support (e.g., coverage handover instructions)</w:t>
+        <w:t>One-click Approval / Rejection modal with reviewer note support (e.g., coverage handover instructions)</w:t>
       </w:r>
     </w:p>
     <w:p>
@@ -772,7 +754,7 @@
                 <w:color w:val="FFFFFF"/>
                 <w:sz w:val="19"/>
               </w:rPr>
-              <w:t>TIER 2 (Sweet Spot)</w:t>
+              <w:t xml:space="preserve">TIER 2 </w:t>
             </w:r>
             <w:r>
               <w:rPr>
@@ -849,7 +831,15 @@
                 <w:color w:val="0F172A"/>
                 <w:sz w:val="22"/>
               </w:rPr>
-              <w:t>₱50,000</w:t>
+              <w:t>₱</w:t>
+            </w:r>
+            <w:r>
+              <w:rPr>
+                <w:b/>
+                <w:color w:val="0F172A"/>
+                <w:sz w:val="22"/>
+              </w:rPr>
+              <w:t>65,000</w:t>
             </w:r>
           </w:p>
         </w:tc>
@@ -868,7 +858,23 @@
                 <w:color w:val="auto"/>
                 <w:sz w:val="22"/>
               </w:rPr>
-              <w:t>₱70,000</w:t>
+              <w:t>₱7</w:t>
+            </w:r>
+            <w:r>
+              <w:rPr>
+                <w:b/>
+                <w:color w:val="auto"/>
+                <w:sz w:val="22"/>
+              </w:rPr>
+              <w:t>5</w:t>
+            </w:r>
+            <w:r>
+              <w:rPr>
+                <w:b/>
+                <w:color w:val="auto"/>
+                <w:sz w:val="22"/>
+              </w:rPr>
+              <w:t>,000</w:t>
             </w:r>
           </w:p>
         </w:tc>

</xml_diff>

<commit_message>
Synchronize live system status with 75k base and 85k enterprise upsell in proposal documents
</commit_message>
<xml_diff>
--- a/JTYeo_CPA_Accounting_Office_Leave_Proposal.docx
+++ b/JTYeo_CPA_Accounting_Office_Leave_Proposal.docx
@@ -226,7 +226,7 @@
         <w:t xml:space="preserve">Tier 1: Professional CPA Practice Edition (₱75,000) — </w:t>
       </w:r>
       <w:r>
-        <w:t>Complete 12-category leave management, dual signoff workflows, peak tax season blackout warnings, team calendar, and supporting document proof uploader.</w:t>
+        <w:t>Complete 12-category leave management, staff self-service, partner approval queue &amp; on-behalf filing, working days calculator, peak tax season blackout alerts, and detailed status modal.</w:t>
       </w:r>
     </w:p>
     <w:p>
@@ -241,7 +241,7 @@
         <w:t xml:space="preserve">Tier 2: Enterprise Practice Cloud Suite (₱85,000) ⭐ Recommended Flagship — </w:t>
       </w:r>
       <w:r>
-        <w:t>Everything in Tier 1 PLUS automated one-click payroll CSV export (JuanTax/Sprout/QuickBooks), real-time Year-End SIL Cash Monetization Liability Ledger (DOLE Art. 95), immutable IP audit trails, automated email alerts, and 3 months priority SLA warranty.</w:t>
+        <w:t>Everything in Tier 1 PLUS Interactive Team Calendar, Medical Certificate Proof Viewer, automated one-click payroll CSV export (JuanTax/Sprout/QuickBooks), Year-End SIL Cash Monetization Liability Ledger (DOLE Art. 95), immutable IP audit trails, automated email alerts, and 3 months priority SLA warranty.</w:t>
       </w:r>
     </w:p>
     <w:p>
@@ -323,6 +323,8 @@
               <w:t>Tier 1: Pro Edition</w:t>
               <w:br/>
               <w:t>(₱75,000)</w:t>
+              <w:br/>
+              <w:t>[The Live System]</w:t>
             </w:r>
           </w:p>
         </w:tc>
@@ -352,6 +354,8 @@
               <w:t>Tier 2: Enterprise Suite</w:t>
               <w:br/>
               <w:t>(₱85,000) 🏆</w:t>
+              <w:br/>
+              <w:t>[Target Flagship]</w:t>
             </w:r>
           </w:p>
         </w:tc>
@@ -540,7 +544,7 @@
                 <w:color w:val="1E293B"/>
                 <w:sz w:val="17"/>
               </w:rPr>
-              <w:t>Managing Partner Executive Portal &amp; Filing On Behalf of Staff</w:t>
+              <w:t>Managing Partner Approval &amp; Decision Review Queue</w:t>
             </w:r>
           </w:p>
         </w:tc>
@@ -621,7 +625,7 @@
                 <w:color w:val="1E293B"/>
                 <w:sz w:val="17"/>
               </w:rPr>
-              <w:t>Peak BIR Tax Season (March 15 - April 15) Blackout Warnings</w:t>
+              <w:t>Managing Partner Filing On Behalf of Any Employee</w:t>
             </w:r>
           </w:p>
         </w:tc>
@@ -702,7 +706,7 @@
                 <w:color w:val="1E293B"/>
                 <w:sz w:val="17"/>
               </w:rPr>
-              <w:t>Philippine Holiday &amp; Working Days Automatic Exclusions</w:t>
+              <w:t>Peak BIR Tax Season (March 15 - April 15) Blackout Warnings</w:t>
             </w:r>
           </w:p>
         </w:tc>
@@ -783,7 +787,7 @@
                 <w:color w:val="1E293B"/>
                 <w:sz w:val="17"/>
               </w:rPr>
-              <w:t>Interactive Team Absence Calendar &amp; Department Schedule</w:t>
+              <w:t>Philippine Holiday &amp; Working Days Automatic Exclusions</w:t>
             </w:r>
           </w:p>
         </w:tc>
@@ -864,7 +868,7 @@
                 <w:color w:val="1E293B"/>
                 <w:sz w:val="17"/>
               </w:rPr>
-              <w:t>Medical Certificate &amp; Doctor's Note Upload &amp; In-App Viewer</w:t>
+              <w:t>Clean Leave Application Details &amp; Partner Status Modal</w:t>
             </w:r>
           </w:p>
         </w:tc>
@@ -914,9 +918,11 @@
             </w:pPr>
             <w:r>
               <w:rPr>
+                <w:b/>
+                <w:color w:val="0F2744"/>
                 <w:sz w:val="17"/>
               </w:rPr>
-              <w:t>Included (Cloud Sync)</w:t>
+              <w:t>Included</w:t>
             </w:r>
           </w:p>
         </w:tc>
@@ -943,7 +949,7 @@
                 <w:color w:val="1E293B"/>
                 <w:sz w:val="17"/>
               </w:rPr>
-              <w:t>Standard Formatted Leave Ledger Export</w:t>
+              <w:t>Interactive Multi-Department Absence Calendar &amp; Schedule Sync</w:t>
             </w:r>
           </w:p>
         </w:tc>
@@ -966,17 +972,150 @@
             </w:pPr>
             <w:r>
               <w:rPr>
-                <w:b/>
-                <w:color w:val="0F2744"/>
+                <w:color w:val="64748B"/>
                 <w:sz w:val="17"/>
               </w:rPr>
-              <w:t>Included</w:t>
+              <w:t>—</w:t>
             </w:r>
           </w:p>
         </w:tc>
         <w:tc>
           <w:tcPr>
             <w:tcW w:type="dxa" w:w="2880"/>
+            <w:vAlign w:val="center"/>
+            <w:tcMar>
+              <w:top w:w="90" w:type="dxa"/>
+              <w:bottom w:w="90" w:type="dxa"/>
+              <w:left w:w="110" w:type="dxa"/>
+              <w:right w:w="110" w:type="dxa"/>
+            </w:tcMar>
+            <w:shd w:fill="F0FDF4"/>
+          </w:tcPr>
+          <w:p>
+            <w:pPr>
+              <w:spacing w:after="0"/>
+              <w:jc w:val="center"/>
+            </w:pPr>
+            <w:r>
+              <w:rPr>
+                <w:b/>
+                <w:color w:val="10B981"/>
+                <w:sz w:val="17"/>
+              </w:rPr>
+              <w:t>INCLUDED (Visual Schedule)</w:t>
+            </w:r>
+          </w:p>
+        </w:tc>
+      </w:tr>
+      <w:tr>
+        <w:tc>
+          <w:tcPr>
+            <w:tcW w:type="dxa" w:w="4896"/>
+            <w:vAlign w:val="center"/>
+            <w:tcMar>
+              <w:top w:w="90" w:type="dxa"/>
+              <w:bottom w:w="90" w:type="dxa"/>
+              <w:left w:w="110" w:type="dxa"/>
+              <w:right w:w="110" w:type="dxa"/>
+            </w:tcMar>
+            <w:shd w:fill="FFFFFF"/>
+          </w:tcPr>
+          <w:p>
+            <w:pPr>
+              <w:spacing w:after="0"/>
+            </w:pPr>
+            <w:r>
+              <w:rPr>
+                <w:color w:val="1E293B"/>
+                <w:sz w:val="17"/>
+              </w:rPr>
+              <w:t>Medical Certificate &amp; Doctor's Proof Upload &amp; In-App Viewer</w:t>
+            </w:r>
+          </w:p>
+        </w:tc>
+        <w:tc>
+          <w:tcPr>
+            <w:tcW w:type="dxa" w:w="2592"/>
+            <w:vAlign w:val="center"/>
+            <w:tcMar>
+              <w:top w:w="90" w:type="dxa"/>
+              <w:bottom w:w="90" w:type="dxa"/>
+              <w:left w:w="110" w:type="dxa"/>
+              <w:right w:w="110" w:type="dxa"/>
+            </w:tcMar>
+            <w:shd w:fill="FFFFFF"/>
+          </w:tcPr>
+          <w:p>
+            <w:pPr>
+              <w:spacing w:after="0"/>
+              <w:jc w:val="center"/>
+            </w:pPr>
+            <w:r>
+              <w:rPr>
+                <w:color w:val="64748B"/>
+                <w:sz w:val="17"/>
+              </w:rPr>
+              <w:t>—</w:t>
+            </w:r>
+          </w:p>
+        </w:tc>
+        <w:tc>
+          <w:tcPr>
+            <w:tcW w:type="dxa" w:w="2880"/>
+            <w:vAlign w:val="center"/>
+            <w:tcMar>
+              <w:top w:w="90" w:type="dxa"/>
+              <w:bottom w:w="90" w:type="dxa"/>
+              <w:left w:w="110" w:type="dxa"/>
+              <w:right w:w="110" w:type="dxa"/>
+            </w:tcMar>
+            <w:shd w:fill="F0FDF4"/>
+          </w:tcPr>
+          <w:p>
+            <w:pPr>
+              <w:spacing w:after="0"/>
+              <w:jc w:val="center"/>
+            </w:pPr>
+            <w:r>
+              <w:rPr>
+                <w:b/>
+                <w:color w:val="10B981"/>
+                <w:sz w:val="17"/>
+              </w:rPr>
+              <w:t>INCLUDED (Verification Engine)</w:t>
+            </w:r>
+          </w:p>
+        </w:tc>
+      </w:tr>
+      <w:tr>
+        <w:tc>
+          <w:tcPr>
+            <w:tcW w:type="dxa" w:w="4896"/>
+            <w:vAlign w:val="center"/>
+            <w:tcMar>
+              <w:top w:w="90" w:type="dxa"/>
+              <w:bottom w:w="90" w:type="dxa"/>
+              <w:left w:w="110" w:type="dxa"/>
+              <w:right w:w="110" w:type="dxa"/>
+            </w:tcMar>
+            <w:shd w:fill="F8FAFC"/>
+          </w:tcPr>
+          <w:p>
+            <w:pPr>
+              <w:spacing w:after="0"/>
+            </w:pPr>
+            <w:r>
+              <w:rPr>
+                <w:color w:val="1E293B"/>
+                <w:sz w:val="17"/>
+              </w:rPr>
+              <w:t>Automated Formatted Payroll CSV Export (JuanTax / Sprout / QuickBooks)</w:t>
+            </w:r>
+          </w:p>
+        </w:tc>
+        <w:tc>
+          <w:tcPr>
+            <w:tcW w:type="dxa" w:w="2592"/>
             <w:vAlign w:val="center"/>
             <w:tcMar>
               <w:top w:w="90" w:type="dxa"/>
@@ -993,11 +1132,37 @@
             </w:pPr>
             <w:r>
               <w:rPr>
-                <w:b/>
-                <w:color w:val="0F2744"/>
+                <w:color w:val="64748B"/>
                 <w:sz w:val="17"/>
               </w:rPr>
-              <w:t>Included</w:t>
+              <w:t>—</w:t>
+            </w:r>
+          </w:p>
+        </w:tc>
+        <w:tc>
+          <w:tcPr>
+            <w:tcW w:type="dxa" w:w="2880"/>
+            <w:vAlign w:val="center"/>
+            <w:tcMar>
+              <w:top w:w="90" w:type="dxa"/>
+              <w:bottom w:w="90" w:type="dxa"/>
+              <w:left w:w="110" w:type="dxa"/>
+              <w:right w:w="110" w:type="dxa"/>
+            </w:tcMar>
+            <w:shd w:fill="F0FDF4"/>
+          </w:tcPr>
+          <w:p>
+            <w:pPr>
+              <w:spacing w:after="0"/>
+              <w:jc w:val="center"/>
+            </w:pPr>
+            <w:r>
+              <w:rPr>
+                <w:b/>
+                <w:color w:val="10B981"/>
+                <w:sz w:val="17"/>
+              </w:rPr>
+              <w:t>INCLUDED (One-Click Sync)</w:t>
             </w:r>
           </w:p>
         </w:tc>
@@ -1104,7 +1269,7 @@
                 <w:color w:val="1E293B"/>
                 <w:sz w:val="17"/>
               </w:rPr>
-              <w:t>Automated Formatted Payroll CSV Export (JuanTax / Sprout / QuickBooks)</w:t>
+              <w:t>Immutable BIR-Ready Audit Trail with Client IP Tracking</w:t>
             </w:r>
           </w:p>
         </w:tc>
@@ -1119,86 +1284,6 @@
               <w:right w:w="110" w:type="dxa"/>
             </w:tcMar>
             <w:shd w:fill="F8FAFC"/>
-          </w:tcPr>
-          <w:p>
-            <w:pPr>
-              <w:spacing w:after="0"/>
-              <w:jc w:val="center"/>
-            </w:pPr>
-            <w:r>
-              <w:rPr>
-                <w:color w:val="64748B"/>
-                <w:sz w:val="17"/>
-              </w:rPr>
-              <w:t>—</w:t>
-            </w:r>
-          </w:p>
-        </w:tc>
-        <w:tc>
-          <w:tcPr>
-            <w:tcW w:type="dxa" w:w="2880"/>
-            <w:vAlign w:val="center"/>
-            <w:tcMar>
-              <w:top w:w="90" w:type="dxa"/>
-              <w:bottom w:w="90" w:type="dxa"/>
-              <w:left w:w="110" w:type="dxa"/>
-              <w:right w:w="110" w:type="dxa"/>
-            </w:tcMar>
-            <w:shd w:fill="F0FDF4"/>
-          </w:tcPr>
-          <w:p>
-            <w:pPr>
-              <w:spacing w:after="0"/>
-              <w:jc w:val="center"/>
-            </w:pPr>
-            <w:r>
-              <w:rPr>
-                <w:b/>
-                <w:color w:val="10B981"/>
-                <w:sz w:val="17"/>
-              </w:rPr>
-              <w:t>INCLUDED (One-Click Sync)</w:t>
-            </w:r>
-          </w:p>
-        </w:tc>
-      </w:tr>
-      <w:tr>
-        <w:tc>
-          <w:tcPr>
-            <w:tcW w:type="dxa" w:w="4896"/>
-            <w:vAlign w:val="center"/>
-            <w:tcMar>
-              <w:top w:w="90" w:type="dxa"/>
-              <w:bottom w:w="90" w:type="dxa"/>
-              <w:left w:w="110" w:type="dxa"/>
-              <w:right w:w="110" w:type="dxa"/>
-            </w:tcMar>
-            <w:shd w:fill="FFFFFF"/>
-          </w:tcPr>
-          <w:p>
-            <w:pPr>
-              <w:spacing w:after="0"/>
-            </w:pPr>
-            <w:r>
-              <w:rPr>
-                <w:color w:val="1E293B"/>
-                <w:sz w:val="17"/>
-              </w:rPr>
-              <w:t>Immutable BIR-Ready Audit Trail with Client IP Tracking</w:t>
-            </w:r>
-          </w:p>
-        </w:tc>
-        <w:tc>
-          <w:tcPr>
-            <w:tcW w:type="dxa" w:w="2592"/>
-            <w:vAlign w:val="center"/>
-            <w:tcMar>
-              <w:top w:w="90" w:type="dxa"/>
-              <w:bottom w:w="90" w:type="dxa"/>
-              <w:left w:w="110" w:type="dxa"/>
-              <w:right w:w="110" w:type="dxa"/>
-            </w:tcMar>
-            <w:shd w:fill="FFFFFF"/>
           </w:tcPr>
           <w:p>
             <w:pPr>
@@ -1253,6 +1338,86 @@
               <w:left w:w="110" w:type="dxa"/>
               <w:right w:w="110" w:type="dxa"/>
             </w:tcMar>
+            <w:shd w:fill="FFFFFF"/>
+          </w:tcPr>
+          <w:p>
+            <w:pPr>
+              <w:spacing w:after="0"/>
+            </w:pPr>
+            <w:r>
+              <w:rPr>
+                <w:color w:val="1E293B"/>
+                <w:sz w:val="17"/>
+              </w:rPr>
+              <w:t>Automated Real-Time Email Notifications &amp; Manager Alerts</w:t>
+            </w:r>
+          </w:p>
+        </w:tc>
+        <w:tc>
+          <w:tcPr>
+            <w:tcW w:type="dxa" w:w="2592"/>
+            <w:vAlign w:val="center"/>
+            <w:tcMar>
+              <w:top w:w="90" w:type="dxa"/>
+              <w:bottom w:w="90" w:type="dxa"/>
+              <w:left w:w="110" w:type="dxa"/>
+              <w:right w:w="110" w:type="dxa"/>
+            </w:tcMar>
+            <w:shd w:fill="FFFFFF"/>
+          </w:tcPr>
+          <w:p>
+            <w:pPr>
+              <w:spacing w:after="0"/>
+              <w:jc w:val="center"/>
+            </w:pPr>
+            <w:r>
+              <w:rPr>
+                <w:color w:val="64748B"/>
+                <w:sz w:val="17"/>
+              </w:rPr>
+              <w:t>—</w:t>
+            </w:r>
+          </w:p>
+        </w:tc>
+        <w:tc>
+          <w:tcPr>
+            <w:tcW w:type="dxa" w:w="2880"/>
+            <w:vAlign w:val="center"/>
+            <w:tcMar>
+              <w:top w:w="90" w:type="dxa"/>
+              <w:bottom w:w="90" w:type="dxa"/>
+              <w:left w:w="110" w:type="dxa"/>
+              <w:right w:w="110" w:type="dxa"/>
+            </w:tcMar>
+            <w:shd w:fill="F0FDF4"/>
+          </w:tcPr>
+          <w:p>
+            <w:pPr>
+              <w:spacing w:after="0"/>
+              <w:jc w:val="center"/>
+            </w:pPr>
+            <w:r>
+              <w:rPr>
+                <w:b/>
+                <w:color w:val="10B981"/>
+                <w:sz w:val="17"/>
+              </w:rPr>
+              <w:t>INCLUDED</w:t>
+            </w:r>
+          </w:p>
+        </w:tc>
+      </w:tr>
+      <w:tr>
+        <w:tc>
+          <w:tcPr>
+            <w:tcW w:type="dxa" w:w="4896"/>
+            <w:vAlign w:val="center"/>
+            <w:tcMar>
+              <w:top w:w="90" w:type="dxa"/>
+              <w:bottom w:w="90" w:type="dxa"/>
+              <w:left w:w="110" w:type="dxa"/>
+              <w:right w:w="110" w:type="dxa"/>
+            </w:tcMar>
             <w:shd w:fill="F8FAFC"/>
           </w:tcPr>
           <w:p>
@@ -1264,7 +1429,7 @@
                 <w:color w:val="1E293B"/>
                 <w:sz w:val="17"/>
               </w:rPr>
-              <w:t>Automated Real-Time Email Notifications &amp; Manager Alerts</w:t>
+              <w:t>Administrative Accrual Engine (+1.25d/mo &amp; Annual SIL Reset)</w:t>
             </w:r>
           </w:p>
         </w:tc>
@@ -1344,7 +1509,7 @@
                 <w:color w:val="1E293B"/>
                 <w:sz w:val="17"/>
               </w:rPr>
-              <w:t>Administrative Accrual Engine (+1.25d/mo &amp; Annual SIL Reset)</w:t>
+              <w:t>Warranty &amp; SLA Support Period</w:t>
             </w:r>
           </w:p>
         </w:tc>
@@ -1359,86 +1524,6 @@
               <w:right w:w="110" w:type="dxa"/>
             </w:tcMar>
             <w:shd w:fill="FFFFFF"/>
-          </w:tcPr>
-          <w:p>
-            <w:pPr>
-              <w:spacing w:after="0"/>
-              <w:jc w:val="center"/>
-            </w:pPr>
-            <w:r>
-              <w:rPr>
-                <w:color w:val="64748B"/>
-                <w:sz w:val="17"/>
-              </w:rPr>
-              <w:t>—</w:t>
-            </w:r>
-          </w:p>
-        </w:tc>
-        <w:tc>
-          <w:tcPr>
-            <w:tcW w:type="dxa" w:w="2880"/>
-            <w:vAlign w:val="center"/>
-            <w:tcMar>
-              <w:top w:w="90" w:type="dxa"/>
-              <w:bottom w:w="90" w:type="dxa"/>
-              <w:left w:w="110" w:type="dxa"/>
-              <w:right w:w="110" w:type="dxa"/>
-            </w:tcMar>
-            <w:shd w:fill="F0FDF4"/>
-          </w:tcPr>
-          <w:p>
-            <w:pPr>
-              <w:spacing w:after="0"/>
-              <w:jc w:val="center"/>
-            </w:pPr>
-            <w:r>
-              <w:rPr>
-                <w:b/>
-                <w:color w:val="10B981"/>
-                <w:sz w:val="17"/>
-              </w:rPr>
-              <w:t>INCLUDED</w:t>
-            </w:r>
-          </w:p>
-        </w:tc>
-      </w:tr>
-      <w:tr>
-        <w:tc>
-          <w:tcPr>
-            <w:tcW w:type="dxa" w:w="4896"/>
-            <w:vAlign w:val="center"/>
-            <w:tcMar>
-              <w:top w:w="90" w:type="dxa"/>
-              <w:bottom w:w="90" w:type="dxa"/>
-              <w:left w:w="110" w:type="dxa"/>
-              <w:right w:w="110" w:type="dxa"/>
-            </w:tcMar>
-            <w:shd w:fill="F8FAFC"/>
-          </w:tcPr>
-          <w:p>
-            <w:pPr>
-              <w:spacing w:after="0"/>
-            </w:pPr>
-            <w:r>
-              <w:rPr>
-                <w:color w:val="1E293B"/>
-                <w:sz w:val="17"/>
-              </w:rPr>
-              <w:t>Warranty &amp; SLA Support Period</w:t>
-            </w:r>
-          </w:p>
-        </w:tc>
-        <w:tc>
-          <w:tcPr>
-            <w:tcW w:type="dxa" w:w="2592"/>
-            <w:vAlign w:val="center"/>
-            <w:tcMar>
-              <w:top w:w="90" w:type="dxa"/>
-              <w:bottom w:w="90" w:type="dxa"/>
-              <w:left w:w="110" w:type="dxa"/>
-              <w:right w:w="110" w:type="dxa"/>
-            </w:tcMar>
-            <w:shd w:fill="F8FAFC"/>
           </w:tcPr>
           <w:p>
             <w:pPr>
@@ -1463,7 +1548,7 @@
               <w:left w:w="110" w:type="dxa"/>
               <w:right w:w="110" w:type="dxa"/>
             </w:tcMar>
-            <w:shd w:fill="F8FAFC"/>
+            <w:shd w:fill="FFFFFF"/>
           </w:tcPr>
           <w:p>
             <w:pPr>
@@ -1502,7 +1587,7 @@
           <w:color w:val="0F2744"/>
           <w:sz w:val="23"/>
         </w:rPr>
-        <w:t>🥈 Tier 1: Professional CPA Practice Edition — ₱75,000 (Standard Implementation)</w:t>
+        <w:t>🥈 Tier 1: Professional CPA Practice Edition — ₱75,000 (The Live Working System)</w:t>
       </w:r>
     </w:p>
     <w:p>
@@ -1600,35 +1685,14 @@
           <w:color w:val="1E293B"/>
           <w:sz w:val="19"/>
         </w:rPr>
-        <w:t xml:space="preserve">Interactive Team Absence Schedule: </w:t>
+        <w:t xml:space="preserve">Clean Details Modal: </w:t>
       </w:r>
       <w:r>
         <w:rPr>
           <w:color w:val="1E293B"/>
           <w:sz w:val="19"/>
         </w:rPr>
-        <w:t>Monthly schedule view showing team availability and planned absences to prevent engagement understaffing.</w:t>
-      </w:r>
-    </w:p>
-    <w:p>
-      <w:pPr>
-        <w:pStyle w:val="ListBullet"/>
-        <w:spacing w:after="60"/>
-      </w:pPr>
-      <w:r>
-        <w:rPr>
-          <w:b/>
-          <w:color w:val="1E293B"/>
-          <w:sz w:val="19"/>
-        </w:rPr>
-        <w:t xml:space="preserve">Medical Certificate Upload: </w:t>
-      </w:r>
-      <w:r>
-        <w:rPr>
-          <w:color w:val="1E293B"/>
-          <w:sz w:val="19"/>
-        </w:rPr>
-        <w:t>Staff can attach physician notes and CPD seminar slips with 1-click in-app viewing.</w:t>
+        <w:t>Complete breakdown of employee, dates, working days, reason notes, and partner approval status.</w:t>
       </w:r>
     </w:p>
     <w:p>
@@ -1679,6 +1743,48 @@
           <w:sz w:val="19"/>
         </w:rPr>
         <w:t>Everything in Tier 1 (₱75,000) PLUS the following high-ticket enterprise modules:</w:t>
+      </w:r>
+    </w:p>
+    <w:p>
+      <w:pPr>
+        <w:pStyle w:val="ListBullet"/>
+        <w:spacing w:after="60"/>
+      </w:pPr>
+      <w:r>
+        <w:rPr>
+          <w:b/>
+          <w:color w:val="0F2744"/>
+          <w:sz w:val="19"/>
+        </w:rPr>
+        <w:t xml:space="preserve">Interactive Multi-Department Absence Calendar: </w:t>
+      </w:r>
+      <w:r>
+        <w:rPr>
+          <w:color w:val="1E293B"/>
+          <w:sz w:val="19"/>
+        </w:rPr>
+        <w:t>Visual monthly schedule showing team availability and planned absences to prevent engagement understaffing during client audits.</w:t>
+      </w:r>
+    </w:p>
+    <w:p>
+      <w:pPr>
+        <w:pStyle w:val="ListBullet"/>
+        <w:spacing w:after="60"/>
+      </w:pPr>
+      <w:r>
+        <w:rPr>
+          <w:b/>
+          <w:color w:val="0F2744"/>
+          <w:sz w:val="19"/>
+        </w:rPr>
+        <w:t xml:space="preserve">Medical Certificate &amp; Document Proof Engine: </w:t>
+      </w:r>
+      <w:r>
+        <w:rPr>
+          <w:color w:val="1E293B"/>
+          <w:sz w:val="19"/>
+        </w:rPr>
+        <w:t>Staff can attach physician notes, CPD seminar slips, and death certificates with 1-click in-app viewing.</w:t>
       </w:r>
     </w:p>
     <w:p>

</xml_diff>

<commit_message>
Remove holiday working days calculation and tax season banner from live system and move to 85k enterprise upsell tier
</commit_message>
<xml_diff>
--- a/JTYeo_CPA_Accounting_Office_Leave_Proposal.docx
+++ b/JTYeo_CPA_Accounting_Office_Leave_Proposal.docx
@@ -226,7 +226,7 @@
         <w:t xml:space="preserve">Tier 1: Professional CPA Practice Edition (₱75,000) — </w:t>
       </w:r>
       <w:r>
-        <w:t>Complete 12-category leave management, staff self-service, partner approval queue &amp; on-behalf filing, working days calculator, peak tax season blackout alerts, and detailed status modal.</w:t>
+        <w:t>Complete 12-category leave management, staff self-service balances, partner approval queue &amp; on-behalf filing, and clean leave details modal.</w:t>
       </w:r>
     </w:p>
     <w:p>
@@ -241,7 +241,7 @@
         <w:t xml:space="preserve">Tier 2: Enterprise Practice Cloud Suite (₱85,000) ⭐ Recommended Flagship — </w:t>
       </w:r>
       <w:r>
-        <w:t>Everything in Tier 1 PLUS Interactive Team Calendar, Medical Certificate Proof Viewer, automated one-click payroll CSV export (JuanTax/Sprout/QuickBooks), Year-End SIL Cash Monetization Liability Ledger (DOLE Art. 95), immutable IP audit trails, automated email alerts, and 3 months priority SLA warranty.</w:t>
+        <w:t>Everything in Tier 1 PLUS Automated PH Holiday &amp; Working Days Exclusion Engine, Peak Tax Season Blackout Advisory, Interactive Team Calendar, Medical Certificate Proof Viewer, automated one-click payroll CSV export (JuanTax/Sprout/QuickBooks), Year-End SIL Cash Monetization Liability Ledger (DOLE Art. 95), immutable IP audit trails, automated email alerts, and 3 months priority SLA warranty.</w:t>
       </w:r>
     </w:p>
     <w:p>
@@ -706,7 +706,7 @@
                 <w:color w:val="1E293B"/>
                 <w:sz w:val="17"/>
               </w:rPr>
-              <w:t>Peak BIR Tax Season (March 15 - April 15) Blackout Warnings</w:t>
+              <w:t>Clean Leave Application Details &amp; Partner Status Modal</w:t>
             </w:r>
           </w:p>
         </w:tc>
@@ -787,7 +787,7 @@
                 <w:color w:val="1E293B"/>
                 <w:sz w:val="17"/>
               </w:rPr>
-              <w:t>Philippine Holiday &amp; Working Days Automatic Exclusions</w:t>
+              <w:t>Automated PH Holiday &amp; Working Days Exclusion Engine</w:t>
             </w:r>
           </w:p>
         </w:tc>
@@ -810,11 +810,10 @@
             </w:pPr>
             <w:r>
               <w:rPr>
-                <w:b/>
-                <w:color w:val="0F2744"/>
+                <w:color w:val="64748B"/>
                 <w:sz w:val="17"/>
               </w:rPr>
-              <w:t>Included</w:t>
+              <w:t>—</w:t>
             </w:r>
           </w:p>
         </w:tc>
@@ -828,7 +827,7 @@
               <w:left w:w="110" w:type="dxa"/>
               <w:right w:w="110" w:type="dxa"/>
             </w:tcMar>
-            <w:shd w:fill="F8FAFC"/>
+            <w:shd w:fill="F0FDF4"/>
           </w:tcPr>
           <w:p>
             <w:pPr>
@@ -838,10 +837,10 @@
             <w:r>
               <w:rPr>
                 <w:b/>
-                <w:color w:val="0F2744"/>
+                <w:color w:val="10B981"/>
                 <w:sz w:val="17"/>
               </w:rPr>
-              <w:t>Included</w:t>
+              <w:t>INCLUDED (Auto-Excludes Weekends &amp; PH Holidays)</w:t>
             </w:r>
           </w:p>
         </w:tc>
@@ -868,7 +867,7 @@
                 <w:color w:val="1E293B"/>
                 <w:sz w:val="17"/>
               </w:rPr>
-              <w:t>Clean Leave Application Details &amp; Partner Status Modal</w:t>
+              <w:t>Peak BIR Tax Season (March 15 - April 15) Blackout Warnings</w:t>
             </w:r>
           </w:p>
         </w:tc>
@@ -891,11 +890,10 @@
             </w:pPr>
             <w:r>
               <w:rPr>
-                <w:b/>
-                <w:color w:val="0F2744"/>
+                <w:color w:val="64748B"/>
                 <w:sz w:val="17"/>
               </w:rPr>
-              <w:t>Included</w:t>
+              <w:t>—</w:t>
             </w:r>
           </w:p>
         </w:tc>
@@ -909,7 +907,7 @@
               <w:left w:w="110" w:type="dxa"/>
               <w:right w:w="110" w:type="dxa"/>
             </w:tcMar>
-            <w:shd w:fill="FFFFFF"/>
+            <w:shd w:fill="F0FDF4"/>
           </w:tcPr>
           <w:p>
             <w:pPr>
@@ -919,10 +917,10 @@
             <w:r>
               <w:rPr>
                 <w:b/>
-                <w:color w:val="0F2744"/>
+                <w:color w:val="10B981"/>
                 <w:sz w:val="17"/>
               </w:rPr>
-              <w:t>Included</w:t>
+              <w:t>INCLUDED (Client Engagement Protection)</w:t>
             </w:r>
           </w:p>
         </w:tc>
@@ -1643,48 +1641,6 @@
           <w:color w:val="1E293B"/>
           <w:sz w:val="19"/>
         </w:rPr>
-        <w:t xml:space="preserve">Peak Tax Season Warnings: </w:t>
-      </w:r>
-      <w:r>
-        <w:rPr>
-          <w:color w:val="1E293B"/>
-          <w:sz w:val="19"/>
-        </w:rPr>
-        <w:t>Automated visual alert banner for any leave requested during the peak BIR ITR filing period (March 15 to April 15).</w:t>
-      </w:r>
-    </w:p>
-    <w:p>
-      <w:pPr>
-        <w:pStyle w:val="ListBullet"/>
-        <w:spacing w:after="60"/>
-      </w:pPr>
-      <w:r>
-        <w:rPr>
-          <w:b/>
-          <w:color w:val="1E293B"/>
-          <w:sz w:val="19"/>
-        </w:rPr>
-        <w:t xml:space="preserve">Philippine Holiday Working Days Engine: </w:t>
-      </w:r>
-      <w:r>
-        <w:rPr>
-          <w:color w:val="1E293B"/>
-          <w:sz w:val="19"/>
-        </w:rPr>
-        <w:t>Automatic calendar calculation excluding weekends and official regular/special non-working holidays.</w:t>
-      </w:r>
-    </w:p>
-    <w:p>
-      <w:pPr>
-        <w:pStyle w:val="ListBullet"/>
-        <w:spacing w:after="60"/>
-      </w:pPr>
-      <w:r>
-        <w:rPr>
-          <w:b/>
-          <w:color w:val="1E293B"/>
-          <w:sz w:val="19"/>
-        </w:rPr>
         <w:t xml:space="preserve">Clean Details Modal: </w:t>
       </w:r>
       <w:r>
@@ -1692,7 +1648,7 @@
           <w:color w:val="1E293B"/>
           <w:sz w:val="19"/>
         </w:rPr>
-        <w:t>Complete breakdown of employee, dates, working days, reason notes, and partner approval status.</w:t>
+        <w:t>Complete breakdown of employee, dates, duration, reason notes, and partner approval status.</w:t>
       </w:r>
     </w:p>
     <w:p>
@@ -1743,6 +1699,48 @@
           <w:sz w:val="19"/>
         </w:rPr>
         <w:t>Everything in Tier 1 (₱75,000) PLUS the following high-ticket enterprise modules:</w:t>
+      </w:r>
+    </w:p>
+    <w:p>
+      <w:pPr>
+        <w:pStyle w:val="ListBullet"/>
+        <w:spacing w:after="60"/>
+      </w:pPr>
+      <w:r>
+        <w:rPr>
+          <w:b/>
+          <w:color w:val="0F2744"/>
+          <w:sz w:val="19"/>
+        </w:rPr>
+        <w:t xml:space="preserve">Automated PH Holiday &amp; Working Days Exclusion Engine: </w:t>
+      </w:r>
+      <w:r>
+        <w:rPr>
+          <w:color w:val="1E293B"/>
+          <w:sz w:val="19"/>
+        </w:rPr>
+        <w:t>Automatically detects and excludes weekends and official Philippine regular/special non-working holidays from leave deductions.</w:t>
+      </w:r>
+    </w:p>
+    <w:p>
+      <w:pPr>
+        <w:pStyle w:val="ListBullet"/>
+        <w:spacing w:after="60"/>
+      </w:pPr>
+      <w:r>
+        <w:rPr>
+          <w:b/>
+          <w:color w:val="0F2744"/>
+          <w:sz w:val="19"/>
+        </w:rPr>
+        <w:t xml:space="preserve">Peak BIR Tax Season Advisory Engine: </w:t>
+      </w:r>
+      <w:r>
+        <w:rPr>
+          <w:color w:val="1E293B"/>
+          <w:sz w:val="19"/>
+        </w:rPr>
+        <w:t>Visual blackout warning banner and partner clearance enforcement for leaves during the annual ITR filing period (March 15 – April 15).</w:t>
       </w:r>
     </w:p>
     <w:p>

</xml_diff>

<commit_message>
Present pure commercial 2-tier client proposal with 75k Professional vs 85k Enterprise Suite
</commit_message>
<xml_diff>
--- a/JTYeo_CPA_Accounting_Office_Leave_Proposal.docx
+++ b/JTYeo_CPA_Accounting_Office_Leave_Proposal.docx
@@ -223,10 +223,10 @@
           <w:b/>
           <w:color w:val="0F2744"/>
         </w:rPr>
-        <w:t xml:space="preserve">Tier 1: Professional CPA Practice Edition (₱75,000) — </w:t>
+        <w:t xml:space="preserve">Tier 1: Professional Edition (₱75,000) — </w:t>
       </w:r>
       <w:r>
-        <w:t>Complete 12-category leave management, staff self-service balances, partner approval queue &amp; on-behalf filing, and clean leave details modal.</w:t>
+        <w:t>Complete 5-category leave management, employee self-service balances, partner approval queue &amp; on-behalf filing, and clean leave details modal.</w:t>
       </w:r>
     </w:p>
     <w:p>
@@ -238,10 +238,10 @@
           <w:b/>
           <w:color w:val="0284C7"/>
         </w:rPr>
-        <w:t xml:space="preserve">Tier 2: Enterprise Practice Cloud Suite (₱85,000) ⭐ Recommended Flagship — </w:t>
+        <w:t xml:space="preserve">Tier 2: Enterprise Suite (₱85,000) ⭐ Recommended Flagship — </w:t>
       </w:r>
       <w:r>
-        <w:t>Everything in Tier 1 PLUS Automated Holiday &amp; Working Days Exclusion Engine, Peak Tax Season Blackout Advisory, Interactive Team Calendar, Medical Certificate Proof Viewer, automated one-click payroll CSV export (JuanTax/Sprout/QuickBooks), Year-End Unused Leave Cash Conversion Ledger, immutable enterprise audit trails, automated email alerts, and 3 months priority SLA warranty.</w:t>
+        <w:t>Everything in Tier 1 PLUS automated one-click payroll CSV export (JuanTax/Sprout/QuickBooks), Year-End Unused Leave Cash Conversion Ledger, Interactive Team Calendar, Medical Certificate Proof Viewer, immutable enterprise audit trails, automated email alerts, and 3 months priority SLA warranty.</w:t>
       </w:r>
     </w:p>
     <w:p>
@@ -320,11 +320,9 @@
                 <w:color w:val="FFFFFF"/>
                 <w:sz w:val="19"/>
               </w:rPr>
-              <w:t>Tier 1: Pro Edition</w:t>
+              <w:t>Tier 1: Professional Edition</w:t>
               <w:br/>
               <w:t>(₱75,000)</w:t>
-              <w:br/>
-              <w:t>[The Live System]</w:t>
             </w:r>
           </w:p>
         </w:tc>
@@ -354,8 +352,6 @@
               <w:t>Tier 2: Enterprise Suite</w:t>
               <w:br/>
               <w:t>(₱85,000) 🏆</w:t>
-              <w:br/>
-              <w:t>[Target Flagship]</w:t>
             </w:r>
           </w:p>
         </w:tc>
@@ -463,7 +459,7 @@
                 <w:color w:val="1E293B"/>
                 <w:sz w:val="17"/>
               </w:rPr>
-              <w:t>Staff Self-Service Portal &amp; Real-Time Balance Ledgers</w:t>
+              <w:t>Employee Self-Service Portal &amp; Real-Time Balance Ledgers</w:t>
             </w:r>
           </w:p>
         </w:tc>
@@ -1665,7 +1661,7 @@
           <w:color w:val="0F2744"/>
           <w:sz w:val="23"/>
         </w:rPr>
-        <w:t>🥈 Tier 1: Professional CPA Practice Edition — ₱75,000 (The Live Working System)</w:t>
+        <w:t>🥈 Tier 1: Professional Edition — ₱75,000</w:t>
       </w:r>
     </w:p>
     <w:p>
@@ -1687,6 +1683,27 @@
           <w:sz w:val="19"/>
         </w:rPr>
         <w:t>Vacation Leave (VL), Sick Leave (SL), Emergency Leave, Bereavement Leave, and Leave Without Pay (LWOP).</w:t>
+      </w:r>
+    </w:p>
+    <w:p>
+      <w:pPr>
+        <w:pStyle w:val="ListBullet"/>
+        <w:spacing w:after="60"/>
+      </w:pPr>
+      <w:r>
+        <w:rPr>
+          <w:b/>
+          <w:color w:val="1E293B"/>
+          <w:sz w:val="19"/>
+        </w:rPr>
+        <w:t xml:space="preserve">Employee Self-Service Portal: </w:t>
+      </w:r>
+      <w:r>
+        <w:rPr>
+          <w:color w:val="1E293B"/>
+          <w:sz w:val="19"/>
+        </w:rPr>
+        <w:t>Real-time personal balance summary cards, leave filing form, and historical status ledger.</w:t>
       </w:r>
     </w:p>
     <w:p>
@@ -1764,7 +1781,7 @@
           <w:color w:val="0284C7"/>
           <w:sz w:val="23"/>
         </w:rPr>
-        <w:t>🥇 Tier 2: Enterprise Practice Cloud Suite — ₱85,000 ⭐ (Recommended Flagship Package)</w:t>
+        <w:t>🥇 Tier 2: Enterprise Suite — ₱85,000 ⭐ (Recommended Flagship Package)</w:t>
       </w:r>
     </w:p>
     <w:p>

</xml_diff>

<commit_message>
Revise proposal with descriptive side-by-side deliverables matrix (no included/— tags)
</commit_message>
<xml_diff>
--- a/JTYeo_CPA_Accounting_Office_Leave_Proposal.docx
+++ b/JTYeo_CPA_Accounting_Office_Leave_Proposal.docx
@@ -273,39 +273,13 @@
       <w:tr>
         <w:tc>
           <w:tcPr>
-            <w:tcW w:type="dxa" w:w="4896"/>
+            <w:tcW w:type="dxa" w:w="2880"/>
             <w:vAlign w:val="center"/>
             <w:tcMar>
-              <w:top w:w="90" w:type="dxa"/>
-              <w:bottom w:w="90" w:type="dxa"/>
-              <w:left w:w="110" w:type="dxa"/>
-              <w:right w:w="110" w:type="dxa"/>
-            </w:tcMar>
-            <w:shd w:fill="0F2744"/>
-          </w:tcPr>
-          <w:p>
-            <w:pPr>
-              <w:spacing w:after="0"/>
-            </w:pPr>
-            <w:r>
-              <w:rPr>
-                <w:b/>
-                <w:color w:val="FFFFFF"/>
-                <w:sz w:val="19"/>
-              </w:rPr>
-              <w:t>Feature &amp; Capability</w:t>
-            </w:r>
-          </w:p>
-        </w:tc>
-        <w:tc>
-          <w:tcPr>
-            <w:tcW w:type="dxa" w:w="2592"/>
-            <w:vAlign w:val="center"/>
-            <w:tcMar>
-              <w:top w:w="90" w:type="dxa"/>
-              <w:bottom w:w="90" w:type="dxa"/>
-              <w:left w:w="110" w:type="dxa"/>
-              <w:right w:w="110" w:type="dxa"/>
+              <w:top w:w="80" w:type="dxa"/>
+              <w:bottom w:w="80" w:type="dxa"/>
+              <w:left w:w="100" w:type="dxa"/>
+              <w:right w:w="100" w:type="dxa"/>
             </w:tcMar>
             <w:shd w:fill="0F2744"/>
           </w:tcPr>
@@ -320,21 +294,19 @@
                 <w:color w:val="FFFFFF"/>
                 <w:sz w:val="19"/>
               </w:rPr>
-              <w:t>Tier 1: Professional Edition</w:t>
-              <w:br/>
-              <w:t>(₱75,000)</w:t>
+              <w:t>System Capability</w:t>
             </w:r>
           </w:p>
         </w:tc>
         <w:tc>
           <w:tcPr>
-            <w:tcW w:type="dxa" w:w="2880"/>
+            <w:tcW w:type="dxa" w:w="3600"/>
             <w:vAlign w:val="center"/>
             <w:tcMar>
-              <w:top w:w="90" w:type="dxa"/>
-              <w:bottom w:w="90" w:type="dxa"/>
-              <w:left w:w="110" w:type="dxa"/>
-              <w:right w:w="110" w:type="dxa"/>
+              <w:top w:w="80" w:type="dxa"/>
+              <w:bottom w:w="80" w:type="dxa"/>
+              <w:left w:w="100" w:type="dxa"/>
+              <w:right w:w="100" w:type="dxa"/>
             </w:tcMar>
             <w:shd w:fill="0F2744"/>
           </w:tcPr>
@@ -349,7 +321,36 @@
                 <w:color w:val="FFFFFF"/>
                 <w:sz w:val="19"/>
               </w:rPr>
-              <w:t>Tier 2: Enterprise Suite</w:t>
+              <w:t>Option 1: Professional Edition</w:t>
+              <w:br/>
+              <w:t>(₱75,000)</w:t>
+            </w:r>
+          </w:p>
+        </w:tc>
+        <w:tc>
+          <w:tcPr>
+            <w:tcW w:type="dxa" w:w="3888"/>
+            <w:vAlign w:val="center"/>
+            <w:tcMar>
+              <w:top w:w="80" w:type="dxa"/>
+              <w:bottom w:w="80" w:type="dxa"/>
+              <w:left w:w="100" w:type="dxa"/>
+              <w:right w:w="100" w:type="dxa"/>
+            </w:tcMar>
+            <w:shd w:fill="0F2744"/>
+          </w:tcPr>
+          <w:p>
+            <w:pPr>
+              <w:spacing w:after="0"/>
+              <w:jc w:val="center"/>
+            </w:pPr>
+            <w:r>
+              <w:rPr>
+                <w:b/>
+                <w:color w:val="FFFFFF"/>
+                <w:sz w:val="19"/>
+              </w:rPr>
+              <w:t>Option 2: Enterprise Cloud Suite</w:t>
               <w:br/>
               <w:t>(₱85,000) 🏆</w:t>
             </w:r>
@@ -359,13 +360,39 @@
       <w:tr>
         <w:tc>
           <w:tcPr>
-            <w:tcW w:type="dxa" w:w="4896"/>
+            <w:tcW w:type="dxa" w:w="2880"/>
             <w:vAlign w:val="center"/>
             <w:tcMar>
-              <w:top w:w="90" w:type="dxa"/>
-              <w:bottom w:w="90" w:type="dxa"/>
-              <w:left w:w="110" w:type="dxa"/>
-              <w:right w:w="110" w:type="dxa"/>
+              <w:top w:w="80" w:type="dxa"/>
+              <w:bottom w:w="80" w:type="dxa"/>
+              <w:left w:w="100" w:type="dxa"/>
+              <w:right w:w="100" w:type="dxa"/>
+            </w:tcMar>
+            <w:shd w:fill="FFFFFF"/>
+          </w:tcPr>
+          <w:p>
+            <w:pPr>
+              <w:spacing w:after="0"/>
+            </w:pPr>
+            <w:r>
+              <w:rPr>
+                <w:b/>
+                <w:color w:val="0F2744"/>
+                <w:sz w:val="17"/>
+              </w:rPr>
+              <w:t>Leave Categories &amp; Policies</w:t>
+            </w:r>
+          </w:p>
+        </w:tc>
+        <w:tc>
+          <w:tcPr>
+            <w:tcW w:type="dxa" w:w="3600"/>
+            <w:vAlign w:val="center"/>
+            <w:tcMar>
+              <w:top w:w="80" w:type="dxa"/>
+              <w:bottom w:w="80" w:type="dxa"/>
+              <w:left w:w="100" w:type="dxa"/>
+              <w:right w:w="100" w:type="dxa"/>
             </w:tcMar>
             <w:shd w:fill="FFFFFF"/>
           </w:tcPr>
@@ -378,26 +405,52 @@
                 <w:color w:val="1E293B"/>
                 <w:sz w:val="17"/>
               </w:rPr>
-              <w:t>5 Core Essential Leave Categories (VL, SL, Emergency, Bereavement, LWOP)</w:t>
+              <w:t>5 Core Categories (VL, SL, Emergency, Bereavement, LWOP)</w:t>
             </w:r>
           </w:p>
         </w:tc>
         <w:tc>
           <w:tcPr>
-            <w:tcW w:type="dxa" w:w="2592"/>
+            <w:tcW w:type="dxa" w:w="3888"/>
             <w:vAlign w:val="center"/>
             <w:tcMar>
-              <w:top w:w="90" w:type="dxa"/>
-              <w:bottom w:w="90" w:type="dxa"/>
-              <w:left w:w="110" w:type="dxa"/>
-              <w:right w:w="110" w:type="dxa"/>
+              <w:top w:w="80" w:type="dxa"/>
+              <w:bottom w:w="80" w:type="dxa"/>
+              <w:left w:w="100" w:type="dxa"/>
+              <w:right w:w="100" w:type="dxa"/>
             </w:tcMar>
-            <w:shd w:fill="FFFFFF"/>
+            <w:shd w:fill="F0FDF4"/>
           </w:tcPr>
           <w:p>
             <w:pPr>
               <w:spacing w:after="0"/>
-              <w:jc w:val="center"/>
+            </w:pPr>
+            <w:r>
+              <w:rPr>
+                <w:color w:val="1E293B"/>
+                <w:sz w:val="17"/>
+              </w:rPr>
+              <w:t>Full 12 Statutory &amp; Firm Categories (Solo Parent, Maternity, Paternity, Special Women, VAWC, Study, etc.)</w:t>
+            </w:r>
+          </w:p>
+        </w:tc>
+      </w:tr>
+      <w:tr>
+        <w:tc>
+          <w:tcPr>
+            <w:tcW w:type="dxa" w:w="2880"/>
+            <w:vAlign w:val="center"/>
+            <w:tcMar>
+              <w:top w:w="80" w:type="dxa"/>
+              <w:bottom w:w="80" w:type="dxa"/>
+              <w:left w:w="100" w:type="dxa"/>
+              <w:right w:w="100" w:type="dxa"/>
+            </w:tcMar>
+            <w:shd w:fill="F8FAFC"/>
+          </w:tcPr>
+          <w:p>
+            <w:pPr>
+              <w:spacing w:after="0"/>
             </w:pPr>
             <w:r>
               <w:rPr>
@@ -405,48 +458,19 @@
                 <w:color w:val="0F2744"/>
                 <w:sz w:val="17"/>
               </w:rPr>
-              <w:t>Included</w:t>
+              <w:t>Payroll Processing</w:t>
             </w:r>
           </w:p>
         </w:tc>
         <w:tc>
           <w:tcPr>
-            <w:tcW w:type="dxa" w:w="2880"/>
+            <w:tcW w:type="dxa" w:w="3600"/>
             <w:vAlign w:val="center"/>
             <w:tcMar>
-              <w:top w:w="90" w:type="dxa"/>
-              <w:bottom w:w="90" w:type="dxa"/>
-              <w:left w:w="110" w:type="dxa"/>
-              <w:right w:w="110" w:type="dxa"/>
-            </w:tcMar>
-            <w:shd w:fill="FFFFFF"/>
-          </w:tcPr>
-          <w:p>
-            <w:pPr>
-              <w:spacing w:after="0"/>
-              <w:jc w:val="center"/>
-            </w:pPr>
-            <w:r>
-              <w:rPr>
-                <w:b/>
-                <w:color w:val="0F2744"/>
-                <w:sz w:val="17"/>
-              </w:rPr>
-              <w:t>Included</w:t>
-            </w:r>
-          </w:p>
-        </w:tc>
-      </w:tr>
-      <w:tr>
-        <w:tc>
-          <w:tcPr>
-            <w:tcW w:type="dxa" w:w="4896"/>
-            <w:vAlign w:val="center"/>
-            <w:tcMar>
-              <w:top w:w="90" w:type="dxa"/>
-              <w:bottom w:w="90" w:type="dxa"/>
-              <w:left w:w="110" w:type="dxa"/>
-              <w:right w:w="110" w:type="dxa"/>
+              <w:top w:w="80" w:type="dxa"/>
+              <w:bottom w:w="80" w:type="dxa"/>
+              <w:left w:w="100" w:type="dxa"/>
+              <w:right w:w="100" w:type="dxa"/>
             </w:tcMar>
             <w:shd w:fill="F8FAFC"/>
           </w:tcPr>
@@ -459,26 +483,52 @@
                 <w:color w:val="1E293B"/>
                 <w:sz w:val="17"/>
               </w:rPr>
-              <w:t>Employee Self-Service Portal &amp; Real-Time Balance Ledgers</w:t>
+              <w:t>Standard Table View &amp; Manual Entry</w:t>
             </w:r>
           </w:p>
         </w:tc>
         <w:tc>
           <w:tcPr>
-            <w:tcW w:type="dxa" w:w="2592"/>
+            <w:tcW w:type="dxa" w:w="3888"/>
             <w:vAlign w:val="center"/>
             <w:tcMar>
-              <w:top w:w="90" w:type="dxa"/>
-              <w:bottom w:w="90" w:type="dxa"/>
-              <w:left w:w="110" w:type="dxa"/>
-              <w:right w:w="110" w:type="dxa"/>
+              <w:top w:w="80" w:type="dxa"/>
+              <w:bottom w:w="80" w:type="dxa"/>
+              <w:left w:w="100" w:type="dxa"/>
+              <w:right w:w="100" w:type="dxa"/>
             </w:tcMar>
-            <w:shd w:fill="F8FAFC"/>
+            <w:shd w:fill="F0FDF4"/>
           </w:tcPr>
           <w:p>
             <w:pPr>
               <w:spacing w:after="0"/>
-              <w:jc w:val="center"/>
+            </w:pPr>
+            <w:r>
+              <w:rPr>
+                <w:color w:val="1E293B"/>
+                <w:sz w:val="17"/>
+              </w:rPr>
+              <w:t>Automated 1-Click Formatted Payroll CSV Export (JuanTax, Sprout Solutions, QuickBooks, Excel)</w:t>
+            </w:r>
+          </w:p>
+        </w:tc>
+      </w:tr>
+      <w:tr>
+        <w:tc>
+          <w:tcPr>
+            <w:tcW w:type="dxa" w:w="2880"/>
+            <w:vAlign w:val="center"/>
+            <w:tcMar>
+              <w:top w:w="80" w:type="dxa"/>
+              <w:bottom w:w="80" w:type="dxa"/>
+              <w:left w:w="100" w:type="dxa"/>
+              <w:right w:w="100" w:type="dxa"/>
+            </w:tcMar>
+            <w:shd w:fill="FFFFFF"/>
+          </w:tcPr>
+          <w:p>
+            <w:pPr>
+              <w:spacing w:after="0"/>
             </w:pPr>
             <w:r>
               <w:rPr>
@@ -486,48 +536,19 @@
                 <w:color w:val="0F2744"/>
                 <w:sz w:val="17"/>
               </w:rPr>
-              <w:t>Included</w:t>
+              <w:t>Annual Financial Liabilities</w:t>
             </w:r>
           </w:p>
         </w:tc>
         <w:tc>
           <w:tcPr>
-            <w:tcW w:type="dxa" w:w="2880"/>
+            <w:tcW w:type="dxa" w:w="3600"/>
             <w:vAlign w:val="center"/>
             <w:tcMar>
-              <w:top w:w="90" w:type="dxa"/>
-              <w:bottom w:w="90" w:type="dxa"/>
-              <w:left w:w="110" w:type="dxa"/>
-              <w:right w:w="110" w:type="dxa"/>
-            </w:tcMar>
-            <w:shd w:fill="F8FAFC"/>
-          </w:tcPr>
-          <w:p>
-            <w:pPr>
-              <w:spacing w:after="0"/>
-              <w:jc w:val="center"/>
-            </w:pPr>
-            <w:r>
-              <w:rPr>
-                <w:b/>
-                <w:color w:val="0F2744"/>
-                <w:sz w:val="17"/>
-              </w:rPr>
-              <w:t>Included</w:t>
-            </w:r>
-          </w:p>
-        </w:tc>
-      </w:tr>
-      <w:tr>
-        <w:tc>
-          <w:tcPr>
-            <w:tcW w:type="dxa" w:w="4896"/>
-            <w:vAlign w:val="center"/>
-            <w:tcMar>
-              <w:top w:w="90" w:type="dxa"/>
-              <w:bottom w:w="90" w:type="dxa"/>
-              <w:left w:w="110" w:type="dxa"/>
-              <w:right w:w="110" w:type="dxa"/>
+              <w:top w:w="80" w:type="dxa"/>
+              <w:bottom w:w="80" w:type="dxa"/>
+              <w:left w:w="100" w:type="dxa"/>
+              <w:right w:w="100" w:type="dxa"/>
             </w:tcMar>
             <w:shd w:fill="FFFFFF"/>
           </w:tcPr>
@@ -540,26 +561,52 @@
                 <w:color w:val="1E293B"/>
                 <w:sz w:val="17"/>
               </w:rPr>
-              <w:t>Managing Partner Approval &amp; Decision Review Queue</w:t>
+              <w:t>Manual Computation at Year-End</w:t>
             </w:r>
           </w:p>
         </w:tc>
         <w:tc>
           <w:tcPr>
-            <w:tcW w:type="dxa" w:w="2592"/>
+            <w:tcW w:type="dxa" w:w="3888"/>
             <w:vAlign w:val="center"/>
             <w:tcMar>
-              <w:top w:w="90" w:type="dxa"/>
-              <w:bottom w:w="90" w:type="dxa"/>
-              <w:left w:w="110" w:type="dxa"/>
-              <w:right w:w="110" w:type="dxa"/>
+              <w:top w:w="80" w:type="dxa"/>
+              <w:bottom w:w="80" w:type="dxa"/>
+              <w:left w:w="100" w:type="dxa"/>
+              <w:right w:w="100" w:type="dxa"/>
             </w:tcMar>
-            <w:shd w:fill="FFFFFF"/>
+            <w:shd w:fill="F0FDF4"/>
           </w:tcPr>
           <w:p>
             <w:pPr>
               <w:spacing w:after="0"/>
-              <w:jc w:val="center"/>
+            </w:pPr>
+            <w:r>
+              <w:rPr>
+                <w:color w:val="1E293B"/>
+                <w:sz w:val="17"/>
+              </w:rPr>
+              <w:t>Automated Year-End Unused Leave Cash Conversion Ledger &amp; Reserve Liability Forecast</w:t>
+            </w:r>
+          </w:p>
+        </w:tc>
+      </w:tr>
+      <w:tr>
+        <w:tc>
+          <w:tcPr>
+            <w:tcW w:type="dxa" w:w="2880"/>
+            <w:vAlign w:val="center"/>
+            <w:tcMar>
+              <w:top w:w="80" w:type="dxa"/>
+              <w:bottom w:w="80" w:type="dxa"/>
+              <w:left w:w="100" w:type="dxa"/>
+              <w:right w:w="100" w:type="dxa"/>
+            </w:tcMar>
+            <w:shd w:fill="F8FAFC"/>
+          </w:tcPr>
+          <w:p>
+            <w:pPr>
+              <w:spacing w:after="0"/>
             </w:pPr>
             <w:r>
               <w:rPr>
@@ -567,48 +614,19 @@
                 <w:color w:val="0F2744"/>
                 <w:sz w:val="17"/>
               </w:rPr>
-              <w:t>Included</w:t>
+              <w:t>Workforce Scheduling</w:t>
             </w:r>
           </w:p>
         </w:tc>
         <w:tc>
           <w:tcPr>
-            <w:tcW w:type="dxa" w:w="2880"/>
+            <w:tcW w:type="dxa" w:w="3600"/>
             <w:vAlign w:val="center"/>
             <w:tcMar>
-              <w:top w:w="90" w:type="dxa"/>
-              <w:bottom w:w="90" w:type="dxa"/>
-              <w:left w:w="110" w:type="dxa"/>
-              <w:right w:w="110" w:type="dxa"/>
-            </w:tcMar>
-            <w:shd w:fill="FFFFFF"/>
-          </w:tcPr>
-          <w:p>
-            <w:pPr>
-              <w:spacing w:after="0"/>
-              <w:jc w:val="center"/>
-            </w:pPr>
-            <w:r>
-              <w:rPr>
-                <w:b/>
-                <w:color w:val="0F2744"/>
-                <w:sz w:val="17"/>
-              </w:rPr>
-              <w:t>Included</w:t>
-            </w:r>
-          </w:p>
-        </w:tc>
-      </w:tr>
-      <w:tr>
-        <w:tc>
-          <w:tcPr>
-            <w:tcW w:type="dxa" w:w="4896"/>
-            <w:vAlign w:val="center"/>
-            <w:tcMar>
-              <w:top w:w="90" w:type="dxa"/>
-              <w:bottom w:w="90" w:type="dxa"/>
-              <w:left w:w="110" w:type="dxa"/>
-              <w:right w:w="110" w:type="dxa"/>
+              <w:top w:w="80" w:type="dxa"/>
+              <w:bottom w:w="80" w:type="dxa"/>
+              <w:left w:w="100" w:type="dxa"/>
+              <w:right w:w="100" w:type="dxa"/>
             </w:tcMar>
             <w:shd w:fill="F8FAFC"/>
           </w:tcPr>
@@ -621,26 +639,52 @@
                 <w:color w:val="1E293B"/>
                 <w:sz w:val="17"/>
               </w:rPr>
-              <w:t>Managing Partner Filing On Behalf of Any Employee</w:t>
+              <w:t>Standard List View by Department</w:t>
             </w:r>
           </w:p>
         </w:tc>
         <w:tc>
           <w:tcPr>
-            <w:tcW w:type="dxa" w:w="2592"/>
+            <w:tcW w:type="dxa" w:w="3888"/>
             <w:vAlign w:val="center"/>
             <w:tcMar>
-              <w:top w:w="90" w:type="dxa"/>
-              <w:bottom w:w="90" w:type="dxa"/>
-              <w:left w:w="110" w:type="dxa"/>
-              <w:right w:w="110" w:type="dxa"/>
+              <w:top w:w="80" w:type="dxa"/>
+              <w:bottom w:w="80" w:type="dxa"/>
+              <w:left w:w="100" w:type="dxa"/>
+              <w:right w:w="100" w:type="dxa"/>
             </w:tcMar>
-            <w:shd w:fill="F8FAFC"/>
+            <w:shd w:fill="F0FDF4"/>
           </w:tcPr>
           <w:p>
             <w:pPr>
               <w:spacing w:after="0"/>
-              <w:jc w:val="center"/>
+            </w:pPr>
+            <w:r>
+              <w:rPr>
+                <w:color w:val="1E293B"/>
+                <w:sz w:val="17"/>
+              </w:rPr>
+              <w:t>Interactive Multi-Department Absence Calendar with Real-Time Availability Sync</w:t>
+            </w:r>
+          </w:p>
+        </w:tc>
+      </w:tr>
+      <w:tr>
+        <w:tc>
+          <w:tcPr>
+            <w:tcW w:type="dxa" w:w="2880"/>
+            <w:vAlign w:val="center"/>
+            <w:tcMar>
+              <w:top w:w="80" w:type="dxa"/>
+              <w:bottom w:w="80" w:type="dxa"/>
+              <w:left w:w="100" w:type="dxa"/>
+              <w:right w:w="100" w:type="dxa"/>
+            </w:tcMar>
+            <w:shd w:fill="FFFFFF"/>
+          </w:tcPr>
+          <w:p>
+            <w:pPr>
+              <w:spacing w:after="0"/>
             </w:pPr>
             <w:r>
               <w:rPr>
@@ -648,48 +692,19 @@
                 <w:color w:val="0F2744"/>
                 <w:sz w:val="17"/>
               </w:rPr>
-              <w:t>Included</w:t>
+              <w:t>Medical Proof Verification</w:t>
             </w:r>
           </w:p>
         </w:tc>
         <w:tc>
           <w:tcPr>
-            <w:tcW w:type="dxa" w:w="2880"/>
+            <w:tcW w:type="dxa" w:w="3600"/>
             <w:vAlign w:val="center"/>
             <w:tcMar>
-              <w:top w:w="90" w:type="dxa"/>
-              <w:bottom w:w="90" w:type="dxa"/>
-              <w:left w:w="110" w:type="dxa"/>
-              <w:right w:w="110" w:type="dxa"/>
-            </w:tcMar>
-            <w:shd w:fill="F8FAFC"/>
-          </w:tcPr>
-          <w:p>
-            <w:pPr>
-              <w:spacing w:after="0"/>
-              <w:jc w:val="center"/>
-            </w:pPr>
-            <w:r>
-              <w:rPr>
-                <w:b/>
-                <w:color w:val="0F2744"/>
-                <w:sz w:val="17"/>
-              </w:rPr>
-              <w:t>Included</w:t>
-            </w:r>
-          </w:p>
-        </w:tc>
-      </w:tr>
-      <w:tr>
-        <w:tc>
-          <w:tcPr>
-            <w:tcW w:type="dxa" w:w="4896"/>
-            <w:vAlign w:val="center"/>
-            <w:tcMar>
-              <w:top w:w="90" w:type="dxa"/>
-              <w:bottom w:w="90" w:type="dxa"/>
-              <w:left w:w="110" w:type="dxa"/>
-              <w:right w:w="110" w:type="dxa"/>
+              <w:top w:w="80" w:type="dxa"/>
+              <w:bottom w:w="80" w:type="dxa"/>
+              <w:left w:w="100" w:type="dxa"/>
+              <w:right w:w="100" w:type="dxa"/>
             </w:tcMar>
             <w:shd w:fill="FFFFFF"/>
           </w:tcPr>
@@ -702,26 +717,52 @@
                 <w:color w:val="1E293B"/>
                 <w:sz w:val="17"/>
               </w:rPr>
-              <w:t>Clean Leave Application Details &amp; Partner Status Modal</w:t>
+              <w:t>Manual Physical Copy Verification</w:t>
             </w:r>
           </w:p>
         </w:tc>
         <w:tc>
           <w:tcPr>
-            <w:tcW w:type="dxa" w:w="2592"/>
+            <w:tcW w:type="dxa" w:w="3888"/>
             <w:vAlign w:val="center"/>
             <w:tcMar>
-              <w:top w:w="90" w:type="dxa"/>
-              <w:bottom w:w="90" w:type="dxa"/>
-              <w:left w:w="110" w:type="dxa"/>
-              <w:right w:w="110" w:type="dxa"/>
+              <w:top w:w="80" w:type="dxa"/>
+              <w:bottom w:w="80" w:type="dxa"/>
+              <w:left w:w="100" w:type="dxa"/>
+              <w:right w:w="100" w:type="dxa"/>
             </w:tcMar>
-            <w:shd w:fill="FFFFFF"/>
+            <w:shd w:fill="F0FDF4"/>
           </w:tcPr>
           <w:p>
             <w:pPr>
               <w:spacing w:after="0"/>
-              <w:jc w:val="center"/>
+            </w:pPr>
+            <w:r>
+              <w:rPr>
+                <w:color w:val="1E293B"/>
+                <w:sz w:val="17"/>
+              </w:rPr>
+              <w:t>In-App Medical Certificate &amp; Document Proof Uploader &amp; 1-Click Viewer</w:t>
+            </w:r>
+          </w:p>
+        </w:tc>
+      </w:tr>
+      <w:tr>
+        <w:tc>
+          <w:tcPr>
+            <w:tcW w:type="dxa" w:w="2880"/>
+            <w:vAlign w:val="center"/>
+            <w:tcMar>
+              <w:top w:w="80" w:type="dxa"/>
+              <w:bottom w:w="80" w:type="dxa"/>
+              <w:left w:w="100" w:type="dxa"/>
+              <w:right w:w="100" w:type="dxa"/>
+            </w:tcMar>
+            <w:shd w:fill="F8FAFC"/>
+          </w:tcPr>
+          <w:p>
+            <w:pPr>
+              <w:spacing w:after="0"/>
             </w:pPr>
             <w:r>
               <w:rPr>
@@ -729,48 +770,19 @@
                 <w:color w:val="0F2744"/>
                 <w:sz w:val="17"/>
               </w:rPr>
-              <w:t>Included</w:t>
+              <w:t>Compliance &amp; Audit Trails</w:t>
             </w:r>
           </w:p>
         </w:tc>
         <w:tc>
           <w:tcPr>
-            <w:tcW w:type="dxa" w:w="2880"/>
+            <w:tcW w:type="dxa" w:w="3600"/>
             <w:vAlign w:val="center"/>
             <w:tcMar>
-              <w:top w:w="90" w:type="dxa"/>
-              <w:bottom w:w="90" w:type="dxa"/>
-              <w:left w:w="110" w:type="dxa"/>
-              <w:right w:w="110" w:type="dxa"/>
-            </w:tcMar>
-            <w:shd w:fill="FFFFFF"/>
-          </w:tcPr>
-          <w:p>
-            <w:pPr>
-              <w:spacing w:after="0"/>
-              <w:jc w:val="center"/>
-            </w:pPr>
-            <w:r>
-              <w:rPr>
-                <w:b/>
-                <w:color w:val="0F2744"/>
-                <w:sz w:val="17"/>
-              </w:rPr>
-              <w:t>Included</w:t>
-            </w:r>
-          </w:p>
-        </w:tc>
-      </w:tr>
-      <w:tr>
-        <w:tc>
-          <w:tcPr>
-            <w:tcW w:type="dxa" w:w="4896"/>
-            <w:vAlign w:val="center"/>
-            <w:tcMar>
-              <w:top w:w="90" w:type="dxa"/>
-              <w:bottom w:w="90" w:type="dxa"/>
-              <w:left w:w="110" w:type="dxa"/>
-              <w:right w:w="110" w:type="dxa"/>
+              <w:top w:w="80" w:type="dxa"/>
+              <w:bottom w:w="80" w:type="dxa"/>
+              <w:left w:w="100" w:type="dxa"/>
+              <w:right w:w="100" w:type="dxa"/>
             </w:tcMar>
             <w:shd w:fill="F8FAFC"/>
           </w:tcPr>
@@ -783,60 +795,32 @@
                 <w:color w:val="1E293B"/>
                 <w:sz w:val="17"/>
               </w:rPr>
-              <w:t>Automated Formatted Payroll CSV Export (JuanTax / Sprout / QuickBooks)</w:t>
+              <w:t>Standard Transaction Records</w:t>
             </w:r>
           </w:p>
         </w:tc>
         <w:tc>
           <w:tcPr>
-            <w:tcW w:type="dxa" w:w="2592"/>
+            <w:tcW w:type="dxa" w:w="3888"/>
             <w:vAlign w:val="center"/>
             <w:tcMar>
-              <w:top w:w="90" w:type="dxa"/>
-              <w:bottom w:w="90" w:type="dxa"/>
-              <w:left w:w="110" w:type="dxa"/>
-              <w:right w:w="110" w:type="dxa"/>
-            </w:tcMar>
-            <w:shd w:fill="F8FAFC"/>
-          </w:tcPr>
-          <w:p>
-            <w:pPr>
-              <w:spacing w:after="0"/>
-              <w:jc w:val="center"/>
-            </w:pPr>
-            <w:r>
-              <w:rPr>
-                <w:color w:val="64748B"/>
-                <w:sz w:val="17"/>
-              </w:rPr>
-              <w:t>—</w:t>
-            </w:r>
-          </w:p>
-        </w:tc>
-        <w:tc>
-          <w:tcPr>
-            <w:tcW w:type="dxa" w:w="2880"/>
-            <w:vAlign w:val="center"/>
-            <w:tcMar>
-              <w:top w:w="90" w:type="dxa"/>
-              <w:bottom w:w="90" w:type="dxa"/>
-              <w:left w:w="110" w:type="dxa"/>
-              <w:right w:w="110" w:type="dxa"/>
+              <w:top w:w="80" w:type="dxa"/>
+              <w:bottom w:w="80" w:type="dxa"/>
+              <w:left w:w="100" w:type="dxa"/>
+              <w:right w:w="100" w:type="dxa"/>
             </w:tcMar>
             <w:shd w:fill="F0FDF4"/>
           </w:tcPr>
           <w:p>
             <w:pPr>
               <w:spacing w:after="0"/>
-              <w:jc w:val="center"/>
             </w:pPr>
             <w:r>
               <w:rPr>
-                <w:b/>
-                <w:color w:val="10B981"/>
+                <w:color w:val="1E293B"/>
                 <w:sz w:val="17"/>
               </w:rPr>
-              <w:t>INCLUDED (One-Click Sync)</w:t>
+              <w:t>Immutable Enterprise Audit Trail with IP Tracking, User Identification, and Timestamps</w:t>
             </w:r>
           </w:p>
         </w:tc>
@@ -844,13 +828,39 @@
       <w:tr>
         <w:tc>
           <w:tcPr>
-            <w:tcW w:type="dxa" w:w="4896"/>
+            <w:tcW w:type="dxa" w:w="2880"/>
             <w:vAlign w:val="center"/>
             <w:tcMar>
-              <w:top w:w="90" w:type="dxa"/>
-              <w:bottom w:w="90" w:type="dxa"/>
-              <w:left w:w="110" w:type="dxa"/>
-              <w:right w:w="110" w:type="dxa"/>
+              <w:top w:w="80" w:type="dxa"/>
+              <w:bottom w:w="80" w:type="dxa"/>
+              <w:left w:w="100" w:type="dxa"/>
+              <w:right w:w="100" w:type="dxa"/>
+            </w:tcMar>
+            <w:shd w:fill="FFFFFF"/>
+          </w:tcPr>
+          <w:p>
+            <w:pPr>
+              <w:spacing w:after="0"/>
+            </w:pPr>
+            <w:r>
+              <w:rPr>
+                <w:b/>
+                <w:color w:val="0F2744"/>
+                <w:sz w:val="17"/>
+              </w:rPr>
+              <w:t>System Notifications</w:t>
+            </w:r>
+          </w:p>
+        </w:tc>
+        <w:tc>
+          <w:tcPr>
+            <w:tcW w:type="dxa" w:w="3600"/>
+            <w:vAlign w:val="center"/>
+            <w:tcMar>
+              <w:top w:w="80" w:type="dxa"/>
+              <w:bottom w:w="80" w:type="dxa"/>
+              <w:left w:w="100" w:type="dxa"/>
+              <w:right w:w="100" w:type="dxa"/>
             </w:tcMar>
             <w:shd w:fill="FFFFFF"/>
           </w:tcPr>
@@ -863,60 +873,32 @@
                 <w:color w:val="1E293B"/>
                 <w:sz w:val="17"/>
               </w:rPr>
-              <w:t>Year-End Unused Leave Cash Conversion Ledger &amp; Reserve Calculator</w:t>
+              <w:t>In-App Dashboard Notifications</w:t>
             </w:r>
           </w:p>
         </w:tc>
         <w:tc>
           <w:tcPr>
-            <w:tcW w:type="dxa" w:w="2592"/>
+            <w:tcW w:type="dxa" w:w="3888"/>
             <w:vAlign w:val="center"/>
             <w:tcMar>
-              <w:top w:w="90" w:type="dxa"/>
-              <w:bottom w:w="90" w:type="dxa"/>
-              <w:left w:w="110" w:type="dxa"/>
-              <w:right w:w="110" w:type="dxa"/>
-            </w:tcMar>
-            <w:shd w:fill="FFFFFF"/>
-          </w:tcPr>
-          <w:p>
-            <w:pPr>
-              <w:spacing w:after="0"/>
-              <w:jc w:val="center"/>
-            </w:pPr>
-            <w:r>
-              <w:rPr>
-                <w:color w:val="64748B"/>
-                <w:sz w:val="17"/>
-              </w:rPr>
-              <w:t>—</w:t>
-            </w:r>
-          </w:p>
-        </w:tc>
-        <w:tc>
-          <w:tcPr>
-            <w:tcW w:type="dxa" w:w="2880"/>
-            <w:vAlign w:val="center"/>
-            <w:tcMar>
-              <w:top w:w="90" w:type="dxa"/>
-              <w:bottom w:w="90" w:type="dxa"/>
-              <w:left w:w="110" w:type="dxa"/>
-              <w:right w:w="110" w:type="dxa"/>
+              <w:top w:w="80" w:type="dxa"/>
+              <w:bottom w:w="80" w:type="dxa"/>
+              <w:left w:w="100" w:type="dxa"/>
+              <w:right w:w="100" w:type="dxa"/>
             </w:tcMar>
             <w:shd w:fill="F0FDF4"/>
           </w:tcPr>
           <w:p>
             <w:pPr>
               <w:spacing w:after="0"/>
-              <w:jc w:val="center"/>
             </w:pPr>
             <w:r>
               <w:rPr>
-                <w:b/>
-                <w:color w:val="10B981"/>
+                <w:color w:val="1E293B"/>
                 <w:sz w:val="17"/>
               </w:rPr>
-              <w:t>INCLUDED (Live Liability Forecast)</w:t>
+              <w:t>Automated Real-Time Transactional Email Alerts for Submissions, Approvals, and Rejections</w:t>
             </w:r>
           </w:p>
         </w:tc>
@@ -924,13 +906,39 @@
       <w:tr>
         <w:tc>
           <w:tcPr>
-            <w:tcW w:type="dxa" w:w="4896"/>
+            <w:tcW w:type="dxa" w:w="2880"/>
             <w:vAlign w:val="center"/>
             <w:tcMar>
-              <w:top w:w="90" w:type="dxa"/>
-              <w:bottom w:w="90" w:type="dxa"/>
-              <w:left w:w="110" w:type="dxa"/>
-              <w:right w:w="110" w:type="dxa"/>
+              <w:top w:w="80" w:type="dxa"/>
+              <w:bottom w:w="80" w:type="dxa"/>
+              <w:left w:w="100" w:type="dxa"/>
+              <w:right w:w="100" w:type="dxa"/>
+            </w:tcMar>
+            <w:shd w:fill="F8FAFC"/>
+          </w:tcPr>
+          <w:p>
+            <w:pPr>
+              <w:spacing w:after="0"/>
+            </w:pPr>
+            <w:r>
+              <w:rPr>
+                <w:b/>
+                <w:color w:val="0F2744"/>
+                <w:sz w:val="17"/>
+              </w:rPr>
+              <w:t>Calendar &amp; Working Days</w:t>
+            </w:r>
+          </w:p>
+        </w:tc>
+        <w:tc>
+          <w:tcPr>
+            <w:tcW w:type="dxa" w:w="3600"/>
+            <w:vAlign w:val="center"/>
+            <w:tcMar>
+              <w:top w:w="80" w:type="dxa"/>
+              <w:bottom w:w="80" w:type="dxa"/>
+              <w:left w:w="100" w:type="dxa"/>
+              <w:right w:w="100" w:type="dxa"/>
             </w:tcMar>
             <w:shd w:fill="F8FAFC"/>
           </w:tcPr>
@@ -943,60 +951,32 @@
                 <w:color w:val="1E293B"/>
                 <w:sz w:val="17"/>
               </w:rPr>
-              <w:t>Interactive Multi-Department Absence Calendar &amp; Schedule Sync</w:t>
+              <w:t>Standard Consecutive Calendar Days</w:t>
             </w:r>
           </w:p>
         </w:tc>
         <w:tc>
           <w:tcPr>
-            <w:tcW w:type="dxa" w:w="2592"/>
+            <w:tcW w:type="dxa" w:w="3888"/>
             <w:vAlign w:val="center"/>
             <w:tcMar>
-              <w:top w:w="90" w:type="dxa"/>
-              <w:bottom w:w="90" w:type="dxa"/>
-              <w:left w:w="110" w:type="dxa"/>
-              <w:right w:w="110" w:type="dxa"/>
-            </w:tcMar>
-            <w:shd w:fill="F8FAFC"/>
-          </w:tcPr>
-          <w:p>
-            <w:pPr>
-              <w:spacing w:after="0"/>
-              <w:jc w:val="center"/>
-            </w:pPr>
-            <w:r>
-              <w:rPr>
-                <w:color w:val="64748B"/>
-                <w:sz w:val="17"/>
-              </w:rPr>
-              <w:t>—</w:t>
-            </w:r>
-          </w:p>
-        </w:tc>
-        <w:tc>
-          <w:tcPr>
-            <w:tcW w:type="dxa" w:w="2880"/>
-            <w:vAlign w:val="center"/>
-            <w:tcMar>
-              <w:top w:w="90" w:type="dxa"/>
-              <w:bottom w:w="90" w:type="dxa"/>
-              <w:left w:w="110" w:type="dxa"/>
-              <w:right w:w="110" w:type="dxa"/>
+              <w:top w:w="80" w:type="dxa"/>
+              <w:bottom w:w="80" w:type="dxa"/>
+              <w:left w:w="100" w:type="dxa"/>
+              <w:right w:w="100" w:type="dxa"/>
             </w:tcMar>
             <w:shd w:fill="F0FDF4"/>
           </w:tcPr>
           <w:p>
             <w:pPr>
               <w:spacing w:after="0"/>
-              <w:jc w:val="center"/>
             </w:pPr>
             <w:r>
               <w:rPr>
-                <w:b/>
-                <w:color w:val="10B981"/>
+                <w:color w:val="1E293B"/>
                 <w:sz w:val="17"/>
               </w:rPr>
-              <w:t>INCLUDED (Visual Schedule)</w:t>
+              <w:t>Automated Intelligence Engine (Auto-Excludes Weekends &amp; Official Regular/Special Holidays)</w:t>
             </w:r>
           </w:p>
         </w:tc>
@@ -1004,13 +984,39 @@
       <w:tr>
         <w:tc>
           <w:tcPr>
-            <w:tcW w:type="dxa" w:w="4896"/>
+            <w:tcW w:type="dxa" w:w="2880"/>
             <w:vAlign w:val="center"/>
             <w:tcMar>
-              <w:top w:w="90" w:type="dxa"/>
-              <w:bottom w:w="90" w:type="dxa"/>
-              <w:left w:w="110" w:type="dxa"/>
-              <w:right w:w="110" w:type="dxa"/>
+              <w:top w:w="80" w:type="dxa"/>
+              <w:bottom w:w="80" w:type="dxa"/>
+              <w:left w:w="100" w:type="dxa"/>
+              <w:right w:w="100" w:type="dxa"/>
+            </w:tcMar>
+            <w:shd w:fill="FFFFFF"/>
+          </w:tcPr>
+          <w:p>
+            <w:pPr>
+              <w:spacing w:after="0"/>
+            </w:pPr>
+            <w:r>
+              <w:rPr>
+                <w:b/>
+                <w:color w:val="0F2744"/>
+                <w:sz w:val="17"/>
+              </w:rPr>
+              <w:t>Peak Tax Season Governance</w:t>
+            </w:r>
+          </w:p>
+        </w:tc>
+        <w:tc>
+          <w:tcPr>
+            <w:tcW w:type="dxa" w:w="3600"/>
+            <w:vAlign w:val="center"/>
+            <w:tcMar>
+              <w:top w:w="80" w:type="dxa"/>
+              <w:bottom w:w="80" w:type="dxa"/>
+              <w:left w:w="100" w:type="dxa"/>
+              <w:right w:w="100" w:type="dxa"/>
             </w:tcMar>
             <w:shd w:fill="FFFFFF"/>
           </w:tcPr>
@@ -1023,60 +1029,32 @@
                 <w:color w:val="1E293B"/>
                 <w:sz w:val="17"/>
               </w:rPr>
-              <w:t>Medical Certificate &amp; Document Proof Upload &amp; In-App Viewer</w:t>
+              <w:t>Standard Partner Review</w:t>
             </w:r>
           </w:p>
         </w:tc>
         <w:tc>
           <w:tcPr>
-            <w:tcW w:type="dxa" w:w="2592"/>
+            <w:tcW w:type="dxa" w:w="3888"/>
             <w:vAlign w:val="center"/>
             <w:tcMar>
-              <w:top w:w="90" w:type="dxa"/>
-              <w:bottom w:w="90" w:type="dxa"/>
-              <w:left w:w="110" w:type="dxa"/>
-              <w:right w:w="110" w:type="dxa"/>
-            </w:tcMar>
-            <w:shd w:fill="FFFFFF"/>
-          </w:tcPr>
-          <w:p>
-            <w:pPr>
-              <w:spacing w:after="0"/>
-              <w:jc w:val="center"/>
-            </w:pPr>
-            <w:r>
-              <w:rPr>
-                <w:color w:val="64748B"/>
-                <w:sz w:val="17"/>
-              </w:rPr>
-              <w:t>—</w:t>
-            </w:r>
-          </w:p>
-        </w:tc>
-        <w:tc>
-          <w:tcPr>
-            <w:tcW w:type="dxa" w:w="2880"/>
-            <w:vAlign w:val="center"/>
-            <w:tcMar>
-              <w:top w:w="90" w:type="dxa"/>
-              <w:bottom w:w="90" w:type="dxa"/>
-              <w:left w:w="110" w:type="dxa"/>
-              <w:right w:w="110" w:type="dxa"/>
+              <w:top w:w="80" w:type="dxa"/>
+              <w:bottom w:w="80" w:type="dxa"/>
+              <w:left w:w="100" w:type="dxa"/>
+              <w:right w:w="100" w:type="dxa"/>
             </w:tcMar>
             <w:shd w:fill="F0FDF4"/>
           </w:tcPr>
           <w:p>
             <w:pPr>
               <w:spacing w:after="0"/>
-              <w:jc w:val="center"/>
             </w:pPr>
             <w:r>
               <w:rPr>
-                <w:b/>
-                <w:color w:val="10B981"/>
+                <w:color w:val="1E293B"/>
                 <w:sz w:val="17"/>
               </w:rPr>
-              <w:t>INCLUDED (Verification Engine)</w:t>
+              <w:t>Automated Peak Tax Season Blackout Warning &amp; Engagement Clearance Advisory Engine</w:t>
             </w:r>
           </w:p>
         </w:tc>
@@ -1084,13 +1062,39 @@
       <w:tr>
         <w:tc>
           <w:tcPr>
-            <w:tcW w:type="dxa" w:w="4896"/>
+            <w:tcW w:type="dxa" w:w="2880"/>
             <w:vAlign w:val="center"/>
             <w:tcMar>
-              <w:top w:w="90" w:type="dxa"/>
-              <w:bottom w:w="90" w:type="dxa"/>
-              <w:left w:w="110" w:type="dxa"/>
-              <w:right w:w="110" w:type="dxa"/>
+              <w:top w:w="80" w:type="dxa"/>
+              <w:bottom w:w="80" w:type="dxa"/>
+              <w:left w:w="100" w:type="dxa"/>
+              <w:right w:w="100" w:type="dxa"/>
+            </w:tcMar>
+            <w:shd w:fill="F8FAFC"/>
+          </w:tcPr>
+          <w:p>
+            <w:pPr>
+              <w:spacing w:after="0"/>
+            </w:pPr>
+            <w:r>
+              <w:rPr>
+                <w:b/>
+                <w:color w:val="0F2744"/>
+                <w:sz w:val="17"/>
+              </w:rPr>
+              <w:t>Credit Accrual &amp; Rollover</w:t>
+            </w:r>
+          </w:p>
+        </w:tc>
+        <w:tc>
+          <w:tcPr>
+            <w:tcW w:type="dxa" w:w="3600"/>
+            <w:vAlign w:val="center"/>
+            <w:tcMar>
+              <w:top w:w="80" w:type="dxa"/>
+              <w:bottom w:w="80" w:type="dxa"/>
+              <w:left w:w="100" w:type="dxa"/>
+              <w:right w:w="100" w:type="dxa"/>
             </w:tcMar>
             <w:shd w:fill="F8FAFC"/>
           </w:tcPr>
@@ -1103,60 +1107,32 @@
                 <w:color w:val="1E293B"/>
                 <w:sz w:val="17"/>
               </w:rPr>
-              <w:t>Immutable Enterprise Audit Trail with Client IP Tracking</w:t>
+              <w:t>Manual Periodic Adjustments</w:t>
             </w:r>
           </w:p>
         </w:tc>
         <w:tc>
           <w:tcPr>
-            <w:tcW w:type="dxa" w:w="2592"/>
+            <w:tcW w:type="dxa" w:w="3888"/>
             <w:vAlign w:val="center"/>
             <w:tcMar>
-              <w:top w:w="90" w:type="dxa"/>
-              <w:bottom w:w="90" w:type="dxa"/>
-              <w:left w:w="110" w:type="dxa"/>
-              <w:right w:w="110" w:type="dxa"/>
-            </w:tcMar>
-            <w:shd w:fill="F8FAFC"/>
-          </w:tcPr>
-          <w:p>
-            <w:pPr>
-              <w:spacing w:after="0"/>
-              <w:jc w:val="center"/>
-            </w:pPr>
-            <w:r>
-              <w:rPr>
-                <w:color w:val="64748B"/>
-                <w:sz w:val="17"/>
-              </w:rPr>
-              <w:t>—</w:t>
-            </w:r>
-          </w:p>
-        </w:tc>
-        <w:tc>
-          <w:tcPr>
-            <w:tcW w:type="dxa" w:w="2880"/>
-            <w:vAlign w:val="center"/>
-            <w:tcMar>
-              <w:top w:w="90" w:type="dxa"/>
-              <w:bottom w:w="90" w:type="dxa"/>
-              <w:left w:w="110" w:type="dxa"/>
-              <w:right w:w="110" w:type="dxa"/>
+              <w:top w:w="80" w:type="dxa"/>
+              <w:bottom w:w="80" w:type="dxa"/>
+              <w:left w:w="100" w:type="dxa"/>
+              <w:right w:w="100" w:type="dxa"/>
             </w:tcMar>
             <w:shd w:fill="F0FDF4"/>
           </w:tcPr>
           <w:p>
             <w:pPr>
               <w:spacing w:after="0"/>
-              <w:jc w:val="center"/>
             </w:pPr>
             <w:r>
               <w:rPr>
-                <w:b/>
-                <w:color w:val="10B981"/>
+                <w:color w:val="1E293B"/>
                 <w:sz w:val="17"/>
               </w:rPr>
-              <w:t>INCLUDED (Tamper-Proof)</w:t>
+              <w:t>Automated Monthly Accruals (+1.25d/mo) &amp; Annual Fiscal Year Rollover Engine</w:t>
             </w:r>
           </w:p>
         </w:tc>
@@ -1164,13 +1140,39 @@
       <w:tr>
         <w:tc>
           <w:tcPr>
-            <w:tcW w:type="dxa" w:w="4896"/>
+            <w:tcW w:type="dxa" w:w="2880"/>
             <w:vAlign w:val="center"/>
             <w:tcMar>
-              <w:top w:w="90" w:type="dxa"/>
-              <w:bottom w:w="90" w:type="dxa"/>
-              <w:left w:w="110" w:type="dxa"/>
-              <w:right w:w="110" w:type="dxa"/>
+              <w:top w:w="80" w:type="dxa"/>
+              <w:bottom w:w="80" w:type="dxa"/>
+              <w:left w:w="100" w:type="dxa"/>
+              <w:right w:w="100" w:type="dxa"/>
+            </w:tcMar>
+            <w:shd w:fill="FFFFFF"/>
+          </w:tcPr>
+          <w:p>
+            <w:pPr>
+              <w:spacing w:after="0"/>
+            </w:pPr>
+            <w:r>
+              <w:rPr>
+                <w:b/>
+                <w:color w:val="0F2744"/>
+                <w:sz w:val="17"/>
+              </w:rPr>
+              <w:t>Warranty &amp; SLA Support</w:t>
+            </w:r>
+          </w:p>
+        </w:tc>
+        <w:tc>
+          <w:tcPr>
+            <w:tcW w:type="dxa" w:w="3600"/>
+            <w:vAlign w:val="center"/>
+            <w:tcMar>
+              <w:top w:w="80" w:type="dxa"/>
+              <w:bottom w:w="80" w:type="dxa"/>
+              <w:left w:w="100" w:type="dxa"/>
+              <w:right w:w="100" w:type="dxa"/>
             </w:tcMar>
             <w:shd w:fill="FFFFFF"/>
           </w:tcPr>
@@ -1183,76 +1185,21 @@
                 <w:color w:val="1E293B"/>
                 <w:sz w:val="17"/>
               </w:rPr>
-              <w:t>Automated Real-Time Email Notifications &amp; Manager Alerts</w:t>
+              <w:t>60 Days Standard Maintenance Support</w:t>
             </w:r>
           </w:p>
         </w:tc>
         <w:tc>
           <w:tcPr>
-            <w:tcW w:type="dxa" w:w="2592"/>
+            <w:tcW w:type="dxa" w:w="3888"/>
             <w:vAlign w:val="center"/>
             <w:tcMar>
-              <w:top w:w="90" w:type="dxa"/>
-              <w:bottom w:w="90" w:type="dxa"/>
-              <w:left w:w="110" w:type="dxa"/>
-              <w:right w:w="110" w:type="dxa"/>
-            </w:tcMar>
-            <w:shd w:fill="FFFFFF"/>
-          </w:tcPr>
-          <w:p>
-            <w:pPr>
-              <w:spacing w:after="0"/>
-              <w:jc w:val="center"/>
-            </w:pPr>
-            <w:r>
-              <w:rPr>
-                <w:color w:val="64748B"/>
-                <w:sz w:val="17"/>
-              </w:rPr>
-              <w:t>—</w:t>
-            </w:r>
-          </w:p>
-        </w:tc>
-        <w:tc>
-          <w:tcPr>
-            <w:tcW w:type="dxa" w:w="2880"/>
-            <w:vAlign w:val="center"/>
-            <w:tcMar>
-              <w:top w:w="90" w:type="dxa"/>
-              <w:bottom w:w="90" w:type="dxa"/>
-              <w:left w:w="110" w:type="dxa"/>
-              <w:right w:w="110" w:type="dxa"/>
+              <w:top w:w="80" w:type="dxa"/>
+              <w:bottom w:w="80" w:type="dxa"/>
+              <w:left w:w="100" w:type="dxa"/>
+              <w:right w:w="100" w:type="dxa"/>
             </w:tcMar>
             <w:shd w:fill="F0FDF4"/>
-          </w:tcPr>
-          <w:p>
-            <w:pPr>
-              <w:spacing w:after="0"/>
-              <w:jc w:val="center"/>
-            </w:pPr>
-            <w:r>
-              <w:rPr>
-                <w:b/>
-                <w:color w:val="10B981"/>
-                <w:sz w:val="17"/>
-              </w:rPr>
-              <w:t>INCLUDED</w:t>
-            </w:r>
-          </w:p>
-        </w:tc>
-      </w:tr>
-      <w:tr>
-        <w:tc>
-          <w:tcPr>
-            <w:tcW w:type="dxa" w:w="4896"/>
-            <w:vAlign w:val="center"/>
-            <w:tcMar>
-              <w:top w:w="90" w:type="dxa"/>
-              <w:bottom w:w="90" w:type="dxa"/>
-              <w:left w:w="110" w:type="dxa"/>
-              <w:right w:w="110" w:type="dxa"/>
-            </w:tcMar>
-            <w:shd w:fill="F8FAFC"/>
           </w:tcPr>
           <w:p>
             <w:pPr>
@@ -1263,377 +1210,7 @@
                 <w:color w:val="1E293B"/>
                 <w:sz w:val="17"/>
               </w:rPr>
-              <w:t>Automated Holiday &amp; Working Days Exclusion Engine</w:t>
-            </w:r>
-          </w:p>
-        </w:tc>
-        <w:tc>
-          <w:tcPr>
-            <w:tcW w:type="dxa" w:w="2592"/>
-            <w:vAlign w:val="center"/>
-            <w:tcMar>
-              <w:top w:w="90" w:type="dxa"/>
-              <w:bottom w:w="90" w:type="dxa"/>
-              <w:left w:w="110" w:type="dxa"/>
-              <w:right w:w="110" w:type="dxa"/>
-            </w:tcMar>
-            <w:shd w:fill="F8FAFC"/>
-          </w:tcPr>
-          <w:p>
-            <w:pPr>
-              <w:spacing w:after="0"/>
-              <w:jc w:val="center"/>
-            </w:pPr>
-            <w:r>
-              <w:rPr>
-                <w:color w:val="64748B"/>
-                <w:sz w:val="17"/>
-              </w:rPr>
-              <w:t>—</w:t>
-            </w:r>
-          </w:p>
-        </w:tc>
-        <w:tc>
-          <w:tcPr>
-            <w:tcW w:type="dxa" w:w="2880"/>
-            <w:vAlign w:val="center"/>
-            <w:tcMar>
-              <w:top w:w="90" w:type="dxa"/>
-              <w:bottom w:w="90" w:type="dxa"/>
-              <w:left w:w="110" w:type="dxa"/>
-              <w:right w:w="110" w:type="dxa"/>
-            </w:tcMar>
-            <w:shd w:fill="F0FDF4"/>
-          </w:tcPr>
-          <w:p>
-            <w:pPr>
-              <w:spacing w:after="0"/>
-              <w:jc w:val="center"/>
-            </w:pPr>
-            <w:r>
-              <w:rPr>
-                <w:b/>
-                <w:color w:val="10B981"/>
-                <w:sz w:val="17"/>
-              </w:rPr>
-              <w:t>INCLUDED (Auto-Excludes Weekends &amp; Official Holidays)</w:t>
-            </w:r>
-          </w:p>
-        </w:tc>
-      </w:tr>
-      <w:tr>
-        <w:tc>
-          <w:tcPr>
-            <w:tcW w:type="dxa" w:w="4896"/>
-            <w:vAlign w:val="center"/>
-            <w:tcMar>
-              <w:top w:w="90" w:type="dxa"/>
-              <w:bottom w:w="90" w:type="dxa"/>
-              <w:left w:w="110" w:type="dxa"/>
-              <w:right w:w="110" w:type="dxa"/>
-            </w:tcMar>
-            <w:shd w:fill="FFFFFF"/>
-          </w:tcPr>
-          <w:p>
-            <w:pPr>
-              <w:spacing w:after="0"/>
-            </w:pPr>
-            <w:r>
-              <w:rPr>
-                <w:color w:val="1E293B"/>
-                <w:sz w:val="17"/>
-              </w:rPr>
-              <w:t>Peak Tax Season (March 15 - April 15) Blackout Warnings</w:t>
-            </w:r>
-          </w:p>
-        </w:tc>
-        <w:tc>
-          <w:tcPr>
-            <w:tcW w:type="dxa" w:w="2592"/>
-            <w:vAlign w:val="center"/>
-            <w:tcMar>
-              <w:top w:w="90" w:type="dxa"/>
-              <w:bottom w:w="90" w:type="dxa"/>
-              <w:left w:w="110" w:type="dxa"/>
-              <w:right w:w="110" w:type="dxa"/>
-            </w:tcMar>
-            <w:shd w:fill="FFFFFF"/>
-          </w:tcPr>
-          <w:p>
-            <w:pPr>
-              <w:spacing w:after="0"/>
-              <w:jc w:val="center"/>
-            </w:pPr>
-            <w:r>
-              <w:rPr>
-                <w:color w:val="64748B"/>
-                <w:sz w:val="17"/>
-              </w:rPr>
-              <w:t>—</w:t>
-            </w:r>
-          </w:p>
-        </w:tc>
-        <w:tc>
-          <w:tcPr>
-            <w:tcW w:type="dxa" w:w="2880"/>
-            <w:vAlign w:val="center"/>
-            <w:tcMar>
-              <w:top w:w="90" w:type="dxa"/>
-              <w:bottom w:w="90" w:type="dxa"/>
-              <w:left w:w="110" w:type="dxa"/>
-              <w:right w:w="110" w:type="dxa"/>
-            </w:tcMar>
-            <w:shd w:fill="F0FDF4"/>
-          </w:tcPr>
-          <w:p>
-            <w:pPr>
-              <w:spacing w:after="0"/>
-              <w:jc w:val="center"/>
-            </w:pPr>
-            <w:r>
-              <w:rPr>
-                <w:b/>
-                <w:color w:val="10B981"/>
-                <w:sz w:val="17"/>
-              </w:rPr>
-              <w:t>INCLUDED (Client Engagement Protection)</w:t>
-            </w:r>
-          </w:p>
-        </w:tc>
-      </w:tr>
-      <w:tr>
-        <w:tc>
-          <w:tcPr>
-            <w:tcW w:type="dxa" w:w="4896"/>
-            <w:vAlign w:val="center"/>
-            <w:tcMar>
-              <w:top w:w="90" w:type="dxa"/>
-              <w:bottom w:w="90" w:type="dxa"/>
-              <w:left w:w="110" w:type="dxa"/>
-              <w:right w:w="110" w:type="dxa"/>
-            </w:tcMar>
-            <w:shd w:fill="F8FAFC"/>
-          </w:tcPr>
-          <w:p>
-            <w:pPr>
-              <w:spacing w:after="0"/>
-            </w:pPr>
-            <w:r>
-              <w:rPr>
-                <w:color w:val="1E293B"/>
-                <w:sz w:val="17"/>
-              </w:rPr>
-              <w:t>Administrative Accrual Engine (+1.25d/mo &amp; Annual Rollover)</w:t>
-            </w:r>
-          </w:p>
-        </w:tc>
-        <w:tc>
-          <w:tcPr>
-            <w:tcW w:type="dxa" w:w="2592"/>
-            <w:vAlign w:val="center"/>
-            <w:tcMar>
-              <w:top w:w="90" w:type="dxa"/>
-              <w:bottom w:w="90" w:type="dxa"/>
-              <w:left w:w="110" w:type="dxa"/>
-              <w:right w:w="110" w:type="dxa"/>
-            </w:tcMar>
-            <w:shd w:fill="F8FAFC"/>
-          </w:tcPr>
-          <w:p>
-            <w:pPr>
-              <w:spacing w:after="0"/>
-              <w:jc w:val="center"/>
-            </w:pPr>
-            <w:r>
-              <w:rPr>
-                <w:color w:val="64748B"/>
-                <w:sz w:val="17"/>
-              </w:rPr>
-              <w:t>—</w:t>
-            </w:r>
-          </w:p>
-        </w:tc>
-        <w:tc>
-          <w:tcPr>
-            <w:tcW w:type="dxa" w:w="2880"/>
-            <w:vAlign w:val="center"/>
-            <w:tcMar>
-              <w:top w:w="90" w:type="dxa"/>
-              <w:bottom w:w="90" w:type="dxa"/>
-              <w:left w:w="110" w:type="dxa"/>
-              <w:right w:w="110" w:type="dxa"/>
-            </w:tcMar>
-            <w:shd w:fill="F0FDF4"/>
-          </w:tcPr>
-          <w:p>
-            <w:pPr>
-              <w:spacing w:after="0"/>
-              <w:jc w:val="center"/>
-            </w:pPr>
-            <w:r>
-              <w:rPr>
-                <w:b/>
-                <w:color w:val="10B981"/>
-                <w:sz w:val="17"/>
-              </w:rPr>
-              <w:t>INCLUDED</w:t>
-            </w:r>
-          </w:p>
-        </w:tc>
-      </w:tr>
-      <w:tr>
-        <w:tc>
-          <w:tcPr>
-            <w:tcW w:type="dxa" w:w="4896"/>
-            <w:vAlign w:val="center"/>
-            <w:tcMar>
-              <w:top w:w="90" w:type="dxa"/>
-              <w:bottom w:w="90" w:type="dxa"/>
-              <w:left w:w="110" w:type="dxa"/>
-              <w:right w:w="110" w:type="dxa"/>
-            </w:tcMar>
-            <w:shd w:fill="FFFFFF"/>
-          </w:tcPr>
-          <w:p>
-            <w:pPr>
-              <w:spacing w:after="0"/>
-            </w:pPr>
-            <w:r>
-              <w:rPr>
-                <w:color w:val="1E293B"/>
-                <w:sz w:val="17"/>
-              </w:rPr>
-              <w:t>Extended Statutory Category Pack (Solo Parent, Maternity, Paternity, etc.)</w:t>
-            </w:r>
-          </w:p>
-        </w:tc>
-        <w:tc>
-          <w:tcPr>
-            <w:tcW w:type="dxa" w:w="2592"/>
-            <w:vAlign w:val="center"/>
-            <w:tcMar>
-              <w:top w:w="90" w:type="dxa"/>
-              <w:bottom w:w="90" w:type="dxa"/>
-              <w:left w:w="110" w:type="dxa"/>
-              <w:right w:w="110" w:type="dxa"/>
-            </w:tcMar>
-            <w:shd w:fill="FFFFFF"/>
-          </w:tcPr>
-          <w:p>
-            <w:pPr>
-              <w:spacing w:after="0"/>
-              <w:jc w:val="center"/>
-            </w:pPr>
-            <w:r>
-              <w:rPr>
-                <w:color w:val="64748B"/>
-                <w:sz w:val="17"/>
-              </w:rPr>
-              <w:t>—</w:t>
-            </w:r>
-          </w:p>
-        </w:tc>
-        <w:tc>
-          <w:tcPr>
-            <w:tcW w:type="dxa" w:w="2880"/>
-            <w:vAlign w:val="center"/>
-            <w:tcMar>
-              <w:top w:w="90" w:type="dxa"/>
-              <w:bottom w:w="90" w:type="dxa"/>
-              <w:left w:w="110" w:type="dxa"/>
-              <w:right w:w="110" w:type="dxa"/>
-            </w:tcMar>
-            <w:shd w:fill="F0FDF4"/>
-          </w:tcPr>
-          <w:p>
-            <w:pPr>
-              <w:spacing w:after="0"/>
-              <w:jc w:val="center"/>
-            </w:pPr>
-            <w:r>
-              <w:rPr>
-                <w:b/>
-                <w:color w:val="10B981"/>
-                <w:sz w:val="17"/>
-              </w:rPr>
-              <w:t>INCLUDED (Full Category Suite)</w:t>
-            </w:r>
-          </w:p>
-        </w:tc>
-      </w:tr>
-      <w:tr>
-        <w:tc>
-          <w:tcPr>
-            <w:tcW w:type="dxa" w:w="4896"/>
-            <w:vAlign w:val="center"/>
-            <w:tcMar>
-              <w:top w:w="90" w:type="dxa"/>
-              <w:bottom w:w="90" w:type="dxa"/>
-              <w:left w:w="110" w:type="dxa"/>
-              <w:right w:w="110" w:type="dxa"/>
-            </w:tcMar>
-            <w:shd w:fill="F8FAFC"/>
-          </w:tcPr>
-          <w:p>
-            <w:pPr>
-              <w:spacing w:after="0"/>
-            </w:pPr>
-            <w:r>
-              <w:rPr>
-                <w:color w:val="1E293B"/>
-                <w:sz w:val="17"/>
-              </w:rPr>
-              <w:t>Warranty &amp; SLA Support Period</w:t>
-            </w:r>
-          </w:p>
-        </w:tc>
-        <w:tc>
-          <w:tcPr>
-            <w:tcW w:type="dxa" w:w="2592"/>
-            <w:vAlign w:val="center"/>
-            <w:tcMar>
-              <w:top w:w="90" w:type="dxa"/>
-              <w:bottom w:w="90" w:type="dxa"/>
-              <w:left w:w="110" w:type="dxa"/>
-              <w:right w:w="110" w:type="dxa"/>
-            </w:tcMar>
-            <w:shd w:fill="F8FAFC"/>
-          </w:tcPr>
-          <w:p>
-            <w:pPr>
-              <w:spacing w:after="0"/>
-              <w:jc w:val="center"/>
-            </w:pPr>
-            <w:r>
-              <w:rPr>
-                <w:sz w:val="17"/>
-              </w:rPr>
-              <w:t>60 Days Standard</w:t>
-            </w:r>
-          </w:p>
-        </w:tc>
-        <w:tc>
-          <w:tcPr>
-            <w:tcW w:type="dxa" w:w="2880"/>
-            <w:vAlign w:val="center"/>
-            <w:tcMar>
-              <w:top w:w="90" w:type="dxa"/>
-              <w:bottom w:w="90" w:type="dxa"/>
-              <w:left w:w="110" w:type="dxa"/>
-              <w:right w:w="110" w:type="dxa"/>
-            </w:tcMar>
-            <w:shd w:fill="F8FAFC"/>
-          </w:tcPr>
-          <w:p>
-            <w:pPr>
-              <w:spacing w:after="0"/>
-              <w:jc w:val="center"/>
-            </w:pPr>
-            <w:r>
-              <w:rPr>
-                <w:sz w:val="17"/>
-              </w:rPr>
-              <w:t>3 Months Priority SLA + Staff Training</w:t>
+              <w:t>3 Months Priority SLA Support + Live Staff Onboarding &amp; Training Session</w:t>
             </w:r>
           </w:p>
         </w:tc>

</xml_diff>

<commit_message>
Revise 75k and 85k packages with full custom software development deliverables
</commit_message>
<xml_diff>
--- a/JTYeo_CPA_Accounting_Office_Leave_Proposal.docx
+++ b/JTYeo_CPA_Accounting_Office_Leave_Proposal.docx
@@ -223,10 +223,10 @@
           <w:b/>
           <w:color w:val="0F2744"/>
         </w:rPr>
-        <w:t xml:space="preserve">Tier 1: Professional Edition (₱75,000) — </w:t>
+        <w:t xml:space="preserve">Tier 1: Core Practice Management Edition (₱75,000) — </w:t>
       </w:r>
       <w:r>
-        <w:t>Complete 5-category leave management, employee self-service balances, partner approval queue &amp; on-behalf filing, and clean leave details modal.</w:t>
+        <w:t>Full custom leave management platform, Role-Based Access Control, employee self-service balances, structured partner approvals, on-behalf proxy filing, and server deployment.</w:t>
       </w:r>
     </w:p>
     <w:p>
@@ -238,10 +238,10 @@
           <w:b/>
           <w:color w:val="0284C7"/>
         </w:rPr>
-        <w:t xml:space="preserve">Tier 2: Enterprise Suite (₱85,000) ⭐ Recommended Flagship — </w:t>
+        <w:t xml:space="preserve">Tier 2: Enterprise Practice Cloud Suite (₱85,000) ⭐ Recommended Flagship — </w:t>
       </w:r>
       <w:r>
-        <w:t>Everything in Tier 1 PLUS automated one-click payroll CSV export (JuanTax/Sprout/QuickBooks), Year-End Unused Leave Cash Conversion Ledger, Interactive Team Calendar, Medical Certificate Proof Viewer, immutable enterprise audit trails, automated email alerts, and 3 months priority SLA warranty.</w:t>
+        <w:t>Everything in Tier 1 PLUS automated 1-click payroll CSV export (JuanTax/Sprout/QuickBooks), Year-End Unused Leave Cash Conversion Ledger, Interactive Team Calendar, Medical Proof Viewer, immutable audit trails with IP tracking, automated email alerts, and 3 months priority SLA warranty.</w:t>
       </w:r>
     </w:p>
     <w:p>
@@ -294,7 +294,7 @@
                 <w:color w:val="FFFFFF"/>
                 <w:sz w:val="19"/>
               </w:rPr>
-              <w:t>System Capability</w:t>
+              <w:t>System Module &amp; Deliverable</w:t>
             </w:r>
           </w:p>
         </w:tc>
@@ -321,7 +321,7 @@
                 <w:color w:val="FFFFFF"/>
                 <w:sz w:val="19"/>
               </w:rPr>
-              <w:t>Option 1: Professional Edition</w:t>
+              <w:t>Tier 1: Core Practice Edition</w:t>
               <w:br/>
               <w:t>(₱75,000)</w:t>
             </w:r>
@@ -350,7 +350,7 @@
                 <w:color w:val="FFFFFF"/>
                 <w:sz w:val="19"/>
               </w:rPr>
-              <w:t>Option 2: Enterprise Cloud Suite</w:t>
+              <w:t>Tier 2: Enterprise Cloud Suite</w:t>
               <w:br/>
               <w:t>(₱85,000) 🏆</w:t>
             </w:r>
@@ -380,7 +380,7 @@
                 <w:color w:val="0F2744"/>
                 <w:sz w:val="17"/>
               </w:rPr>
-              <w:t>Leave Categories &amp; Policies</w:t>
+              <w:t>System Scope &amp; Purpose</w:t>
             </w:r>
           </w:p>
         </w:tc>
@@ -405,7 +405,85 @@
                 <w:color w:val="1E293B"/>
                 <w:sz w:val="17"/>
               </w:rPr>
-              <w:t>5 Core Categories (VL, SL, Emergency, Bereavement, LWOP)</w:t>
+              <w:t>Standard Practice Leave Management Software</w:t>
+            </w:r>
+          </w:p>
+        </w:tc>
+        <w:tc>
+          <w:tcPr>
+            <w:tcW w:type="dxa" w:w="3888"/>
+            <w:vAlign w:val="center"/>
+            <w:tcMar>
+              <w:top w:w="80" w:type="dxa"/>
+              <w:bottom w:w="80" w:type="dxa"/>
+              <w:left w:w="100" w:type="dxa"/>
+              <w:right w:w="100" w:type="dxa"/>
+            </w:tcMar>
+            <w:shd w:fill="F0FDF4"/>
+          </w:tcPr>
+          <w:p>
+            <w:pPr>
+              <w:spacing w:after="0"/>
+            </w:pPr>
+            <w:r>
+              <w:rPr>
+                <w:color w:val="1E293B"/>
+                <w:sz w:val="17"/>
+              </w:rPr>
+              <w:t>Full-Scale Automated Practice &amp; Compliance Suite</w:t>
+            </w:r>
+          </w:p>
+        </w:tc>
+      </w:tr>
+      <w:tr>
+        <w:tc>
+          <w:tcPr>
+            <w:tcW w:type="dxa" w:w="2880"/>
+            <w:vAlign w:val="center"/>
+            <w:tcMar>
+              <w:top w:w="80" w:type="dxa"/>
+              <w:bottom w:w="80" w:type="dxa"/>
+              <w:left w:w="100" w:type="dxa"/>
+              <w:right w:w="100" w:type="dxa"/>
+            </w:tcMar>
+            <w:shd w:fill="F8FAFC"/>
+          </w:tcPr>
+          <w:p>
+            <w:pPr>
+              <w:spacing w:after="0"/>
+            </w:pPr>
+            <w:r>
+              <w:rPr>
+                <w:b/>
+                <w:color w:val="0F2744"/>
+                <w:sz w:val="17"/>
+              </w:rPr>
+              <w:t>Leave Policy Coverage</w:t>
+            </w:r>
+          </w:p>
+        </w:tc>
+        <w:tc>
+          <w:tcPr>
+            <w:tcW w:type="dxa" w:w="3600"/>
+            <w:vAlign w:val="center"/>
+            <w:tcMar>
+              <w:top w:w="80" w:type="dxa"/>
+              <w:bottom w:w="80" w:type="dxa"/>
+              <w:left w:w="100" w:type="dxa"/>
+              <w:right w:w="100" w:type="dxa"/>
+            </w:tcMar>
+            <w:shd w:fill="F8FAFC"/>
+          </w:tcPr>
+          <w:p>
+            <w:pPr>
+              <w:spacing w:after="0"/>
+            </w:pPr>
+            <w:r>
+              <w:rPr>
+                <w:color w:val="1E293B"/>
+                <w:sz w:val="17"/>
+              </w:rPr>
+              <w:t>5 Core Firm Categories (VL, SL, Emergency, Bereavement, LWOP)</w:t>
             </w:r>
           </w:p>
         </w:tc>
@@ -446,7 +524,7 @@
               <w:left w:w="100" w:type="dxa"/>
               <w:right w:w="100" w:type="dxa"/>
             </w:tcMar>
-            <w:shd w:fill="F8FAFC"/>
+            <w:shd w:fill="FFFFFF"/>
           </w:tcPr>
           <w:p>
             <w:pPr>
@@ -458,7 +536,7 @@
                 <w:color w:val="0F2744"/>
                 <w:sz w:val="17"/>
               </w:rPr>
-              <w:t>Payroll Processing</w:t>
+              <w:t>Payroll Software Integration</w:t>
             </w:r>
           </w:p>
         </w:tc>
@@ -472,7 +550,7 @@
               <w:left w:w="100" w:type="dxa"/>
               <w:right w:w="100" w:type="dxa"/>
             </w:tcMar>
-            <w:shd w:fill="F8FAFC"/>
+            <w:shd w:fill="FFFFFF"/>
           </w:tcPr>
           <w:p>
             <w:pPr>
@@ -508,7 +586,85 @@
                 <w:color w:val="1E293B"/>
                 <w:sz w:val="17"/>
               </w:rPr>
-              <w:t>Automated 1-Click Formatted Payroll CSV Export (JuanTax, Sprout Solutions, QuickBooks, Excel)</w:t>
+              <w:t>1-Click Formatted Payroll CSV Export (JuanTax, Sprout Solutions, QuickBooks, Excel) with Auto-Deductions</w:t>
+            </w:r>
+          </w:p>
+        </w:tc>
+      </w:tr>
+      <w:tr>
+        <w:tc>
+          <w:tcPr>
+            <w:tcW w:type="dxa" w:w="2880"/>
+            <w:vAlign w:val="center"/>
+            <w:tcMar>
+              <w:top w:w="80" w:type="dxa"/>
+              <w:bottom w:w="80" w:type="dxa"/>
+              <w:left w:w="100" w:type="dxa"/>
+              <w:right w:w="100" w:type="dxa"/>
+            </w:tcMar>
+            <w:shd w:fill="F8FAFC"/>
+          </w:tcPr>
+          <w:p>
+            <w:pPr>
+              <w:spacing w:after="0"/>
+            </w:pPr>
+            <w:r>
+              <w:rPr>
+                <w:b/>
+                <w:color w:val="0F2744"/>
+                <w:sz w:val="17"/>
+              </w:rPr>
+              <w:t>Year-End Financial Reserves</w:t>
+            </w:r>
+          </w:p>
+        </w:tc>
+        <w:tc>
+          <w:tcPr>
+            <w:tcW w:type="dxa" w:w="3600"/>
+            <w:vAlign w:val="center"/>
+            <w:tcMar>
+              <w:top w:w="80" w:type="dxa"/>
+              <w:bottom w:w="80" w:type="dxa"/>
+              <w:left w:w="100" w:type="dxa"/>
+              <w:right w:w="100" w:type="dxa"/>
+            </w:tcMar>
+            <w:shd w:fill="F8FAFC"/>
+          </w:tcPr>
+          <w:p>
+            <w:pPr>
+              <w:spacing w:after="0"/>
+            </w:pPr>
+            <w:r>
+              <w:rPr>
+                <w:color w:val="1E293B"/>
+                <w:sz w:val="17"/>
+              </w:rPr>
+              <w:t>Manual Computation by Accounting Staff</w:t>
+            </w:r>
+          </w:p>
+        </w:tc>
+        <w:tc>
+          <w:tcPr>
+            <w:tcW w:type="dxa" w:w="3888"/>
+            <w:vAlign w:val="center"/>
+            <w:tcMar>
+              <w:top w:w="80" w:type="dxa"/>
+              <w:bottom w:w="80" w:type="dxa"/>
+              <w:left w:w="100" w:type="dxa"/>
+              <w:right w:w="100" w:type="dxa"/>
+            </w:tcMar>
+            <w:shd w:fill="F0FDF4"/>
+          </w:tcPr>
+          <w:p>
+            <w:pPr>
+              <w:spacing w:after="0"/>
+            </w:pPr>
+            <w:r>
+              <w:rPr>
+                <w:color w:val="1E293B"/>
+                <w:sz w:val="17"/>
+              </w:rPr>
+              <w:t>Automated Real-Time Leave Cash Conversion Ledger &amp; Annual Liability Reserve Calculator</w:t>
             </w:r>
           </w:p>
         </w:tc>
@@ -536,7 +692,7 @@
                 <w:color w:val="0F2744"/>
                 <w:sz w:val="17"/>
               </w:rPr>
-              <w:t>Annual Financial Liabilities</w:t>
+              <w:t>Team Workforce Scheduling</w:t>
             </w:r>
           </w:p>
         </w:tc>
@@ -561,7 +717,7 @@
                 <w:color w:val="1E293B"/>
                 <w:sz w:val="17"/>
               </w:rPr>
-              <w:t>Manual Computation at Year-End</w:t>
+              <w:t>Standard List Ledger by Department</w:t>
             </w:r>
           </w:p>
         </w:tc>
@@ -586,7 +742,7 @@
                 <w:color w:val="1E293B"/>
                 <w:sz w:val="17"/>
               </w:rPr>
-              <w:t>Automated Year-End Unused Leave Cash Conversion Ledger &amp; Reserve Liability Forecast</w:t>
+              <w:t>Interactive Multi-Department Absence Calendar with Visual Availability &amp; Audit Schedule Sync</w:t>
             </w:r>
           </w:p>
         </w:tc>
@@ -614,7 +770,7 @@
                 <w:color w:val="0F2744"/>
                 <w:sz w:val="17"/>
               </w:rPr>
-              <w:t>Workforce Scheduling</w:t>
+              <w:t>Document Proof Verification</w:t>
             </w:r>
           </w:p>
         </w:tc>
@@ -639,7 +795,7 @@
                 <w:color w:val="1E293B"/>
                 <w:sz w:val="17"/>
               </w:rPr>
-              <w:t>Standard List View by Department</w:t>
+              <w:t>Physical Paper Document Submission</w:t>
             </w:r>
           </w:p>
         </w:tc>
@@ -664,7 +820,7 @@
                 <w:color w:val="1E293B"/>
                 <w:sz w:val="17"/>
               </w:rPr>
-              <w:t>Interactive Multi-Department Absence Calendar with Real-Time Availability Sync</w:t>
+              <w:t>In-App Medical Certificate &amp; Document Proof Uploader &amp; 1-Click Secure In-App Viewer</w:t>
             </w:r>
           </w:p>
         </w:tc>
@@ -692,7 +848,7 @@
                 <w:color w:val="0F2744"/>
                 <w:sz w:val="17"/>
               </w:rPr>
-              <w:t>Medical Proof Verification</w:t>
+              <w:t>Compliance &amp; Security Logs</w:t>
             </w:r>
           </w:p>
         </w:tc>
@@ -717,85 +873,7 @@
                 <w:color w:val="1E293B"/>
                 <w:sz w:val="17"/>
               </w:rPr>
-              <w:t>Manual Physical Copy Verification</w:t>
-            </w:r>
-          </w:p>
-        </w:tc>
-        <w:tc>
-          <w:tcPr>
-            <w:tcW w:type="dxa" w:w="3888"/>
-            <w:vAlign w:val="center"/>
-            <w:tcMar>
-              <w:top w:w="80" w:type="dxa"/>
-              <w:bottom w:w="80" w:type="dxa"/>
-              <w:left w:w="100" w:type="dxa"/>
-              <w:right w:w="100" w:type="dxa"/>
-            </w:tcMar>
-            <w:shd w:fill="F0FDF4"/>
-          </w:tcPr>
-          <w:p>
-            <w:pPr>
-              <w:spacing w:after="0"/>
-            </w:pPr>
-            <w:r>
-              <w:rPr>
-                <w:color w:val="1E293B"/>
-                <w:sz w:val="17"/>
-              </w:rPr>
-              <w:t>In-App Medical Certificate &amp; Document Proof Uploader &amp; 1-Click Viewer</w:t>
-            </w:r>
-          </w:p>
-        </w:tc>
-      </w:tr>
-      <w:tr>
-        <w:tc>
-          <w:tcPr>
-            <w:tcW w:type="dxa" w:w="2880"/>
-            <w:vAlign w:val="center"/>
-            <w:tcMar>
-              <w:top w:w="80" w:type="dxa"/>
-              <w:bottom w:w="80" w:type="dxa"/>
-              <w:left w:w="100" w:type="dxa"/>
-              <w:right w:w="100" w:type="dxa"/>
-            </w:tcMar>
-            <w:shd w:fill="F8FAFC"/>
-          </w:tcPr>
-          <w:p>
-            <w:pPr>
-              <w:spacing w:after="0"/>
-            </w:pPr>
-            <w:r>
-              <w:rPr>
-                <w:b/>
-                <w:color w:val="0F2744"/>
-                <w:sz w:val="17"/>
-              </w:rPr>
-              <w:t>Compliance &amp; Audit Trails</w:t>
-            </w:r>
-          </w:p>
-        </w:tc>
-        <w:tc>
-          <w:tcPr>
-            <w:tcW w:type="dxa" w:w="3600"/>
-            <w:vAlign w:val="center"/>
-            <w:tcMar>
-              <w:top w:w="80" w:type="dxa"/>
-              <w:bottom w:w="80" w:type="dxa"/>
-              <w:left w:w="100" w:type="dxa"/>
-              <w:right w:w="100" w:type="dxa"/>
-            </w:tcMar>
-            <w:shd w:fill="F8FAFC"/>
-          </w:tcPr>
-          <w:p>
-            <w:pPr>
-              <w:spacing w:after="0"/>
-            </w:pPr>
-            <w:r>
-              <w:rPr>
-                <w:color w:val="1E293B"/>
-                <w:sz w:val="17"/>
-              </w:rPr>
-              <w:t>Standard Transaction Records</w:t>
+              <w:t>Standard Application Database Records</w:t>
             </w:r>
           </w:p>
         </w:tc>
@@ -836,7 +914,7 @@
               <w:left w:w="100" w:type="dxa"/>
               <w:right w:w="100" w:type="dxa"/>
             </w:tcMar>
-            <w:shd w:fill="FFFFFF"/>
+            <w:shd w:fill="F8FAFC"/>
           </w:tcPr>
           <w:p>
             <w:pPr>
@@ -848,7 +926,7 @@
                 <w:color w:val="0F2744"/>
                 <w:sz w:val="17"/>
               </w:rPr>
-              <w:t>System Notifications</w:t>
+              <w:t>Automated Alerts</w:t>
             </w:r>
           </w:p>
         </w:tc>
@@ -862,7 +940,7 @@
               <w:left w:w="100" w:type="dxa"/>
               <w:right w:w="100" w:type="dxa"/>
             </w:tcMar>
-            <w:shd w:fill="FFFFFF"/>
+            <w:shd w:fill="F8FAFC"/>
           </w:tcPr>
           <w:p>
             <w:pPr>
@@ -898,7 +976,85 @@
                 <w:color w:val="1E293B"/>
                 <w:sz w:val="17"/>
               </w:rPr>
-              <w:t>Automated Real-Time Transactional Email Alerts for Submissions, Approvals, and Rejections</w:t>
+              <w:t>Real-Time Automated Transactional Email Alerts for Submissions, Approvals, and Rejections</w:t>
+            </w:r>
+          </w:p>
+        </w:tc>
+      </w:tr>
+      <w:tr>
+        <w:tc>
+          <w:tcPr>
+            <w:tcW w:type="dxa" w:w="2880"/>
+            <w:vAlign w:val="center"/>
+            <w:tcMar>
+              <w:top w:w="80" w:type="dxa"/>
+              <w:bottom w:w="80" w:type="dxa"/>
+              <w:left w:w="100" w:type="dxa"/>
+              <w:right w:w="100" w:type="dxa"/>
+            </w:tcMar>
+            <w:shd w:fill="FFFFFF"/>
+          </w:tcPr>
+          <w:p>
+            <w:pPr>
+              <w:spacing w:after="0"/>
+            </w:pPr>
+            <w:r>
+              <w:rPr>
+                <w:b/>
+                <w:color w:val="0F2744"/>
+                <w:sz w:val="17"/>
+              </w:rPr>
+              <w:t>Working Days Calculation</w:t>
+            </w:r>
+          </w:p>
+        </w:tc>
+        <w:tc>
+          <w:tcPr>
+            <w:tcW w:type="dxa" w:w="3600"/>
+            <w:vAlign w:val="center"/>
+            <w:tcMar>
+              <w:top w:w="80" w:type="dxa"/>
+              <w:bottom w:w="80" w:type="dxa"/>
+              <w:left w:w="100" w:type="dxa"/>
+              <w:right w:w="100" w:type="dxa"/>
+            </w:tcMar>
+            <w:shd w:fill="FFFFFF"/>
+          </w:tcPr>
+          <w:p>
+            <w:pPr>
+              <w:spacing w:after="0"/>
+            </w:pPr>
+            <w:r>
+              <w:rPr>
+                <w:color w:val="1E293B"/>
+                <w:sz w:val="17"/>
+              </w:rPr>
+              <w:t>Consecutive Calendar Days Math</w:t>
+            </w:r>
+          </w:p>
+        </w:tc>
+        <w:tc>
+          <w:tcPr>
+            <w:tcW w:type="dxa" w:w="3888"/>
+            <w:vAlign w:val="center"/>
+            <w:tcMar>
+              <w:top w:w="80" w:type="dxa"/>
+              <w:bottom w:w="80" w:type="dxa"/>
+              <w:left w:w="100" w:type="dxa"/>
+              <w:right w:w="100" w:type="dxa"/>
+            </w:tcMar>
+            <w:shd w:fill="F0FDF4"/>
+          </w:tcPr>
+          <w:p>
+            <w:pPr>
+              <w:spacing w:after="0"/>
+            </w:pPr>
+            <w:r>
+              <w:rPr>
+                <w:color w:val="1E293B"/>
+                <w:sz w:val="17"/>
+              </w:rPr>
+              <w:t>Automated Working Days Engine (Auto-Excludes Weekends &amp; Official Regular/Special Holidays)</w:t>
             </w:r>
           </w:p>
         </w:tc>
@@ -926,7 +1082,7 @@
                 <w:color w:val="0F2744"/>
                 <w:sz w:val="17"/>
               </w:rPr>
-              <w:t>Calendar &amp; Working Days</w:t>
+              <w:t>Tax Season Governance</w:t>
             </w:r>
           </w:p>
         </w:tc>
@@ -941,84 +1097,6 @@
               <w:right w:w="100" w:type="dxa"/>
             </w:tcMar>
             <w:shd w:fill="F8FAFC"/>
-          </w:tcPr>
-          <w:p>
-            <w:pPr>
-              <w:spacing w:after="0"/>
-            </w:pPr>
-            <w:r>
-              <w:rPr>
-                <w:color w:val="1E293B"/>
-                <w:sz w:val="17"/>
-              </w:rPr>
-              <w:t>Standard Consecutive Calendar Days</w:t>
-            </w:r>
-          </w:p>
-        </w:tc>
-        <w:tc>
-          <w:tcPr>
-            <w:tcW w:type="dxa" w:w="3888"/>
-            <w:vAlign w:val="center"/>
-            <w:tcMar>
-              <w:top w:w="80" w:type="dxa"/>
-              <w:bottom w:w="80" w:type="dxa"/>
-              <w:left w:w="100" w:type="dxa"/>
-              <w:right w:w="100" w:type="dxa"/>
-            </w:tcMar>
-            <w:shd w:fill="F0FDF4"/>
-          </w:tcPr>
-          <w:p>
-            <w:pPr>
-              <w:spacing w:after="0"/>
-            </w:pPr>
-            <w:r>
-              <w:rPr>
-                <w:color w:val="1E293B"/>
-                <w:sz w:val="17"/>
-              </w:rPr>
-              <w:t>Automated Intelligence Engine (Auto-Excludes Weekends &amp; Official Regular/Special Holidays)</w:t>
-            </w:r>
-          </w:p>
-        </w:tc>
-      </w:tr>
-      <w:tr>
-        <w:tc>
-          <w:tcPr>
-            <w:tcW w:type="dxa" w:w="2880"/>
-            <w:vAlign w:val="center"/>
-            <w:tcMar>
-              <w:top w:w="80" w:type="dxa"/>
-              <w:bottom w:w="80" w:type="dxa"/>
-              <w:left w:w="100" w:type="dxa"/>
-              <w:right w:w="100" w:type="dxa"/>
-            </w:tcMar>
-            <w:shd w:fill="FFFFFF"/>
-          </w:tcPr>
-          <w:p>
-            <w:pPr>
-              <w:spacing w:after="0"/>
-            </w:pPr>
-            <w:r>
-              <w:rPr>
-                <w:b/>
-                <w:color w:val="0F2744"/>
-                <w:sz w:val="17"/>
-              </w:rPr>
-              <w:t>Peak Tax Season Governance</w:t>
-            </w:r>
-          </w:p>
-        </w:tc>
-        <w:tc>
-          <w:tcPr>
-            <w:tcW w:type="dxa" w:w="3600"/>
-            <w:vAlign w:val="center"/>
-            <w:tcMar>
-              <w:top w:w="80" w:type="dxa"/>
-              <w:bottom w:w="80" w:type="dxa"/>
-              <w:left w:w="100" w:type="dxa"/>
-              <w:right w:w="100" w:type="dxa"/>
-            </w:tcMar>
-            <w:shd w:fill="FFFFFF"/>
           </w:tcPr>
           <w:p>
             <w:pPr>
@@ -1054,7 +1132,7 @@
                 <w:color w:val="1E293B"/>
                 <w:sz w:val="17"/>
               </w:rPr>
-              <w:t>Automated Peak Tax Season Blackout Warning &amp; Engagement Clearance Advisory Engine</w:t>
+              <w:t>Peak Tax Season Blackout Advisory Engine with Client Engagement Clearance Alerts</w:t>
             </w:r>
           </w:p>
         </w:tc>
@@ -1070,7 +1148,7 @@
               <w:left w:w="100" w:type="dxa"/>
               <w:right w:w="100" w:type="dxa"/>
             </w:tcMar>
-            <w:shd w:fill="F8FAFC"/>
+            <w:shd w:fill="FFFFFF"/>
           </w:tcPr>
           <w:p>
             <w:pPr>
@@ -1082,7 +1160,7 @@
                 <w:color w:val="0F2744"/>
                 <w:sz w:val="17"/>
               </w:rPr>
-              <w:t>Credit Accrual &amp; Rollover</w:t>
+              <w:t>Accrual &amp; Rollover Engine</w:t>
             </w:r>
           </w:p>
         </w:tc>
@@ -1096,7 +1174,7 @@
               <w:left w:w="100" w:type="dxa"/>
               <w:right w:w="100" w:type="dxa"/>
             </w:tcMar>
-            <w:shd w:fill="F8FAFC"/>
+            <w:shd w:fill="FFFFFF"/>
           </w:tcPr>
           <w:p>
             <w:pPr>
@@ -1107,7 +1185,7 @@
                 <w:color w:val="1E293B"/>
                 <w:sz w:val="17"/>
               </w:rPr>
-              <w:t>Manual Periodic Adjustments</w:t>
+              <w:t>Manual Periodic Balance Adjustments</w:t>
             </w:r>
           </w:p>
         </w:tc>
@@ -1148,7 +1226,163 @@
               <w:left w:w="100" w:type="dxa"/>
               <w:right w:w="100" w:type="dxa"/>
             </w:tcMar>
+            <w:shd w:fill="F8FAFC"/>
+          </w:tcPr>
+          <w:p>
+            <w:pPr>
+              <w:spacing w:after="0"/>
+            </w:pPr>
+            <w:r>
+              <w:rPr>
+                <w:b/>
+                <w:color w:val="0F2744"/>
+                <w:sz w:val="17"/>
+              </w:rPr>
+              <w:t>User Access Control (RBAC)</w:t>
+            </w:r>
+          </w:p>
+        </w:tc>
+        <w:tc>
+          <w:tcPr>
+            <w:tcW w:type="dxa" w:w="3600"/>
+            <w:vAlign w:val="center"/>
+            <w:tcMar>
+              <w:top w:w="80" w:type="dxa"/>
+              <w:bottom w:w="80" w:type="dxa"/>
+              <w:left w:w="100" w:type="dxa"/>
+              <w:right w:w="100" w:type="dxa"/>
+            </w:tcMar>
+            <w:shd w:fill="F8FAFC"/>
+          </w:tcPr>
+          <w:p>
+            <w:pPr>
+              <w:spacing w:after="0"/>
+            </w:pPr>
+            <w:r>
+              <w:rPr>
+                <w:color w:val="1E293B"/>
+                <w:sz w:val="17"/>
+              </w:rPr>
+              <w:t>Role-Based Access (Staff, Senior, Partner/HR)</w:t>
+            </w:r>
+          </w:p>
+        </w:tc>
+        <w:tc>
+          <w:tcPr>
+            <w:tcW w:type="dxa" w:w="3888"/>
+            <w:vAlign w:val="center"/>
+            <w:tcMar>
+              <w:top w:w="80" w:type="dxa"/>
+              <w:bottom w:w="80" w:type="dxa"/>
+              <w:left w:w="100" w:type="dxa"/>
+              <w:right w:w="100" w:type="dxa"/>
+            </w:tcMar>
+            <w:shd w:fill="F0FDF4"/>
+          </w:tcPr>
+          <w:p>
+            <w:pPr>
+              <w:spacing w:after="0"/>
+            </w:pPr>
+            <w:r>
+              <w:rPr>
+                <w:color w:val="1E293B"/>
+                <w:sz w:val="17"/>
+              </w:rPr>
+              <w:t>Advanced Multi-Level Governance &amp; Delegated Approvals</w:t>
+            </w:r>
+          </w:p>
+        </w:tc>
+      </w:tr>
+      <w:tr>
+        <w:tc>
+          <w:tcPr>
+            <w:tcW w:type="dxa" w:w="2880"/>
+            <w:vAlign w:val="center"/>
+            <w:tcMar>
+              <w:top w:w="80" w:type="dxa"/>
+              <w:bottom w:w="80" w:type="dxa"/>
+              <w:left w:w="100" w:type="dxa"/>
+              <w:right w:w="100" w:type="dxa"/>
+            </w:tcMar>
             <w:shd w:fill="FFFFFF"/>
+          </w:tcPr>
+          <w:p>
+            <w:pPr>
+              <w:spacing w:after="0"/>
+            </w:pPr>
+            <w:r>
+              <w:rPr>
+                <w:b/>
+                <w:color w:val="0F2744"/>
+                <w:sz w:val="17"/>
+              </w:rPr>
+              <w:t>Production Deployment</w:t>
+            </w:r>
+          </w:p>
+        </w:tc>
+        <w:tc>
+          <w:tcPr>
+            <w:tcW w:type="dxa" w:w="3600"/>
+            <w:vAlign w:val="center"/>
+            <w:tcMar>
+              <w:top w:w="80" w:type="dxa"/>
+              <w:bottom w:w="80" w:type="dxa"/>
+              <w:left w:w="100" w:type="dxa"/>
+              <w:right w:w="100" w:type="dxa"/>
+            </w:tcMar>
+            <w:shd w:fill="FFFFFF"/>
+          </w:tcPr>
+          <w:p>
+            <w:pPr>
+              <w:spacing w:after="0"/>
+            </w:pPr>
+            <w:r>
+              <w:rPr>
+                <w:color w:val="1E293B"/>
+                <w:sz w:val="17"/>
+              </w:rPr>
+              <w:t>Full Server Setup, Database Config &amp; SSL</w:t>
+            </w:r>
+          </w:p>
+        </w:tc>
+        <w:tc>
+          <w:tcPr>
+            <w:tcW w:type="dxa" w:w="3888"/>
+            <w:vAlign w:val="center"/>
+            <w:tcMar>
+              <w:top w:w="80" w:type="dxa"/>
+              <w:bottom w:w="80" w:type="dxa"/>
+              <w:left w:w="100" w:type="dxa"/>
+              <w:right w:w="100" w:type="dxa"/>
+            </w:tcMar>
+            <w:shd w:fill="F0FDF4"/>
+          </w:tcPr>
+          <w:p>
+            <w:pPr>
+              <w:spacing w:after="0"/>
+            </w:pPr>
+            <w:r>
+              <w:rPr>
+                <w:color w:val="1E293B"/>
+                <w:sz w:val="17"/>
+              </w:rPr>
+              <w:t>Full Server Setup, Database Config, SSL &amp; Scheduled Auto-Backups</w:t>
+            </w:r>
+          </w:p>
+        </w:tc>
+      </w:tr>
+      <w:tr>
+        <w:tc>
+          <w:tcPr>
+            <w:tcW w:type="dxa" w:w="2880"/>
+            <w:vAlign w:val="center"/>
+            <w:tcMar>
+              <w:top w:w="80" w:type="dxa"/>
+              <w:bottom w:w="80" w:type="dxa"/>
+              <w:left w:w="100" w:type="dxa"/>
+              <w:right w:w="100" w:type="dxa"/>
+            </w:tcMar>
+            <w:shd w:fill="F8FAFC"/>
           </w:tcPr>
           <w:p>
             <w:pPr>
@@ -1174,7 +1408,7 @@
               <w:left w:w="100" w:type="dxa"/>
               <w:right w:w="100" w:type="dxa"/>
             </w:tcMar>
-            <w:shd w:fill="FFFFFF"/>
+            <w:shd w:fill="F8FAFC"/>
           </w:tcPr>
           <w:p>
             <w:pPr>
@@ -1238,7 +1472,7 @@
           <w:color w:val="0F2744"/>
           <w:sz w:val="23"/>
         </w:rPr>
-        <w:t>🥈 Tier 1: Professional Edition — ₱75,000</w:t>
+        <w:t>🥈 Tier 1: Core Practice Management Edition — ₱75,000</w:t>
       </w:r>
     </w:p>
     <w:p>
@@ -1252,14 +1486,77 @@
           <w:color w:val="1E293B"/>
           <w:sz w:val="19"/>
         </w:rPr>
-        <w:t xml:space="preserve">5 Core Essential Leave Categories: </w:t>
+        <w:t xml:space="preserve">Role-Based Access Control (RBAC): </w:t>
       </w:r>
       <w:r>
         <w:rPr>
           <w:color w:val="1E293B"/>
           <w:sz w:val="19"/>
         </w:rPr>
-        <w:t>Vacation Leave (VL), Sick Leave (SL), Emergency Leave, Bereavement Leave, and Leave Without Pay (LWOP).</w:t>
+        <w:t>Multi-role secure architecture with individual login credentials for Staff Associates, Senior Auditors, HR, and Managing Partners.</w:t>
+      </w:r>
+    </w:p>
+    <w:p>
+      <w:pPr>
+        <w:pStyle w:val="ListBullet"/>
+        <w:spacing w:after="60"/>
+      </w:pPr>
+      <w:r>
+        <w:rPr>
+          <w:b/>
+          <w:color w:val="1E293B"/>
+          <w:sz w:val="19"/>
+        </w:rPr>
+        <w:t xml:space="preserve">Real-Time Leave Balance Ledger: </w:t>
+      </w:r>
+      <w:r>
+        <w:rPr>
+          <w:color w:val="1E293B"/>
+          <w:sz w:val="19"/>
+        </w:rPr>
+        <w:t>Dynamic tracking of employee annual leave entitlements (Vacation Leave, Sick Leave, Emergency, Bereavement, LWOP) with instant deduction updates.</w:t>
+      </w:r>
+    </w:p>
+    <w:p>
+      <w:pPr>
+        <w:pStyle w:val="ListBullet"/>
+        <w:spacing w:after="60"/>
+      </w:pPr>
+      <w:r>
+        <w:rPr>
+          <w:b/>
+          <w:color w:val="1E293B"/>
+          <w:sz w:val="19"/>
+        </w:rPr>
+        <w:t xml:space="preserve">Structured Partner Approval Governance: </w:t>
+      </w:r>
+      <w:r>
+        <w:rPr>
+          <w:color w:val="1E293B"/>
+          <w:sz w:val="19"/>
+        </w:rPr>
+        <w:t>Executive portal allowing Managing Partners to review, approve, or reject requests with customized feedback notes.</w:t>
+      </w:r>
+    </w:p>
+    <w:p>
+      <w:pPr>
+        <w:pStyle w:val="ListBullet"/>
+        <w:spacing w:after="60"/>
+      </w:pPr>
+      <w:r>
+        <w:rPr>
+          <w:b/>
+          <w:color w:val="1E293B"/>
+          <w:sz w:val="19"/>
+        </w:rPr>
+        <w:t xml:space="preserve">Partner Proxy Leave Filing: </w:t>
+      </w:r>
+      <w:r>
+        <w:rPr>
+          <w:color w:val="1E293B"/>
+          <w:sz w:val="19"/>
+        </w:rPr>
+        <w:t>Capability for Managing Partners and HR to file and adjust leaves directly on behalf of any team member.</w:t>
       </w:r>
     </w:p>
     <w:p>
@@ -1280,7 +1577,7 @@
           <w:color w:val="1E293B"/>
           <w:sz w:val="19"/>
         </w:rPr>
-        <w:t>Real-time personal balance summary cards, leave filing form, and historical status ledger.</w:t>
+        <w:t>Dedicated dashboard for associates to check available leave balances, submit requests, and track approval status in real-time.</w:t>
       </w:r>
     </w:p>
     <w:p>
@@ -1294,14 +1591,14 @@
           <w:color w:val="1E293B"/>
           <w:sz w:val="19"/>
         </w:rPr>
-        <w:t xml:space="preserve">Managing Partner Governance: </w:t>
+        <w:t xml:space="preserve">Master Firm Leave Ledger: </w:t>
       </w:r>
       <w:r>
         <w:rPr>
           <w:color w:val="1E293B"/>
           <w:sz w:val="19"/>
         </w:rPr>
-        <w:t>Executive portal with live approval queue, engagement note documentation, and capability to file leaves on behalf of any associate.</w:t>
+        <w:t>Filterable firm-wide ledger with search capabilities and historical record tracking.</w:t>
       </w:r>
     </w:p>
     <w:p>
@@ -1315,14 +1612,14 @@
           <w:color w:val="1E293B"/>
           <w:sz w:val="19"/>
         </w:rPr>
-        <w:t xml:space="preserve">Clean Details Modal: </w:t>
+        <w:t xml:space="preserve">Production Server Deployment &amp; Setup: </w:t>
       </w:r>
       <w:r>
         <w:rPr>
           <w:color w:val="1E293B"/>
           <w:sz w:val="19"/>
         </w:rPr>
-        <w:t>Complete breakdown of employee, dates, duration, reason notes, and partner approval status.</w:t>
+        <w:t>Complete production deployment, database schema setup, and SSL security configuration on firm infrastructure.</w:t>
       </w:r>
     </w:p>
     <w:p>
@@ -1336,14 +1633,197 @@
           <w:color w:val="1E293B"/>
           <w:sz w:val="19"/>
         </w:rPr>
-        <w:t xml:space="preserve">Warranty: </w:t>
+        <w:t xml:space="preserve">Warranty &amp; Technical Support: </w:t>
       </w:r>
       <w:r>
         <w:rPr>
           <w:color w:val="1E293B"/>
           <w:sz w:val="19"/>
         </w:rPr>
-        <w:t>60 Days standard bug fix warranty and system maintenance.</w:t>
+        <w:t>60 Days standard bug-fix warranty and system maintenance.</w:t>
+      </w:r>
+    </w:p>
+    <w:p>
+      <w:pPr>
+        <w:spacing w:after="80"/>
+      </w:pPr>
+    </w:p>
+    <w:p>
+      <w:r>
+        <w:rPr>
+          <w:b/>
+          <w:color w:val="0284C7"/>
+          <w:sz w:val="23"/>
+        </w:rPr>
+        <w:t>🥇 Tier 2: Enterprise Practice Cloud Suite — ₱85,000 ⭐ (Recommended Flagship Package)</w:t>
+      </w:r>
+    </w:p>
+    <w:p>
+      <w:pPr>
+        <w:pStyle w:val="ListBullet"/>
+        <w:spacing w:after="60"/>
+      </w:pPr>
+      <w:r>
+        <w:rPr>
+          <w:b/>
+          <w:color w:val="1E293B"/>
+          <w:sz w:val="19"/>
+        </w:rPr>
+        <w:t xml:space="preserve">Role-Based Access Control (RBAC): </w:t>
+      </w:r>
+      <w:r>
+        <w:rPr>
+          <w:color w:val="1E293B"/>
+          <w:sz w:val="19"/>
+        </w:rPr>
+        <w:t>Multi-role secure architecture with individual login credentials for Staff Associates, Senior Auditors, HR, and Managing Partners.</w:t>
+      </w:r>
+    </w:p>
+    <w:p>
+      <w:pPr>
+        <w:pStyle w:val="ListBullet"/>
+        <w:spacing w:after="60"/>
+      </w:pPr>
+      <w:r>
+        <w:rPr>
+          <w:b/>
+          <w:color w:val="1E293B"/>
+          <w:sz w:val="19"/>
+        </w:rPr>
+        <w:t xml:space="preserve">Real-Time Leave Balance Ledger: </w:t>
+      </w:r>
+      <w:r>
+        <w:rPr>
+          <w:color w:val="1E293B"/>
+          <w:sz w:val="19"/>
+        </w:rPr>
+        <w:t>Dynamic tracking of employee annual leave entitlements (Vacation Leave, Sick Leave, Emergency, Bereavement, LWOP) with instant deduction updates.</w:t>
+      </w:r>
+    </w:p>
+    <w:p>
+      <w:pPr>
+        <w:pStyle w:val="ListBullet"/>
+        <w:spacing w:after="60"/>
+      </w:pPr>
+      <w:r>
+        <w:rPr>
+          <w:b/>
+          <w:color w:val="1E293B"/>
+          <w:sz w:val="19"/>
+        </w:rPr>
+        <w:t xml:space="preserve">Structured Partner Approval Governance: </w:t>
+      </w:r>
+      <w:r>
+        <w:rPr>
+          <w:color w:val="1E293B"/>
+          <w:sz w:val="19"/>
+        </w:rPr>
+        <w:t>Executive portal allowing Managing Partners to review, approve, or reject requests with customized feedback notes.</w:t>
+      </w:r>
+    </w:p>
+    <w:p>
+      <w:pPr>
+        <w:pStyle w:val="ListBullet"/>
+        <w:spacing w:after="60"/>
+      </w:pPr>
+      <w:r>
+        <w:rPr>
+          <w:b/>
+          <w:color w:val="1E293B"/>
+          <w:sz w:val="19"/>
+        </w:rPr>
+        <w:t xml:space="preserve">Partner Proxy Leave Filing: </w:t>
+      </w:r>
+      <w:r>
+        <w:rPr>
+          <w:color w:val="1E293B"/>
+          <w:sz w:val="19"/>
+        </w:rPr>
+        <w:t>Capability for Managing Partners and HR to file and adjust leaves directly on behalf of any team member.</w:t>
+      </w:r>
+    </w:p>
+    <w:p>
+      <w:pPr>
+        <w:pStyle w:val="ListBullet"/>
+        <w:spacing w:after="60"/>
+      </w:pPr>
+      <w:r>
+        <w:rPr>
+          <w:b/>
+          <w:color w:val="1E293B"/>
+          <w:sz w:val="19"/>
+        </w:rPr>
+        <w:t xml:space="preserve">Employee Self-Service Portal: </w:t>
+      </w:r>
+      <w:r>
+        <w:rPr>
+          <w:color w:val="1E293B"/>
+          <w:sz w:val="19"/>
+        </w:rPr>
+        <w:t>Dedicated dashboard for associates to check available leave balances, submit requests, and track approval status in real-time.</w:t>
+      </w:r>
+    </w:p>
+    <w:p>
+      <w:pPr>
+        <w:pStyle w:val="ListBullet"/>
+        <w:spacing w:after="60"/>
+      </w:pPr>
+      <w:r>
+        <w:rPr>
+          <w:b/>
+          <w:color w:val="1E293B"/>
+          <w:sz w:val="19"/>
+        </w:rPr>
+        <w:t xml:space="preserve">Master Firm Leave Ledger: </w:t>
+      </w:r>
+      <w:r>
+        <w:rPr>
+          <w:color w:val="1E293B"/>
+          <w:sz w:val="19"/>
+        </w:rPr>
+        <w:t>Filterable firm-wide ledger with search capabilities and historical record tracking.</w:t>
+      </w:r>
+    </w:p>
+    <w:p>
+      <w:pPr>
+        <w:pStyle w:val="ListBullet"/>
+        <w:spacing w:after="60"/>
+      </w:pPr>
+      <w:r>
+        <w:rPr>
+          <w:b/>
+          <w:color w:val="1E293B"/>
+          <w:sz w:val="19"/>
+        </w:rPr>
+        <w:t xml:space="preserve">Production Server Deployment &amp; Setup: </w:t>
+      </w:r>
+      <w:r>
+        <w:rPr>
+          <w:color w:val="1E293B"/>
+          <w:sz w:val="19"/>
+        </w:rPr>
+        <w:t>Complete production deployment, database schema setup, and SSL security configuration on firm infrastructure.</w:t>
+      </w:r>
+    </w:p>
+    <w:p>
+      <w:pPr>
+        <w:pStyle w:val="ListBullet"/>
+        <w:spacing w:after="60"/>
+      </w:pPr>
+      <w:r>
+        <w:rPr>
+          <w:b/>
+          <w:color w:val="1E293B"/>
+          <w:sz w:val="19"/>
+        </w:rPr>
+        <w:t xml:space="preserve">Warranty &amp; Technical Support: </w:t>
+      </w:r>
+      <w:r>
+        <w:rPr>
+          <w:color w:val="1E293B"/>
+          <w:sz w:val="19"/>
+        </w:rPr>
+        <w:t>60 Days standard bug-fix warranty and system maintenance.</w:t>
       </w:r>
     </w:p>
     <w:p>

</xml_diff>